<commit_message>
v1.1.0 Ignition - infrastructure setup
- Added flutter_riverpod, go_router, drift, sqlite3_flutter_libs, path_provider
- Riverpod ProviderScope wrapping entire app
- go_router with ShellRoute and 5 named module routes
- Drift database with Customers and Vehicles tables
- Fixed macOS dock name to AutoShopPro via CFBundleDisplayName
- Updated docs: README, module_plan, build log

Co-Authored-By: Claude Sonnet 4.6 <noreply@anthropic.com>
</commit_message>
<xml_diff>
--- a/docs/AutoShopPro_Build_Log.docx
+++ b/docs/AutoShopPro_Build_Log.docx
@@ -1727,6 +1727,316 @@
         </w:rPr>
         <w:t xml:space="preserve">Most recent session at the top. Add new entries here as you build.</w:t>
       </w:r>
+    </w:p>
+    <w:p>
+      <w:pPr>
+        <w:pStyle w:val="Heading2"/>
+      </w:pPr>
+      <w:r>
+        <w:t xml:space="preserve">Session 2 — v1.1.0 Ignition</w:t>
+      </w:r>
+    </w:p>
+    <w:tbl>
+      <w:tblPr>
+        <w:tblW w:type="dxa" w:w="9360"/>
+        <w:tblBorders>
+          <w:top w:val="single" w:color="auto" w:sz="4"/>
+          <w:left w:val="single" w:color="auto" w:sz="4"/>
+          <w:bottom w:val="single" w:color="auto" w:sz="4"/>
+          <w:right w:val="single" w:color="auto" w:sz="4"/>
+          <w:insideH w:val="single" w:color="auto" w:sz="4"/>
+          <w:insideV w:val="single" w:color="auto" w:sz="4"/>
+        </w:tblBorders>
+      </w:tblPr>
+      <w:tblGrid>
+        <w:gridCol w:w="2000"/>
+        <w:gridCol w:w="7360"/>
+      </w:tblGrid>
+      <w:tr>
+        <w:tc>
+          <w:tcPr>
+            <w:tcW w:type="dxa" w:w="2000"/>
+            <w:tcBorders>
+              <w:top w:val="single" w:color="E0E0E0" w:sz="1"/>
+              <w:left w:val="single" w:color="E0E0E0" w:sz="1"/>
+              <w:bottom w:val="single" w:color="E0E0E0" w:sz="1"/>
+              <w:right w:val="single" w:color="E0E0E0" w:sz="1"/>
+            </w:tcBorders>
+            <w:tcMar>
+              <w:top w:type="dxa" w:w="80"/>
+              <w:left w:type="dxa" w:w="120"/>
+              <w:bottom w:type="dxa" w:w="80"/>
+              <w:right w:type="dxa" w:w="120"/>
+            </w:tcMar>
+          </w:tcPr>
+          <w:p>
+            <w:r>
+              <w:rPr>
+                <w:rFonts w:ascii="Arial" w:cs="Arial" w:eastAsia="Arial" w:hAnsi="Arial"/>
+                <w:sz w:val="20"/>
+                <w:szCs w:val="20"/>
+              </w:rPr>
+              <w:t xml:space="preserve">Date</w:t>
+            </w:r>
+          </w:p>
+        </w:tc>
+        <w:tc>
+          <w:tcPr>
+            <w:tcW w:type="dxa" w:w="7360"/>
+            <w:tcBorders>
+              <w:top w:val="single" w:color="E0E0E0" w:sz="1"/>
+              <w:left w:val="single" w:color="E0E0E0" w:sz="1"/>
+              <w:bottom w:val="single" w:color="E0E0E0" w:sz="1"/>
+              <w:right w:val="single" w:color="E0E0E0" w:sz="1"/>
+            </w:tcBorders>
+            <w:tcMar>
+              <w:top w:type="dxa" w:w="80"/>
+              <w:left w:type="dxa" w:w="120"/>
+              <w:bottom w:type="dxa" w:w="80"/>
+              <w:right w:type="dxa" w:w="120"/>
+            </w:tcMar>
+          </w:tcPr>
+          <w:p>
+            <w:r>
+              <w:rPr>
+                <w:rFonts w:ascii="Arial" w:cs="Arial" w:eastAsia="Arial" w:hAnsi="Arial"/>
+                <w:sz w:val="20"/>
+                <w:szCs w:val="20"/>
+              </w:rPr>
+              <w:t xml:space="preserve">March 21, 2026</w:t>
+            </w:r>
+          </w:p>
+        </w:tc>
+      </w:tr>
+      <w:tr>
+        <w:tc>
+          <w:tcPr>
+            <w:tcW w:type="dxa" w:w="2000"/>
+            <w:tcBorders>
+              <w:top w:val="single" w:color="E0E0E0" w:sz="1"/>
+              <w:left w:val="single" w:color="E0E0E0" w:sz="1"/>
+              <w:bottom w:val="single" w:color="E0E0E0" w:sz="1"/>
+              <w:right w:val="single" w:color="E0E0E0" w:sz="1"/>
+            </w:tcBorders>
+            <w:tcMar>
+              <w:top w:type="dxa" w:w="80"/>
+              <w:left w:type="dxa" w:w="120"/>
+              <w:bottom w:type="dxa" w:w="80"/>
+              <w:right w:type="dxa" w:w="120"/>
+            </w:tcMar>
+          </w:tcPr>
+          <w:p>
+            <w:r>
+              <w:rPr>
+                <w:rFonts w:ascii="Arial" w:cs="Arial" w:eastAsia="Arial" w:hAnsi="Arial"/>
+                <w:sz w:val="20"/>
+                <w:szCs w:val="20"/>
+              </w:rPr>
+              <w:t xml:space="preserve">Goal</w:t>
+            </w:r>
+          </w:p>
+        </w:tc>
+        <w:tc>
+          <w:tcPr>
+            <w:tcW w:type="dxa" w:w="7360"/>
+            <w:tcBorders>
+              <w:top w:val="single" w:color="E0E0E0" w:sz="1"/>
+              <w:left w:val="single" w:color="E0E0E0" w:sz="1"/>
+              <w:bottom w:val="single" w:color="E0E0E0" w:sz="1"/>
+              <w:right w:val="single" w:color="E0E0E0" w:sz="1"/>
+            </w:tcBorders>
+            <w:tcMar>
+              <w:top w:type="dxa" w:w="80"/>
+              <w:left w:type="dxa" w:w="120"/>
+              <w:bottom w:type="dxa" w:w="80"/>
+              <w:right w:type="dxa" w:w="120"/>
+            </w:tcMar>
+          </w:tcPr>
+          <w:p>
+            <w:r>
+              <w:rPr>
+                <w:rFonts w:ascii="Arial" w:cs="Arial" w:eastAsia="Arial" w:hAnsi="Arial"/>
+                <w:sz w:val="20"/>
+                <w:szCs w:val="20"/>
+              </w:rPr>
+              <w:t xml:space="preserve">Wire up infrastructure: Riverpod state management, go_router navigation, and Drift local database</w:t>
+            </w:r>
+          </w:p>
+        </w:tc>
+      </w:tr>
+      <w:tr>
+        <w:tc>
+          <w:tcPr>
+            <w:tcW w:type="dxa" w:w="2000"/>
+            <w:tcBorders>
+              <w:top w:val="single" w:color="E0E0E0" w:sz="1"/>
+              <w:left w:val="single" w:color="E0E0E0" w:sz="1"/>
+              <w:bottom w:val="single" w:color="E0E0E0" w:sz="1"/>
+              <w:right w:val="single" w:color="E0E0E0" w:sz="1"/>
+            </w:tcBorders>
+            <w:tcMar>
+              <w:top w:type="dxa" w:w="80"/>
+              <w:left w:type="dxa" w:w="120"/>
+              <w:bottom w:type="dxa" w:w="80"/>
+              <w:right w:type="dxa" w:w="120"/>
+            </w:tcMar>
+          </w:tcPr>
+          <w:p>
+            <w:r>
+              <w:rPr>
+                <w:rFonts w:ascii="Arial" w:cs="Arial" w:eastAsia="Arial" w:hAnsi="Arial"/>
+                <w:sz w:val="20"/>
+                <w:szCs w:val="20"/>
+              </w:rPr>
+              <w:t xml:space="preserve">Built</w:t>
+            </w:r>
+          </w:p>
+        </w:tc>
+        <w:tc>
+          <w:tcPr>
+            <w:tcW w:type="dxa" w:w="7360"/>
+            <w:tcBorders>
+              <w:top w:val="single" w:color="E0E0E0" w:sz="1"/>
+              <w:left w:val="single" w:color="E0E0E0" w:sz="1"/>
+              <w:bottom w:val="single" w:color="E0E0E0" w:sz="1"/>
+              <w:right w:val="single" w:color="E0E0E0" w:sz="1"/>
+            </w:tcBorders>
+            <w:tcMar>
+              <w:top w:type="dxa" w:w="80"/>
+              <w:left w:type="dxa" w:w="120"/>
+              <w:bottom w:type="dxa" w:w="80"/>
+              <w:right w:type="dxa" w:w="120"/>
+            </w:tcMar>
+          </w:tcPr>
+          <w:p>
+            <w:r>
+              <w:rPr>
+                <w:rFonts w:ascii="Arial" w:cs="Arial" w:eastAsia="Arial" w:hAnsi="Arial"/>
+                <w:sz w:val="20"/>
+                <w:szCs w:val="20"/>
+              </w:rPr>
+              <w:t xml:space="preserve">Added packages: flutter_riverpod, go_router, drift, sqlite3_flutter_libs, path_provider. Wrapped app in ProviderScope (Riverpod). Created lib/router.dart with ShellRoute and 5 named routes. Created lib/database/database.dart with Customers and Vehicles tables. Ran Drift code generator (database.g.dart). Fixed macOS dock name to AutoShopPro via CFBundleDisplayName in Info.plist. Resolved Swift Package Manager dependency (CSQLite) for macOS build.</w:t>
+            </w:r>
+          </w:p>
+        </w:tc>
+      </w:tr>
+      <w:tr>
+        <w:tc>
+          <w:tcPr>
+            <w:tcW w:type="dxa" w:w="2000"/>
+            <w:tcBorders>
+              <w:top w:val="single" w:color="E0E0E0" w:sz="1"/>
+              <w:left w:val="single" w:color="E0E0E0" w:sz="1"/>
+              <w:bottom w:val="single" w:color="E0E0E0" w:sz="1"/>
+              <w:right w:val="single" w:color="E0E0E0" w:sz="1"/>
+            </w:tcBorders>
+            <w:tcMar>
+              <w:top w:type="dxa" w:w="80"/>
+              <w:left w:type="dxa" w:w="120"/>
+              <w:bottom w:type="dxa" w:w="80"/>
+              <w:right w:type="dxa" w:w="120"/>
+            </w:tcMar>
+          </w:tcPr>
+          <w:p>
+            <w:r>
+              <w:rPr>
+                <w:rFonts w:ascii="Arial" w:cs="Arial" w:eastAsia="Arial" w:hAnsi="Arial"/>
+                <w:sz w:val="20"/>
+                <w:szCs w:val="20"/>
+              </w:rPr>
+              <w:t xml:space="preserve">Files changed</w:t>
+            </w:r>
+          </w:p>
+        </w:tc>
+        <w:tc>
+          <w:tcPr>
+            <w:tcW w:type="dxa" w:w="7360"/>
+            <w:tcBorders>
+              <w:top w:val="single" w:color="E0E0E0" w:sz="1"/>
+              <w:left w:val="single" w:color="E0E0E0" w:sz="1"/>
+              <w:bottom w:val="single" w:color="E0E0E0" w:sz="1"/>
+              <w:right w:val="single" w:color="E0E0E0" w:sz="1"/>
+            </w:tcBorders>
+            <w:tcMar>
+              <w:top w:type="dxa" w:w="80"/>
+              <w:left w:type="dxa" w:w="120"/>
+              <w:bottom w:type="dxa" w:w="80"/>
+              <w:right w:type="dxa" w:w="120"/>
+            </w:tcMar>
+          </w:tcPr>
+          <w:p>
+            <w:r>
+              <w:rPr>
+                <w:rFonts w:ascii="Arial" w:cs="Arial" w:eastAsia="Arial" w:hAnsi="Arial"/>
+                <w:sz w:val="20"/>
+                <w:szCs w:val="20"/>
+              </w:rPr>
+              <w:t xml:space="preserve">pubspec.yaml, lib/main.dart, lib/router.dart (new), lib/database/database.dart (new), lib/database/database.g.dart (generated), macos/Runner/Info.plist, docs/README.md, docs/module_plan.md, CLAUDE.md</w:t>
+            </w:r>
+          </w:p>
+        </w:tc>
+      </w:tr>
+      <w:tr>
+        <w:tc>
+          <w:tcPr>
+            <w:tcW w:type="dxa" w:w="2000"/>
+            <w:tcBorders>
+              <w:top w:val="single" w:color="E0E0E0" w:sz="1"/>
+              <w:left w:val="single" w:color="E0E0E0" w:sz="1"/>
+              <w:bottom w:val="single" w:color="E0E0E0" w:sz="1"/>
+              <w:right w:val="single" w:color="E0E0E0" w:sz="1"/>
+            </w:tcBorders>
+            <w:tcMar>
+              <w:top w:type="dxa" w:w="80"/>
+              <w:left w:type="dxa" w:w="120"/>
+              <w:bottom w:type="dxa" w:w="80"/>
+              <w:right w:type="dxa" w:w="120"/>
+            </w:tcMar>
+          </w:tcPr>
+          <w:p>
+            <w:r>
+              <w:rPr>
+                <w:rFonts w:ascii="Arial" w:cs="Arial" w:eastAsia="Arial" w:hAnsi="Arial"/>
+                <w:sz w:val="20"/>
+                <w:szCs w:val="20"/>
+              </w:rPr>
+              <w:t xml:space="preserve">Version</w:t>
+            </w:r>
+          </w:p>
+        </w:tc>
+        <w:tc>
+          <w:tcPr>
+            <w:tcW w:type="dxa" w:w="7360"/>
+            <w:tcBorders>
+              <w:top w:val="single" w:color="E0E0E0" w:sz="1"/>
+              <w:left w:val="single" w:color="E0E0E0" w:sz="1"/>
+              <w:bottom w:val="single" w:color="E0E0E0" w:sz="1"/>
+              <w:right w:val="single" w:color="E0E0E0" w:sz="1"/>
+            </w:tcBorders>
+            <w:tcMar>
+              <w:top w:type="dxa" w:w="80"/>
+              <w:left w:type="dxa" w:w="120"/>
+              <w:bottom w:type="dxa" w:w="80"/>
+              <w:right w:type="dxa" w:w="120"/>
+            </w:tcMar>
+          </w:tcPr>
+          <w:p>
+            <w:r>
+              <w:rPr>
+                <w:rFonts w:ascii="Arial" w:cs="Arial" w:eastAsia="Arial" w:hAnsi="Arial"/>
+                <w:sz w:val="20"/>
+                <w:szCs w:val="20"/>
+              </w:rPr>
+              <w:t xml:space="preserve">v1.1.0 Ignition</w:t>
+            </w:r>
+          </w:p>
+        </w:tc>
+      </w:tr>
+    </w:tbl>
+    <w:p>
+      <w:pPr>
+        <w:spacing w:after="200"/>
+      </w:pPr>
     </w:p>
     <w:p>
       <w:pPr>

</xml_diff>

<commit_message>
Correct version to v1.0.1 Ignition (was v1.1.0)
Infrastructure changes are a patch, not a minor release.

Co-Authored-By: Claude Sonnet 4.6 <noreply@anthropic.com>
</commit_message>
<xml_diff>
--- a/docs/AutoShopPro_Build_Log.docx
+++ b/docs/AutoShopPro_Build_Log.docx
@@ -1733,7 +1733,7 @@
         <w:pStyle w:val="Heading2"/>
       </w:pPr>
       <w:r>
-        <w:t xml:space="preserve">Session 2 — v1.1.0 Ignition</w:t>
+        <w:t xml:space="preserve">Session 2 — v1.0.1 Ignition</w:t>
       </w:r>
     </w:p>
     <w:tbl>
@@ -2027,7 +2027,7 @@
                 <w:sz w:val="20"/>
                 <w:szCs w:val="20"/>
               </w:rPr>
-              <w:t xml:space="preserve">v1.1.0 Ignition</w:t>
+              <w:t xml:space="preserve">v1.0.1 Ignition</w:t>
             </w:r>
           </w:p>
         </w:tc>

</xml_diff>

<commit_message>
Fix remaining v1.1.0 references in build log
Co-Authored-By: Claude Sonnet 4.6 <noreply@anthropic.com>
</commit_message>
<xml_diff>
--- a/docs/AutoShopPro_Build_Log.docx
+++ b/docs/AutoShopPro_Build_Log.docx
@@ -516,7 +516,7 @@
                 <w:sz w:val="20"/>
                 <w:szCs w:val="20"/>
               </w:rPr>
-              <w:t xml:space="preserve">v1.1.0</w:t>
+              <w:t xml:space="preserve">v1.0.1</w:t>
             </w:r>
           </w:p>
         </w:tc>
@@ -2509,7 +2509,7 @@
         <w:spacing w:before="200"/>
       </w:pPr>
       <w:r>
-        <w:t xml:space="preserve">Next session — v1.1.0</w:t>
+        <w:t xml:space="preserve">Next session — v1.0.1</w:t>
       </w:r>
     </w:p>
     <w:p>

</xml_diff>

<commit_message>
Fix build log: mark v1.0.1 complete, fix version roadmap numbers
Co-Authored-By: Claude Sonnet 4.6 <noreply@anthropic.com>
</commit_message>
<xml_diff>
--- a/docs/AutoShopPro_Build_Log.docx
+++ b/docs/AutoShopPro_Build_Log.docx
@@ -597,7 +597,7 @@
                 <w:sz w:val="20"/>
                 <w:szCs w:val="20"/>
               </w:rPr>
-              <w:t xml:space="preserve">⬜ Next</w:t>
+              <w:t xml:space="preserve">✅ Complete</w:t>
             </w:r>
           </w:p>
         </w:tc>
@@ -626,7 +626,7 @@
                 <w:sz w:val="20"/>
                 <w:szCs w:val="20"/>
               </w:rPr>
-              <w:t xml:space="preserve">v2.0.0</w:t>
+              <w:t xml:space="preserve">v1.1.0</w:t>
             </w:r>
           </w:p>
         </w:tc>
@@ -736,7 +736,7 @@
                 <w:sz w:val="20"/>
                 <w:szCs w:val="20"/>
               </w:rPr>
-              <w:t xml:space="preserve">v3.0.0</w:t>
+              <w:t xml:space="preserve">v1.2.0</w:t>
             </w:r>
           </w:p>
         </w:tc>
@@ -846,7 +846,7 @@
                 <w:sz w:val="20"/>
                 <w:szCs w:val="20"/>
               </w:rPr>
-              <w:t xml:space="preserve">v4.0.0</w:t>
+              <w:t xml:space="preserve">v1.3.0</w:t>
             </w:r>
           </w:p>
         </w:tc>
@@ -956,7 +956,7 @@
                 <w:sz w:val="20"/>
                 <w:szCs w:val="20"/>
               </w:rPr>
-              <w:t xml:space="preserve">v5.0.0</w:t>
+              <w:t xml:space="preserve">v2.0.0</w:t>
             </w:r>
           </w:p>
         </w:tc>
@@ -1066,7 +1066,7 @@
                 <w:sz w:val="20"/>
                 <w:szCs w:val="20"/>
               </w:rPr>
-              <w:t xml:space="preserve">v6.0.0</w:t>
+              <w:t xml:space="preserve">v2.1.0</w:t>
             </w:r>
           </w:p>
         </w:tc>

</xml_diff>

<commit_message>
Adopt standard versioning — start at 0.1.0, ship at 1.0.0
v1.0.0 Bones → v0.1.0 Bones
v1.0.1 Ignition → v0.1.1 Ignition
Future modules: v0.2.0 through v0.6.0
First real release: v1.0.0

Co-Authored-By: Claude Sonnet 4.6 <noreply@anthropic.com>
</commit_message>
<xml_diff>
--- a/docs/AutoShopPro_Build_Log.docx
+++ b/docs/AutoShopPro_Build_Log.docx
@@ -406,7 +406,7 @@
                 <w:sz w:val="20"/>
                 <w:szCs w:val="20"/>
               </w:rPr>
-              <w:t xml:space="preserve">v1.0.0</w:t>
+              <w:t xml:space="preserve">v0.1.0</w:t>
             </w:r>
           </w:p>
         </w:tc>
@@ -516,7 +516,7 @@
                 <w:sz w:val="20"/>
                 <w:szCs w:val="20"/>
               </w:rPr>
-              <w:t xml:space="preserve">v1.0.1</w:t>
+              <w:t xml:space="preserve">v0.1.1</w:t>
             </w:r>
           </w:p>
         </w:tc>
@@ -626,7 +626,7 @@
                 <w:sz w:val="20"/>
                 <w:szCs w:val="20"/>
               </w:rPr>
-              <w:t xml:space="preserve">v1.1.0</w:t>
+              <w:t xml:space="preserve">v0.2.0</w:t>
             </w:r>
           </w:p>
         </w:tc>
@@ -736,7 +736,7 @@
                 <w:sz w:val="20"/>
                 <w:szCs w:val="20"/>
               </w:rPr>
-              <w:t xml:space="preserve">v1.2.0</w:t>
+              <w:t xml:space="preserve">v0.3.0</w:t>
             </w:r>
           </w:p>
         </w:tc>
@@ -846,7 +846,7 @@
                 <w:sz w:val="20"/>
                 <w:szCs w:val="20"/>
               </w:rPr>
-              <w:t xml:space="preserve">v1.3.0</w:t>
+              <w:t xml:space="preserve">v0.4.0</w:t>
             </w:r>
           </w:p>
         </w:tc>
@@ -956,7 +956,7 @@
                 <w:sz w:val="20"/>
                 <w:szCs w:val="20"/>
               </w:rPr>
-              <w:t xml:space="preserve">v2.0.0</w:t>
+              <w:t xml:space="preserve">v0.5.0</w:t>
             </w:r>
           </w:p>
         </w:tc>
@@ -1066,7 +1066,7 @@
                 <w:sz w:val="20"/>
                 <w:szCs w:val="20"/>
               </w:rPr>
-              <w:t xml:space="preserve">v2.1.0</w:t>
+              <w:t xml:space="preserve">v0.6.0</w:t>
             </w:r>
           </w:p>
         </w:tc>
@@ -1733,7 +1733,7 @@
         <w:pStyle w:val="Heading2"/>
       </w:pPr>
       <w:r>
-        <w:t xml:space="preserve">Session 2 — v1.0.1 Ignition</w:t>
+        <w:t xml:space="preserve">Session 2 — v0.1.1 Ignition</w:t>
       </w:r>
     </w:p>
     <w:tbl>
@@ -2027,7 +2027,7 @@
                 <w:sz w:val="20"/>
                 <w:szCs w:val="20"/>
               </w:rPr>
-              <w:t xml:space="preserve">v1.0.1 Ignition</w:t>
+              <w:t xml:space="preserve">v0.1.1 Ignition</w:t>
             </w:r>
           </w:p>
         </w:tc>
@@ -2043,7 +2043,7 @@
         <w:pStyle w:val="Heading2"/>
       </w:pPr>
       <w:r>
-        <w:t xml:space="preserve">Session 1 — v1.0.0 Bones</w:t>
+        <w:t xml:space="preserve">Session 1 — v0.1.0 Bones</w:t>
       </w:r>
     </w:p>
     <w:tbl>
@@ -2281,7 +2281,7 @@
                 <w:sz w:val="20"/>
                 <w:szCs w:val="20"/>
               </w:rPr>
-              <w:t xml:space="preserve">git commit -m "v1.0.0 Bones - initial project scaffold"</w:t>
+              <w:t xml:space="preserve">git commit -m "v0.1.0 Bones - initial project scaffold"</w:t>
             </w:r>
           </w:p>
         </w:tc>
@@ -2509,7 +2509,7 @@
         <w:spacing w:before="200"/>
       </w:pPr>
       <w:r>
-        <w:t xml:space="preserve">Next session — v1.0.1</w:t>
+        <w:t xml:space="preserve">Next session — v0.1.1</w:t>
       </w:r>
     </w:p>
     <w:p>

</xml_diff>

<commit_message>
Add Session 3 entry to build log (v0.2.0 Intake)
Co-Authored-By: Claude Sonnet 4.6 <noreply@anthropic.com>
</commit_message>
<xml_diff>
--- a/docs/AutoShopPro_Build_Log.docx
+++ b/docs/AutoShopPro_Build_Log.docx
@@ -1726,6 +1726,792 @@
           <w:szCs w:val="20"/>
         </w:rPr>
         <w:t xml:space="preserve">Most recent session at the top. Add new entries here as you build.</w:t>
+      </w:r>
+    </w:p>
+    <w:p>
+      <w:pPr>
+        <w:pStyle w:val="Heading2"/>
+      </w:pPr>
+      <w:r>
+        <w:t xml:space="preserve">Session 3 — v0.2.0 Intake</w:t>
+      </w:r>
+    </w:p>
+    <w:tbl>
+      <w:tblPr>
+        <w:tblW w:type="dxa" w:w="9360"/>
+        <w:tblBorders>
+          <w:top w:val="single" w:color="auto" w:sz="4"/>
+          <w:left w:val="single" w:color="auto" w:sz="4"/>
+          <w:bottom w:val="single" w:color="auto" w:sz="4"/>
+          <w:right w:val="single" w:color="auto" w:sz="4"/>
+          <w:insideH w:val="single" w:color="auto" w:sz="4"/>
+          <w:insideV w:val="single" w:color="auto" w:sz="4"/>
+        </w:tblBorders>
+      </w:tblPr>
+      <w:tblGrid>
+        <w:gridCol w:w="2000"/>
+        <w:gridCol w:w="7360"/>
+      </w:tblGrid>
+      <w:tr>
+        <w:tc>
+          <w:tcPr>
+            <w:tcW w:type="dxa" w:w="2000"/>
+            <w:tcBorders>
+              <w:top w:val="single" w:color="E0E0E0" w:sz="1"/>
+              <w:left w:val="single" w:color="E0E0E0" w:sz="1"/>
+              <w:bottom w:val="single" w:color="E0E0E0" w:sz="1"/>
+              <w:right w:val="single" w:color="E0E0E0" w:sz="1"/>
+            </w:tcBorders>
+            <w:tcMar>
+              <w:top w:type="dxa" w:w="80"/>
+              <w:left w:type="dxa" w:w="120"/>
+              <w:bottom w:type="dxa" w:w="80"/>
+              <w:right w:type="dxa" w:w="120"/>
+            </w:tcMar>
+          </w:tcPr>
+          <w:p>
+            <w:r>
+              <w:rPr>
+                <w:rFonts w:ascii="Arial" w:cs="Arial" w:eastAsia="Arial" w:hAnsi="Arial"/>
+                <w:sz w:val="20"/>
+                <w:szCs w:val="20"/>
+              </w:rPr>
+              <w:t xml:space="preserve">Date</w:t>
+            </w:r>
+          </w:p>
+        </w:tc>
+        <w:tc>
+          <w:tcPr>
+            <w:tcW w:type="dxa" w:w="7360"/>
+            <w:tcBorders>
+              <w:top w:val="single" w:color="E0E0E0" w:sz="1"/>
+              <w:left w:val="single" w:color="E0E0E0" w:sz="1"/>
+              <w:bottom w:val="single" w:color="E0E0E0" w:sz="1"/>
+              <w:right w:val="single" w:color="E0E0E0" w:sz="1"/>
+            </w:tcBorders>
+            <w:tcMar>
+              <w:top w:type="dxa" w:w="80"/>
+              <w:left w:type="dxa" w:w="120"/>
+              <w:bottom w:type="dxa" w:w="80"/>
+              <w:right w:type="dxa" w:w="120"/>
+            </w:tcMar>
+          </w:tcPr>
+          <w:p>
+            <w:r>
+              <w:rPr>
+                <w:rFonts w:ascii="Arial" w:cs="Arial" w:eastAsia="Arial" w:hAnsi="Arial"/>
+                <w:sz w:val="20"/>
+                <w:szCs w:val="20"/>
+              </w:rPr>
+              <w:t xml:space="preserve">March 21, 2026</w:t>
+            </w:r>
+          </w:p>
+        </w:tc>
+      </w:tr>
+      <w:tr>
+        <w:tc>
+          <w:tcPr>
+            <w:tcW w:type="dxa" w:w="2000"/>
+            <w:tcBorders>
+              <w:top w:val="single" w:color="E0E0E0" w:sz="1"/>
+              <w:left w:val="single" w:color="E0E0E0" w:sz="1"/>
+              <w:bottom w:val="single" w:color="E0E0E0" w:sz="1"/>
+              <w:right w:val="single" w:color="E0E0E0" w:sz="1"/>
+            </w:tcBorders>
+            <w:tcMar>
+              <w:top w:type="dxa" w:w="80"/>
+              <w:left w:type="dxa" w:w="120"/>
+              <w:bottom w:type="dxa" w:w="80"/>
+              <w:right w:type="dxa" w:w="120"/>
+            </w:tcMar>
+          </w:tcPr>
+          <w:p>
+            <w:r>
+              <w:rPr>
+                <w:rFonts w:ascii="Arial" w:cs="Arial" w:eastAsia="Arial" w:hAnsi="Arial"/>
+                <w:sz w:val="20"/>
+                <w:szCs w:val="20"/>
+              </w:rPr>
+              <w:t xml:space="preserve">Version</w:t>
+            </w:r>
+          </w:p>
+        </w:tc>
+        <w:tc>
+          <w:tcPr>
+            <w:tcW w:type="dxa" w:w="7360"/>
+            <w:tcBorders>
+              <w:top w:val="single" w:color="E0E0E0" w:sz="1"/>
+              <w:left w:val="single" w:color="E0E0E0" w:sz="1"/>
+              <w:bottom w:val="single" w:color="E0E0E0" w:sz="1"/>
+              <w:right w:val="single" w:color="E0E0E0" w:sz="1"/>
+            </w:tcBorders>
+            <w:tcMar>
+              <w:top w:type="dxa" w:w="80"/>
+              <w:left w:type="dxa" w:w="120"/>
+              <w:bottom w:type="dxa" w:w="80"/>
+              <w:right w:type="dxa" w:w="120"/>
+            </w:tcMar>
+          </w:tcPr>
+          <w:p>
+            <w:r>
+              <w:rPr>
+                <w:rFonts w:ascii="Arial" w:cs="Arial" w:eastAsia="Arial" w:hAnsi="Arial"/>
+                <w:sz w:val="20"/>
+                <w:szCs w:val="20"/>
+              </w:rPr>
+              <w:t xml:space="preserve">v0.2.0 Intake</w:t>
+            </w:r>
+          </w:p>
+        </w:tc>
+      </w:tr>
+      <w:tr>
+        <w:tc>
+          <w:tcPr>
+            <w:tcW w:type="dxa" w:w="2000"/>
+            <w:tcBorders>
+              <w:top w:val="single" w:color="E0E0E0" w:sz="1"/>
+              <w:left w:val="single" w:color="E0E0E0" w:sz="1"/>
+              <w:bottom w:val="single" w:color="E0E0E0" w:sz="1"/>
+              <w:right w:val="single" w:color="E0E0E0" w:sz="1"/>
+            </w:tcBorders>
+            <w:tcMar>
+              <w:top w:type="dxa" w:w="80"/>
+              <w:left w:type="dxa" w:w="120"/>
+              <w:bottom w:type="dxa" w:w="80"/>
+              <w:right w:type="dxa" w:w="120"/>
+            </w:tcMar>
+          </w:tcPr>
+          <w:p>
+            <w:r>
+              <w:rPr>
+                <w:rFonts w:ascii="Arial" w:cs="Arial" w:eastAsia="Arial" w:hAnsi="Arial"/>
+                <w:sz w:val="20"/>
+                <w:szCs w:val="20"/>
+              </w:rPr>
+              <w:t xml:space="preserve">Session</w:t>
+            </w:r>
+          </w:p>
+        </w:tc>
+        <w:tc>
+          <w:tcPr>
+            <w:tcW w:type="dxa" w:w="7360"/>
+            <w:tcBorders>
+              <w:top w:val="single" w:color="E0E0E0" w:sz="1"/>
+              <w:left w:val="single" w:color="E0E0E0" w:sz="1"/>
+              <w:bottom w:val="single" w:color="E0E0E0" w:sz="1"/>
+              <w:right w:val="single" w:color="E0E0E0" w:sz="1"/>
+            </w:tcBorders>
+            <w:tcMar>
+              <w:top w:type="dxa" w:w="80"/>
+              <w:left w:type="dxa" w:w="120"/>
+              <w:bottom w:type="dxa" w:w="80"/>
+              <w:right w:type="dxa" w:w="120"/>
+            </w:tcMar>
+          </w:tcPr>
+          <w:p>
+            <w:r>
+              <w:rPr>
+                <w:rFonts w:ascii="Arial" w:cs="Arial" w:eastAsia="Arial" w:hAnsi="Arial"/>
+                <w:sz w:val="20"/>
+                <w:szCs w:val="20"/>
+              </w:rPr>
+              <w:t xml:space="preserve">3</w:t>
+            </w:r>
+          </w:p>
+        </w:tc>
+      </w:tr>
+    </w:tbl>
+    <w:p>
+      <w:pPr>
+        <w:pStyle w:val="Heading3"/>
+        <w:spacing w:before="200"/>
+      </w:pPr>
+      <w:r>
+        <w:t xml:space="preserve">What was built</w:t>
+      </w:r>
+    </w:p>
+    <w:p>
+      <w:pPr>
+        <w:pStyle w:val="ListParagraph"/>
+        <w:numPr>
+          <w:ilvl w:val="0"/>
+          <w:numId w:val="2"/>
+        </w:numPr>
+        <w:spacing w:after="60"/>
+      </w:pPr>
+      <w:r>
+        <w:rPr>
+          <w:rFonts w:ascii="Arial" w:cs="Arial" w:eastAsia="Arial" w:hAnsi="Arial"/>
+          <w:sz w:val="20"/>
+          <w:szCs w:val="20"/>
+        </w:rPr>
+        <w:t xml:space="preserve">Repair Orders hub screen — entry point for Module 1 with Customers (active), Repair Orders (coming soon), and Estimates (coming soon) rows</w:t>
+      </w:r>
+    </w:p>
+    <w:p>
+      <w:pPr>
+        <w:pStyle w:val="ListParagraph"/>
+        <w:numPr>
+          <w:ilvl w:val="0"/>
+          <w:numId w:val="2"/>
+        </w:numPr>
+        <w:spacing w:after="60"/>
+      </w:pPr>
+      <w:r>
+        <w:rPr>
+          <w:rFonts w:ascii="Arial" w:cs="Arial" w:eastAsia="Arial" w:hAnsi="Arial"/>
+          <w:sz w:val="20"/>
+          <w:szCs w:val="20"/>
+        </w:rPr>
+        <w:t xml:space="preserve">Customer list screen — searchable, live-updating list with avatar initials (first letter of name in a blue circle)</w:t>
+      </w:r>
+    </w:p>
+    <w:p>
+      <w:pPr>
+        <w:pStyle w:val="ListParagraph"/>
+        <w:numPr>
+          <w:ilvl w:val="0"/>
+          <w:numId w:val="2"/>
+        </w:numPr>
+        <w:spacing w:after="60"/>
+      </w:pPr>
+      <w:r>
+        <w:rPr>
+          <w:rFonts w:ascii="Arial" w:cs="Arial" w:eastAsia="Arial" w:hAnsi="Arial"/>
+          <w:sz w:val="20"/>
+          <w:szCs w:val="20"/>
+        </w:rPr>
+        <w:t xml:space="preserve">Add customer form — name, phone, email fields</w:t>
+      </w:r>
+    </w:p>
+    <w:p>
+      <w:pPr>
+        <w:pStyle w:val="ListParagraph"/>
+        <w:numPr>
+          <w:ilvl w:val="0"/>
+          <w:numId w:val="2"/>
+        </w:numPr>
+        <w:spacing w:after="60"/>
+      </w:pPr>
+      <w:r>
+        <w:rPr>
+          <w:rFonts w:ascii="Arial" w:cs="Arial" w:eastAsia="Arial" w:hAnsi="Arial"/>
+          <w:sz w:val="20"/>
+          <w:szCs w:val="20"/>
+        </w:rPr>
+        <w:t xml:space="preserve">Edit customer form — pre-filled with existing data</w:t>
+      </w:r>
+    </w:p>
+    <w:p>
+      <w:pPr>
+        <w:pStyle w:val="ListParagraph"/>
+        <w:numPr>
+          <w:ilvl w:val="0"/>
+          <w:numId w:val="2"/>
+        </w:numPr>
+        <w:spacing w:after="60"/>
+      </w:pPr>
+      <w:r>
+        <w:rPr>
+          <w:rFonts w:ascii="Arial" w:cs="Arial" w:eastAsia="Arial" w:hAnsi="Arial"/>
+          <w:sz w:val="20"/>
+          <w:szCs w:val="20"/>
+        </w:rPr>
+        <w:t xml:space="preserve">Customer detail screen — shows contact info, vehicle list, and delete option</w:t>
+      </w:r>
+    </w:p>
+    <w:p>
+      <w:pPr>
+        <w:pStyle w:val="ListParagraph"/>
+        <w:numPr>
+          <w:ilvl w:val="0"/>
+          <w:numId w:val="2"/>
+        </w:numPr>
+        <w:spacing w:after="60"/>
+      </w:pPr>
+      <w:r>
+        <w:rPr>
+          <w:rFonts w:ascii="Arial" w:cs="Arial" w:eastAsia="Arial" w:hAnsi="Arial"/>
+          <w:sz w:val="20"/>
+          <w:szCs w:val="20"/>
+        </w:rPr>
+        <w:t xml:space="preserve">New customer flow — after saving, navigates directly to the new customer’s detail page</w:t>
+      </w:r>
+    </w:p>
+    <w:p>
+      <w:pPr>
+        <w:pStyle w:val="ListParagraph"/>
+        <w:numPr>
+          <w:ilvl w:val="0"/>
+          <w:numId w:val="2"/>
+        </w:numPr>
+        <w:spacing w:after="60"/>
+      </w:pPr>
+      <w:r>
+        <w:rPr>
+          <w:rFonts w:ascii="Arial" w:cs="Arial" w:eastAsia="Arial" w:hAnsi="Arial"/>
+          <w:sz w:val="20"/>
+          <w:szCs w:val="20"/>
+        </w:rPr>
+        <w:t xml:space="preserve">Vehicle list — shown on customer detail screen, updates live from database</w:t>
+      </w:r>
+    </w:p>
+    <w:p>
+      <w:pPr>
+        <w:pStyle w:val="ListParagraph"/>
+        <w:numPr>
+          <w:ilvl w:val="0"/>
+          <w:numId w:val="2"/>
+        </w:numPr>
+        <w:spacing w:after="60"/>
+      </w:pPr>
+      <w:r>
+        <w:rPr>
+          <w:rFonts w:ascii="Arial" w:cs="Arial" w:eastAsia="Arial" w:hAnsi="Arial"/>
+          <w:sz w:val="20"/>
+          <w:szCs w:val="20"/>
+        </w:rPr>
+        <w:t xml:space="preserve">Add vehicle form — year, make, model, VIN, mileage, license plate</w:t>
+      </w:r>
+    </w:p>
+    <w:p>
+      <w:pPr>
+        <w:pStyle w:val="ListParagraph"/>
+        <w:numPr>
+          <w:ilvl w:val="0"/>
+          <w:numId w:val="2"/>
+        </w:numPr>
+        <w:spacing w:after="60"/>
+      </w:pPr>
+      <w:r>
+        <w:rPr>
+          <w:rFonts w:ascii="Arial" w:cs="Arial" w:eastAsia="Arial" w:hAnsi="Arial"/>
+          <w:sz w:val="20"/>
+          <w:szCs w:val="20"/>
+        </w:rPr>
+        <w:t xml:space="preserve">Edit vehicle form — pre-filled with existing data</w:t>
+      </w:r>
+    </w:p>
+    <w:p>
+      <w:pPr>
+        <w:pStyle w:val="ListParagraph"/>
+        <w:numPr>
+          <w:ilvl w:val="0"/>
+          <w:numId w:val="2"/>
+        </w:numPr>
+        <w:spacing w:after="60"/>
+      </w:pPr>
+      <w:r>
+        <w:rPr>
+          <w:rFonts w:ascii="Arial" w:cs="Arial" w:eastAsia="Arial" w:hAnsi="Arial"/>
+          <w:sz w:val="20"/>
+          <w:szCs w:val="20"/>
+        </w:rPr>
+        <w:t xml:space="preserve">Delete customer and delete vehicle — confirmation dialog, then navigates away</w:t>
+      </w:r>
+    </w:p>
+    <w:p>
+      <w:pPr>
+        <w:pStyle w:val="ListParagraph"/>
+        <w:numPr>
+          <w:ilvl w:val="0"/>
+          <w:numId w:val="2"/>
+        </w:numPr>
+        <w:spacing w:after="60"/>
+      </w:pPr>
+      <w:r>
+        <w:rPr>
+          <w:rFonts w:ascii="Arial" w:cs="Arial" w:eastAsia="Arial" w:hAnsi="Arial"/>
+          <w:sz w:val="20"/>
+          <w:szCs w:val="20"/>
+        </w:rPr>
+        <w:t xml:space="preserve">Input formatters: phone formats as (555) 867-5309, mileage shows 45,000, plate inserts space (ABC 1234), VIN auto-uppercases, name/make/model capitalize each word</w:t>
+      </w:r>
+    </w:p>
+    <w:p>
+      <w:pPr>
+        <w:pStyle w:val="ListParagraph"/>
+        <w:numPr>
+          <w:ilvl w:val="0"/>
+          <w:numId w:val="2"/>
+        </w:numPr>
+        <w:spacing w:after="60"/>
+      </w:pPr>
+      <w:r>
+        <w:rPr>
+          <w:rFonts w:ascii="Arial" w:cs="Arial" w:eastAsia="Arial" w:hAnsi="Arial"/>
+          <w:sz w:val="20"/>
+          <w:szCs w:val="20"/>
+        </w:rPr>
+        <w:t xml:space="preserve">Database schema v3 — removed address column from customers, removed trim column from vehicles</w:t>
+      </w:r>
+    </w:p>
+    <w:p>
+      <w:pPr>
+        <w:pStyle w:val="ListParagraph"/>
+        <w:numPr>
+          <w:ilvl w:val="0"/>
+          <w:numId w:val="2"/>
+        </w:numPr>
+        <w:spacing w:after="60"/>
+      </w:pPr>
+      <w:r>
+        <w:rPr>
+          <w:rFonts w:ascii="Arial" w:cs="Arial" w:eastAsia="Arial" w:hAnsi="Arial"/>
+          <w:sz w:val="20"/>
+          <w:szCs w:val="20"/>
+        </w:rPr>
+        <w:t xml:space="preserve">Dialog bug fix — delete confirmation buttons now dismiss correctly using dialog context</w:t>
+      </w:r>
+    </w:p>
+    <w:p>
+      <w:pPr>
+        <w:pStyle w:val="ListParagraph"/>
+        <w:numPr>
+          <w:ilvl w:val="0"/>
+          <w:numId w:val="2"/>
+        </w:numPr>
+        <w:spacing w:after="60"/>
+      </w:pPr>
+      <w:r>
+        <w:rPr>
+          <w:rFonts w:ascii="Arial" w:cs="Arial" w:eastAsia="Arial" w:hAnsi="Arial"/>
+          <w:sz w:val="20"/>
+          <w:szCs w:val="20"/>
+        </w:rPr>
+        <w:t xml:space="preserve">Delete buttons changed from large filled red buttons to subtle red text links</w:t>
+      </w:r>
+    </w:p>
+    <w:p>
+      <w:pPr>
+        <w:pStyle w:val="ListParagraph"/>
+        <w:numPr>
+          <w:ilvl w:val="0"/>
+          <w:numId w:val="2"/>
+        </w:numPr>
+        <w:spacing w:after="60"/>
+      </w:pPr>
+      <w:r>
+        <w:rPr>
+          <w:rFonts w:ascii="Arial" w:cs="Arial" w:eastAsia="Arial" w:hAnsi="Arial"/>
+          <w:sz w:val="20"/>
+          <w:szCs w:val="20"/>
+        </w:rPr>
+        <w:t xml:space="preserve">Worktrees added to .gitignore</w:t>
+      </w:r>
+    </w:p>
+    <w:p>
+      <w:pPr>
+        <w:pStyle w:val="Heading3"/>
+        <w:spacing w:before="200"/>
+      </w:pPr>
+      <w:r>
+        <w:t xml:space="preserve">Files added</w:t>
+      </w:r>
+    </w:p>
+    <w:p>
+      <w:pPr>
+        <w:pStyle w:val="ListParagraph"/>
+        <w:numPr>
+          <w:ilvl w:val="0"/>
+          <w:numId w:val="2"/>
+        </w:numPr>
+        <w:spacing w:after="60"/>
+      </w:pPr>
+      <w:r>
+        <w:rPr>
+          <w:rFonts w:ascii="Arial" w:cs="Arial" w:eastAsia="Arial" w:hAnsi="Arial"/>
+          <w:sz w:val="20"/>
+          <w:szCs w:val="20"/>
+        </w:rPr>
+        <w:t xml:space="preserve">lib/features/customers/customers_provider.dart</w:t>
+      </w:r>
+    </w:p>
+    <w:p>
+      <w:pPr>
+        <w:pStyle w:val="ListParagraph"/>
+        <w:numPr>
+          <w:ilvl w:val="0"/>
+          <w:numId w:val="2"/>
+        </w:numPr>
+        <w:spacing w:after="60"/>
+      </w:pPr>
+      <w:r>
+        <w:rPr>
+          <w:rFonts w:ascii="Arial" w:cs="Arial" w:eastAsia="Arial" w:hAnsi="Arial"/>
+          <w:sz w:val="20"/>
+          <w:szCs w:val="20"/>
+        </w:rPr>
+        <w:t xml:space="preserve">lib/features/customers/customer_list_screen.dart</w:t>
+      </w:r>
+    </w:p>
+    <w:p>
+      <w:pPr>
+        <w:pStyle w:val="ListParagraph"/>
+        <w:numPr>
+          <w:ilvl w:val="0"/>
+          <w:numId w:val="2"/>
+        </w:numPr>
+        <w:spacing w:after="60"/>
+      </w:pPr>
+      <w:r>
+        <w:rPr>
+          <w:rFonts w:ascii="Arial" w:cs="Arial" w:eastAsia="Arial" w:hAnsi="Arial"/>
+          <w:sz w:val="20"/>
+          <w:szCs w:val="20"/>
+        </w:rPr>
+        <w:t xml:space="preserve">lib/features/customers/customer_form_screen.dart</w:t>
+      </w:r>
+    </w:p>
+    <w:p>
+      <w:pPr>
+        <w:pStyle w:val="ListParagraph"/>
+        <w:numPr>
+          <w:ilvl w:val="0"/>
+          <w:numId w:val="2"/>
+        </w:numPr>
+        <w:spacing w:after="60"/>
+      </w:pPr>
+      <w:r>
+        <w:rPr>
+          <w:rFonts w:ascii="Arial" w:cs="Arial" w:eastAsia="Arial" w:hAnsi="Arial"/>
+          <w:sz w:val="20"/>
+          <w:szCs w:val="20"/>
+        </w:rPr>
+        <w:t xml:space="preserve">lib/features/customers/customer_detail_screen.dart</w:t>
+      </w:r>
+    </w:p>
+    <w:p>
+      <w:pPr>
+        <w:pStyle w:val="ListParagraph"/>
+        <w:numPr>
+          <w:ilvl w:val="0"/>
+          <w:numId w:val="2"/>
+        </w:numPr>
+        <w:spacing w:after="60"/>
+      </w:pPr>
+      <w:r>
+        <w:rPr>
+          <w:rFonts w:ascii="Arial" w:cs="Arial" w:eastAsia="Arial" w:hAnsi="Arial"/>
+          <w:sz w:val="20"/>
+          <w:szCs w:val="20"/>
+        </w:rPr>
+        <w:t xml:space="preserve">lib/features/repair_orders/repair_orders_screen.dart</w:t>
+      </w:r>
+    </w:p>
+    <w:p>
+      <w:pPr>
+        <w:pStyle w:val="ListParagraph"/>
+        <w:numPr>
+          <w:ilvl w:val="0"/>
+          <w:numId w:val="2"/>
+        </w:numPr>
+        <w:spacing w:after="60"/>
+      </w:pPr>
+      <w:r>
+        <w:rPr>
+          <w:rFonts w:ascii="Arial" w:cs="Arial" w:eastAsia="Arial" w:hAnsi="Arial"/>
+          <w:sz w:val="20"/>
+          <w:szCs w:val="20"/>
+        </w:rPr>
+        <w:t xml:space="preserve">lib/features/vehicles/vehicle_form_screen.dart</w:t>
+      </w:r>
+    </w:p>
+    <w:p>
+      <w:pPr>
+        <w:pStyle w:val="ListParagraph"/>
+        <w:numPr>
+          <w:ilvl w:val="0"/>
+          <w:numId w:val="2"/>
+        </w:numPr>
+        <w:spacing w:after="60"/>
+      </w:pPr>
+      <w:r>
+        <w:rPr>
+          <w:rFonts w:ascii="Arial" w:cs="Arial" w:eastAsia="Arial" w:hAnsi="Arial"/>
+          <w:sz w:val="20"/>
+          <w:szCs w:val="20"/>
+        </w:rPr>
+        <w:t xml:space="preserve">lib/features/vehicles/vehicle_detail_screen.dart</w:t>
+      </w:r>
+    </w:p>
+    <w:p>
+      <w:pPr>
+        <w:pStyle w:val="Heading3"/>
+        <w:spacing w:before="200"/>
+      </w:pPr>
+      <w:r>
+        <w:t xml:space="preserve">Files modified</w:t>
+      </w:r>
+    </w:p>
+    <w:p>
+      <w:pPr>
+        <w:pStyle w:val="ListParagraph"/>
+        <w:numPr>
+          <w:ilvl w:val="0"/>
+          <w:numId w:val="2"/>
+        </w:numPr>
+        <w:spacing w:after="60"/>
+      </w:pPr>
+      <w:r>
+        <w:rPr>
+          <w:rFonts w:ascii="Arial" w:cs="Arial" w:eastAsia="Arial" w:hAnsi="Arial"/>
+          <w:sz w:val="20"/>
+          <w:szCs w:val="20"/>
+        </w:rPr>
+        <w:t xml:space="preserve">lib/database/database.dart (schema v3, CRUD methods for customers and vehicles)</w:t>
+      </w:r>
+    </w:p>
+    <w:p>
+      <w:pPr>
+        <w:pStyle w:val="ListParagraph"/>
+        <w:numPr>
+          <w:ilvl w:val="0"/>
+          <w:numId w:val="2"/>
+        </w:numPr>
+        <w:spacing w:after="60"/>
+      </w:pPr>
+      <w:r>
+        <w:rPr>
+          <w:rFonts w:ascii="Arial" w:cs="Arial" w:eastAsia="Arial" w:hAnsi="Arial"/>
+          <w:sz w:val="20"/>
+          <w:szCs w:val="20"/>
+        </w:rPr>
+        <w:t xml:space="preserve">lib/database/database.g.dart (regenerated by build_runner)</w:t>
+      </w:r>
+    </w:p>
+    <w:p>
+      <w:pPr>
+        <w:pStyle w:val="ListParagraph"/>
+        <w:numPr>
+          <w:ilvl w:val="0"/>
+          <w:numId w:val="2"/>
+        </w:numPr>
+        <w:spacing w:after="60"/>
+      </w:pPr>
+      <w:r>
+        <w:rPr>
+          <w:rFonts w:ascii="Arial" w:cs="Arial" w:eastAsia="Arial" w:hAnsi="Arial"/>
+          <w:sz w:val="20"/>
+          <w:szCs w:val="20"/>
+        </w:rPr>
+        <w:t xml:space="preserve">lib/router.dart (customer and vehicle routes added)</w:t>
+      </w:r>
+    </w:p>
+    <w:p>
+      <w:pPr>
+        <w:pStyle w:val="ListParagraph"/>
+        <w:numPr>
+          <w:ilvl w:val="0"/>
+          <w:numId w:val="2"/>
+        </w:numPr>
+        <w:spacing w:after="60"/>
+      </w:pPr>
+      <w:r>
+        <w:rPr>
+          <w:rFonts w:ascii="Arial" w:cs="Arial" w:eastAsia="Arial" w:hAnsi="Arial"/>
+          <w:sz w:val="20"/>
+          <w:szCs w:val="20"/>
+        </w:rPr>
+        <w:t xml:space="preserve">pubspec.yaml (bumped to 0.2.0+3)</w:t>
+      </w:r>
+    </w:p>
+    <w:p>
+      <w:pPr>
+        <w:pStyle w:val="ListParagraph"/>
+        <w:numPr>
+          <w:ilvl w:val="0"/>
+          <w:numId w:val="2"/>
+        </w:numPr>
+        <w:spacing w:after="60"/>
+      </w:pPr>
+      <w:r>
+        <w:rPr>
+          <w:rFonts w:ascii="Arial" w:cs="Arial" w:eastAsia="Arial" w:hAnsi="Arial"/>
+          <w:sz w:val="20"/>
+          <w:szCs w:val="20"/>
+        </w:rPr>
+        <w:t xml:space="preserve">CLAUDE.md (worktree warning, build_runner instructions added)</w:t>
+      </w:r>
+    </w:p>
+    <w:p>
+      <w:pPr>
+        <w:pStyle w:val="ListParagraph"/>
+        <w:numPr>
+          <w:ilvl w:val="0"/>
+          <w:numId w:val="2"/>
+        </w:numPr>
+        <w:spacing w:after="60"/>
+      </w:pPr>
+      <w:r>
+        <w:rPr>
+          <w:rFonts w:ascii="Arial" w:cs="Arial" w:eastAsia="Arial" w:hAnsi="Arial"/>
+          <w:sz w:val="20"/>
+          <w:szCs w:val="20"/>
+        </w:rPr>
+        <w:t xml:space="preserve">docs/README.md (v0.2.0 status added)</w:t>
+      </w:r>
+    </w:p>
+    <w:p>
+      <w:pPr>
+        <w:pStyle w:val="ListParagraph"/>
+        <w:numPr>
+          <w:ilvl w:val="0"/>
+          <w:numId w:val="2"/>
+        </w:numPr>
+        <w:spacing w:after="60"/>
+      </w:pPr>
+      <w:r>
+        <w:rPr>
+          <w:rFonts w:ascii="Arial" w:cs="Arial" w:eastAsia="Arial" w:hAnsi="Arial"/>
+          <w:sz w:val="20"/>
+          <w:szCs w:val="20"/>
+        </w:rPr>
+        <w:t xml:space="preserve">docs/module_plan.md (customer and vehicle tasks marked complete)</w:t>
+      </w:r>
+    </w:p>
+    <w:p>
+      <w:pPr>
+        <w:pStyle w:val="Heading3"/>
+        <w:spacing w:before="200"/>
+      </w:pPr>
+      <w:r>
+        <w:t xml:space="preserve">Next session</w:t>
+      </w:r>
+    </w:p>
+    <w:p>
+      <w:pPr>
+        <w:pStyle w:val="ListParagraph"/>
+        <w:numPr>
+          <w:ilvl w:val="0"/>
+          <w:numId w:val="2"/>
+        </w:numPr>
+        <w:spacing w:after="60"/>
+      </w:pPr>
+      <w:r>
+        <w:rPr>
+          <w:rFonts w:ascii="Arial" w:cs="Arial" w:eastAsia="Arial" w:hAnsi="Arial"/>
+          <w:sz w:val="20"/>
+          <w:szCs w:val="20"/>
+        </w:rPr>
+        <w:t xml:space="preserve">VIN decode using NHTSA free API (auto-fill year/make/model from VIN) or Estimates</w:t>
+      </w:r>
+    </w:p>
+    <w:p>
+      <w:pPr>
+        <w:pStyle w:val="ListParagraph"/>
+        <w:numPr>
+          <w:ilvl w:val="0"/>
+          <w:numId w:val="2"/>
+        </w:numPr>
+      </w:pPr>
+      <w:r>
+        <w:rPr>
+          <w:rFonts w:ascii="Arial" w:cs="Arial" w:eastAsia="Arial" w:hAnsi="Arial"/>
+          <w:sz w:val="20"/>
+          <w:szCs w:val="20"/>
+        </w:rPr>
+        <w:t xml:space="preserve"/>
       </w:r>
     </w:p>
     <w:p>

</xml_diff>

<commit_message>
v0.4.0 Open Bay — Repair Order engine complete
- RepairOrders table (schema v9) with full CRUD and stream queries
- RO list screen with color-coded status indicators
- RO detail screen with status advancement (Open → In Progress → Completed → Closed)
- Convert to Repair Order action on estimate detail
- View Repair Order link once RO exists
- Standardized button/action design rule (list-row style, saved to CLAUDE.md)
- Repair Orders hub row enabled

Co-Authored-By: Claude Sonnet 4.6 <noreply@anthropic.com>
</commit_message>
<xml_diff>
--- a/docs/AutoShopPro_Build_Log.docx
+++ b/docs/AutoShopPro_Build_Log.docx
@@ -1710,6 +1710,252 @@
       </w:pPr>
       <w:r>
         <w:t xml:space="preserve">Build Sessions</w:t>
+      </w:r>
+    </w:p>
+    <w:p>
+      <w:r>
+        <w:t xml:space="preserve"/>
+      </w:r>
+    </w:p>
+    <w:p>
+      <w:pPr>
+        <w:pStyle w:val="Heading2"/>
+      </w:pPr>
+      <w:r>
+        <w:t xml:space="preserve">Session 5 — v0.4.0 Open Bay</w:t>
+      </w:r>
+    </w:p>
+    <w:p>
+      <w:r>
+        <w:t xml:space="preserve">Date: March 22, 2026</w:t>
+      </w:r>
+    </w:p>
+    <w:p>
+      <w:r>
+        <w:t xml:space="preserve">Version: v0.4.0 Open Bay</w:t>
+      </w:r>
+    </w:p>
+    <w:p>
+      <w:r>
+        <w:t xml:space="preserve">Session: 5</w:t>
+      </w:r>
+    </w:p>
+    <w:p>
+      <w:pPr>
+        <w:pStyle w:val="ListBullet"/>
+      </w:pPr>
+      <w:r>
+        <w:t xml:space="preserve">Version renamed from v0.3.0 Estimate → v0.3.0 Write-Up across all docs</w:t>
+      </w:r>
+    </w:p>
+    <w:p>
+      <w:pPr>
+        <w:pStyle w:val="ListBullet"/>
+      </w:pPr>
+      <w:r>
+        <w:t xml:space="preserve">Design rule saved permanently to CLAUDE.md so all future sessions follow it</w:t>
+      </w:r>
+    </w:p>
+    <w:p>
+      <w:pPr>
+        <w:pStyle w:val="ListBullet"/>
+      </w:pPr>
+      <w:r>
+        <w:t xml:space="preserve">Button/action design rule standardized — all actions use list-row style (blue icon + blue label + gray chevron, under small-caps section header)</w:t>
+      </w:r>
+    </w:p>
+    <w:p>
+      <w:pPr>
+        <w:pStyle w:val="ListBullet"/>
+      </w:pPr>
+      <w:r>
+        <w:t xml:space="preserve">Repair Orders hub row enabled — was Coming soon, now navigates to /repair-orders/ros</w:t>
+      </w:r>
+    </w:p>
+    <w:p>
+      <w:pPr>
+        <w:pStyle w:val="ListBullet"/>
+      </w:pPr>
+      <w:r>
+        <w:t xml:space="preserve">View Repair Order link on estimate detail once RO exists (green icon, RO number subtitle)</w:t>
+      </w:r>
+    </w:p>
+    <w:p>
+      <w:pPr>
+        <w:pStyle w:val="ListBullet"/>
+      </w:pPr>
+      <w:r>
+        <w:t xml:space="preserve">Convert to Repair Order action on estimate detail screen (list-row style under ACTIONS)</w:t>
+      </w:r>
+    </w:p>
+    <w:p>
+      <w:pPr>
+        <w:pStyle w:val="ListBullet"/>
+      </w:pPr>
+      <w:r>
+        <w:t xml:space="preserve">Status advancement flow: Open → In Progress → Completed → Closed, each with contextual icon (wrench / checkmark / lock)</w:t>
+      </w:r>
+    </w:p>
+    <w:p>
+      <w:pPr>
+        <w:pStyle w:val="ListBullet"/>
+      </w:pPr>
+      <w:r>
+        <w:t xml:space="preserve">RO detail screen — status badge, customer/vehicle header, line items (read from linked estimate), totals, ACTIONS section with status advancement row</w:t>
+      </w:r>
+    </w:p>
+    <w:p>
+      <w:pPr>
+        <w:pStyle w:val="ListBullet"/>
+      </w:pPr>
+      <w:r>
+        <w:t xml:space="preserve">RO list screen — color-coded status dots (blue=Open, orange=In Progress, green=Completed, gray=Closed), customer name, vehicle label, status text + chevron</w:t>
+      </w:r>
+    </w:p>
+    <w:p>
+      <w:pPr>
+        <w:pStyle w:val="ListBullet"/>
+      </w:pPr>
+      <w:r>
+        <w:t xml:space="preserve">repair_orders_provider.dart — repairOrdersProvider, repairOrderProvider, roForEstimateProvider (Riverpod StreamProviders)</w:t>
+      </w:r>
+    </w:p>
+    <w:p>
+      <w:pPr>
+        <w:pStyle w:val="ListBullet"/>
+      </w:pPr>
+      <w:r>
+        <w:t xml:space="preserve">RepairOrderWithDetails helper class for joined RO + customer + vehicle queries</w:t>
+      </w:r>
+    </w:p>
+    <w:p>
+      <w:pPr>
+        <w:pStyle w:val="ListBullet"/>
+      </w:pPr>
+      <w:r>
+        <w:t xml:space="preserve">Repair Orders table — schema v9, full CRUD (insertRepairOrder, updateRepairOrder, deleteRepairOrder, watchAllRepairOrders, watchRepairOrder, watchRoForEstimate)</w:t>
+      </w:r>
+    </w:p>
+    <w:p>
+      <w:r>
+        <w:rPr>
+          <w:b/>
+        </w:rPr>
+        <w:t xml:space="preserve">What was built</w:t>
+      </w:r>
+    </w:p>
+    <w:p>
+      <w:pPr>
+        <w:pStyle w:val="ListBullet"/>
+      </w:pPr>
+      <w:r>
+        <w:t xml:space="preserve">lib/features/repair_orders/ro_detail_screen.dart</w:t>
+      </w:r>
+    </w:p>
+    <w:p>
+      <w:pPr>
+        <w:pStyle w:val="ListBullet"/>
+      </w:pPr>
+      <w:r>
+        <w:t xml:space="preserve">lib/features/repair_orders/ro_list_screen.dart</w:t>
+      </w:r>
+    </w:p>
+    <w:p>
+      <w:pPr>
+        <w:pStyle w:val="ListBullet"/>
+      </w:pPr>
+      <w:r>
+        <w:t xml:space="preserve">lib/features/repair_orders/repair_orders_provider.dart</w:t>
+      </w:r>
+    </w:p>
+    <w:p>
+      <w:r>
+        <w:rPr>
+          <w:b/>
+        </w:rPr>
+        <w:t xml:space="preserve">Files added</w:t>
+      </w:r>
+    </w:p>
+    <w:p>
+      <w:pPr>
+        <w:pStyle w:val="ListBullet"/>
+      </w:pPr>
+      <w:r>
+        <w:t xml:space="preserve">README.md — v0.4.0 Open Bay added to Project Status</w:t>
+      </w:r>
+    </w:p>
+    <w:p>
+      <w:pPr>
+        <w:pStyle w:val="ListBullet"/>
+      </w:pPr>
+      <w:r>
+        <w:t xml:space="preserve">docs/module_plan.md — RO tasks checked off, v0.4.0 infrastructure section added</w:t>
+      </w:r>
+    </w:p>
+    <w:p>
+      <w:pPr>
+        <w:pStyle w:val="ListBullet"/>
+      </w:pPr>
+      <w:r>
+        <w:t xml:space="preserve">CLAUDE.md — Button &amp; Action Design Rule section added, What's Built So Far updated, schema v9, version bumped to v0.4.0 Open Bay</w:t>
+      </w:r>
+    </w:p>
+    <w:p>
+      <w:pPr>
+        <w:pStyle w:val="ListBullet"/>
+      </w:pPr>
+      <w:r>
+        <w:t xml:space="preserve">lib/router.dart — /repair-orders/ros and /repair-orders/ros/:roId routes added</w:t>
+      </w:r>
+    </w:p>
+    <w:p>
+      <w:pPr>
+        <w:pStyle w:val="ListBullet"/>
+      </w:pPr>
+      <w:r>
+        <w:t xml:space="preserve">lib/features/repair_orders/repair_orders_screen.dart — Repair Orders row enabled, navigates to /repair-orders/ros</w:t>
+      </w:r>
+    </w:p>
+    <w:p>
+      <w:pPr>
+        <w:pStyle w:val="ListBullet"/>
+      </w:pPr>
+      <w:r>
+        <w:t xml:space="preserve">lib/features/estimates/estimate_detail_screen.dart — Convert to RO / View RO banner, Add Labor/Part as list-row actions, _ActionRow widget, removed _AddButton</w:t>
+      </w:r>
+    </w:p>
+    <w:p>
+      <w:pPr>
+        <w:pStyle w:val="ListBullet"/>
+      </w:pPr>
+      <w:r>
+        <w:t xml:space="preserve">lib/database/database.g.dart — regenerated by build_runner</w:t>
+      </w:r>
+    </w:p>
+    <w:p>
+      <w:pPr>
+        <w:pStyle w:val="ListBullet"/>
+      </w:pPr>
+      <w:r>
+        <w:t xml:space="preserve">lib/database/database.dart — RepairOrders table, RepairOrderWithDetails, schemaVersion 8→9, migration from &lt; 9, RO queries</w:t>
+      </w:r>
+    </w:p>
+    <w:p>
+      <w:r>
+        <w:rPr>
+          <w:b/>
+        </w:rPr>
+        <w:t xml:space="preserve">Files modified</w:t>
+      </w:r>
+    </w:p>
+    <w:p>
+      <w:r>
+        <w:t xml:space="preserve">Polish and bug-finding session — review all screens for UX issues, fix any rough edges, check edge cases (empty states, missing data, navigation flows).</w:t>
+      </w:r>
+    </w:p>
+    <w:p>
+      <w:r>
+        <w:t xml:space="preserve">Next session</w:t>
       </w:r>
     </w:p>
     <w:p>

</xml_diff>

<commit_message>
Show NO PLATE in all displays; update docs
Remove the NO PLATE display filter from estimate detail, estimate form,
and RO detail — vehicles without a plate now show "NO PLATE" as-is
rather than hiding the plate field entirely.

Co-Authored-By: Claude Sonnet 4.6 <noreply@anthropic.com>
</commit_message>
<xml_diff>
--- a/docs/AutoShopPro_Build_Log.docx
+++ b/docs/AutoShopPro_Build_Log.docx
@@ -1710,6 +1710,284 @@
       </w:pPr>
       <w:r>
         <w:t xml:space="preserve">Build Sessions</w:t>
+      </w:r>
+    </w:p>
+    <w:p>
+      <w:r>
+        <w:t xml:space="preserve"/>
+      </w:r>
+    </w:p>
+    <w:p>
+      <w:pPr>
+        <w:pStyle w:val="Heading2"/>
+      </w:pPr>
+      <w:r>
+        <w:t xml:space="preserve">Session 6 — v0.5.0 Sign-Off</w:t>
+      </w:r>
+    </w:p>
+    <w:p>
+      <w:r>
+        <w:t xml:space="preserve">Date: March 22, 2026</w:t>
+      </w:r>
+    </w:p>
+    <w:p>
+      <w:r>
+        <w:t xml:space="preserve">Version: v0.5.0 Sign-Off</w:t>
+      </w:r>
+    </w:p>
+    <w:p>
+      <w:r>
+        <w:t xml:space="preserve">Session: 6</w:t>
+      </w:r>
+    </w:p>
+    <w:p>
+      <w:pPr>
+        <w:pStyle w:val="ListBullet"/>
+      </w:pPr>
+      <w:r>
+        <w:t xml:space="preserve">Migration pattern corrected from from == N to from &lt; N with PRAGMA guards to safely handle devices jumping multiple versions</w:t>
+      </w:r>
+    </w:p>
+    <w:p>
+      <w:pPr>
+        <w:pStyle w:val="ListBullet"/>
+      </w:pPr>
+      <w:r>
+        <w:t xml:space="preserve">Totals section shows "X items declined −$Y.YY" footnote in red when items are declined</w:t>
+      </w:r>
+    </w:p>
+    <w:p>
+      <w:pPr>
+        <w:pStyle w:val="ListBullet"/>
+      </w:pPr>
+      <w:r>
+        <w:t xml:space="preserve">Declined items display with strikethrough + gray text on estimate; excluded entirely from repair order</w:t>
+      </w:r>
+    </w:p>
+    <w:p>
+      <w:pPr>
+        <w:pStyle w:val="ListBullet"/>
+      </w:pPr>
+      <w:r>
+        <w:t xml:space="preserve">Partial estimate approval — tap approval circle badge on any line item to approve or decline it (schema v13, approvalStatus column)</w:t>
+      </w:r>
+    </w:p>
+    <w:p>
+      <w:pPr>
+        <w:pStyle w:val="ListBullet"/>
+      </w:pPr>
+      <w:r>
+        <w:t xml:space="preserve">contextMenuBuilder added to all CupertinoTextFields for right-click copy/cut/paste on macOS (standing rule saved to memory)</w:t>
+      </w:r>
+    </w:p>
+    <w:p>
+      <w:pPr>
+        <w:pStyle w:val="ListBullet"/>
+      </w:pPr>
+      <w:r>
+        <w:t xml:space="preserve">"+ New Customer" / "+ New Vehicle" / "+ Add Vendor" rows added to all picker sheets so you can create records without leaving the form</w:t>
+      </w:r>
+    </w:p>
+    <w:p>
+      <w:pPr>
+        <w:pStyle w:val="ListBullet"/>
+      </w:pPr>
+      <w:r>
+        <w:t xml:space="preserve">Edit Estimate link added to non-closed RO detail screens</w:t>
+      </w:r>
+    </w:p>
+    <w:p>
+      <w:pPr>
+        <w:pStyle w:val="ListBullet"/>
+      </w:pPr>
+      <w:r>
+        <w:t xml:space="preserve">Mark items done on repair order — checkmark circle toggle per line item when RO is not closed (schema v12)</w:t>
+      </w:r>
+    </w:p>
+    <w:p>
+      <w:pPr>
+        <w:pStyle w:val="ListBullet"/>
+      </w:pPr>
+      <w:r>
+        <w:t xml:space="preserve">"NO PLATE" stored when plate field is left empty on vehicle save; displayed as-is in all pickers, estimate headers, and RO headers</w:t>
+      </w:r>
+    </w:p>
+    <w:p>
+      <w:pPr>
+        <w:pStyle w:val="ListBullet"/>
+      </w:pPr>
+      <w:r>
+        <w:t xml:space="preserve">License plate shown in vehicle picker dropdown and selected row on estimate form</w:t>
+      </w:r>
+    </w:p>
+    <w:p>
+      <w:pPr>
+        <w:pStyle w:val="ListBullet"/>
+      </w:pPr>
+      <w:r>
+        <w:t xml:space="preserve">Internal note field on customer form — shown on customer detail, auto-populates estimate internal note when customer is picked (schema v12)</w:t>
+      </w:r>
+    </w:p>
+    <w:p>
+      <w:pPr>
+        <w:pStyle w:val="ListBullet"/>
+      </w:pPr>
+      <w:r>
+        <w:t xml:space="preserve">Customer complaint field added to new estimate form and displayed in estimate/RO detail header (schema v11)</w:t>
+      </w:r>
+    </w:p>
+    <w:p>
+      <w:pPr>
+        <w:pStyle w:val="ListBullet"/>
+      </w:pPr>
+      <w:r>
+        <w:t xml:space="preserve">Parts grouped under their linked labor sub-header in estimate detail and RO detail screens</w:t>
+      </w:r>
+    </w:p>
+    <w:p>
+      <w:pPr>
+        <w:pStyle w:val="ListBullet"/>
+      </w:pPr>
+      <w:r>
+        <w:t xml:space="preserve">Parts can be linked to a labor line via a labor picker on the Add Part form (parentLaborId, schema v10)</w:t>
+      </w:r>
+    </w:p>
+    <w:p>
+      <w:pPr>
+        <w:pStyle w:val="ListBullet"/>
+      </w:pPr>
+      <w:r>
+        <w:t xml:space="preserve">Unit cost + markup % / markup $ / unit list price fields on Add Part form — editing markup % auto-updates markup $ and vice versa (schema v10)</w:t>
+      </w:r>
+    </w:p>
+    <w:p>
+      <w:r>
+        <w:rPr>
+          <w:b/>
+        </w:rPr>
+        <w:t xml:space="preserve">What was built</w:t>
+      </w:r>
+    </w:p>
+    <w:p>
+      <w:pPr>
+        <w:pStyle w:val="ListBullet"/>
+      </w:pPr>
+      <w:r>
+        <w:t xml:space="preserve">Migration blocks used from == N which would skip migrations on devices jumping multiple schema versions — corrected to from &lt; N throughout</w:t>
+      </w:r>
+    </w:p>
+    <w:p>
+      <w:r>
+        <w:rPr>
+          <w:b/>
+        </w:rPr>
+        <w:t xml:space="preserve">Bugs fixed</w:t>
+      </w:r>
+    </w:p>
+    <w:p>
+      <w:pPr>
+        <w:pStyle w:val="ListBullet"/>
+      </w:pPr>
+      <w:r>
+        <w:t xml:space="preserve">lib/features/repair_orders/ro_detail_screen.dart — removed NO PLATE display filter</w:t>
+      </w:r>
+    </w:p>
+    <w:p>
+      <w:pPr>
+        <w:pStyle w:val="ListBullet"/>
+      </w:pPr>
+      <w:r>
+        <w:t xml:space="preserve">lib/features/estimates/estimate_form_screen.dart — removed NO PLATE display filters in picker and selected row</w:t>
+      </w:r>
+    </w:p>
+    <w:p>
+      <w:pPr>
+        <w:pStyle w:val="ListBullet"/>
+      </w:pPr>
+      <w:r>
+        <w:t xml:space="preserve">lib/features/estimates/estimate_detail_screen.dart — removed NO PLATE display filter; plate shown as-is</w:t>
+      </w:r>
+    </w:p>
+    <w:p>
+      <w:pPr>
+        <w:pStyle w:val="ListBullet"/>
+      </w:pPr>
+      <w:r>
+        <w:t xml:space="preserve">lib/features/vehicles/vehicle_form_screen.dart — NO PLATE stored when plate field is empty</w:t>
+      </w:r>
+    </w:p>
+    <w:p>
+      <w:pPr>
+        <w:pStyle w:val="ListBullet"/>
+      </w:pPr>
+      <w:r>
+        <w:t xml:space="preserve">lib/features/customers/customer_detail_screen.dart — internal note shown in CONTACT section</w:t>
+      </w:r>
+    </w:p>
+    <w:p>
+      <w:pPr>
+        <w:pStyle w:val="ListBullet"/>
+      </w:pPr>
+      <w:r>
+        <w:t xml:space="preserve">lib/features/customers/customer_form_screen.dart — internal note field added</w:t>
+      </w:r>
+    </w:p>
+    <w:p>
+      <w:pPr>
+        <w:pStyle w:val="ListBullet"/>
+      </w:pPr>
+      <w:r>
+        <w:t xml:space="preserve">lib/features/repair_orders/ro_detail_screen.dart — declined items filtered out; mark-done checkmark toggle; Edit Estimate action row; customer complaint in header</w:t>
+      </w:r>
+    </w:p>
+    <w:p>
+      <w:pPr>
+        <w:pStyle w:val="ListBullet"/>
+      </w:pPr>
+      <w:r>
+        <w:t xml:space="preserve">lib/features/estimates/estimate_detail_screen.dart — approval badge on each row; action sheet to approve/decline/reset; declined items styled with strikethrough; totals footnote for declined; declinedTotal excluded from subtotal</w:t>
+      </w:r>
+    </w:p>
+    <w:p>
+      <w:pPr>
+        <w:pStyle w:val="ListBullet"/>
+      </w:pPr>
+      <w:r>
+        <w:t xml:space="preserve">lib/features/estimates/estimate_form_screen.dart — customer complaint field; internal note field; _PickerSheet updated with createNew and sublabel support; vehicle picker shows plate</w:t>
+      </w:r>
+    </w:p>
+    <w:p>
+      <w:pPr>
+        <w:pStyle w:val="ListBullet"/>
+      </w:pPr>
+      <w:r>
+        <w:t xml:space="preserve">lib/features/estimates/line_item_form_screen.dart — unit cost + markup % / $ / list fields with auto-sync; labor picker row; vendorSheet with + Add Vendor</w:t>
+      </w:r>
+    </w:p>
+    <w:p>
+      <w:pPr>
+        <w:pStyle w:val="ListBullet"/>
+      </w:pPr>
+      <w:r>
+        <w:t xml:space="preserve">lib/database/database.dart — added unitCost, parentLaborId (v10), customerComplaint (v11), internalNote, isDone (v12), approvalStatus (v13); bumped schemaVersion to 13; fixed all migration blocks to from &lt; N</w:t>
+      </w:r>
+    </w:p>
+    <w:p>
+      <w:r>
+        <w:rPr>
+          <w:b/>
+        </w:rPr>
+        <w:t xml:space="preserve">Files modified</w:t>
+      </w:r>
+    </w:p>
+    <w:p>
+      <w:r>
+        <w:t xml:space="preserve">Begin Module 3 — Invoice PDF generation from a closed repair order.</w:t>
+      </w:r>
+    </w:p>
+    <w:p>
+      <w:r>
+        <w:t xml:space="preserve">Next session</w:t>
       </w:r>
     </w:p>
     <w:p>

</xml_diff>

<commit_message>
v0.6.0 Full Bay — Module 1 complete: status filters, edit RO, technicians
- RO list status filter pill bar (All / Open / In Progress / Completed / Closed)
- Edit RO form — edit internal note from ACTIONS on non-closed ROs
- Technicians table (schema v14) with list, add/edit/delete screens
- Assign technician to RO via bottom sheet picker; shown in RO header
- Technicians row added to Repair Orders hub screen
- Module 1 all tasks complete

Co-Authored-By: Claude Sonnet 4.6 <noreply@anthropic.com>
</commit_message>
<xml_diff>
--- a/docs/AutoShopPro_Build_Log.docx
+++ b/docs/AutoShopPro_Build_Log.docx
@@ -1710,6 +1710,244 @@
       </w:pPr>
       <w:r>
         <w:t xml:space="preserve">Build Sessions</w:t>
+      </w:r>
+    </w:p>
+    <w:p>
+      <w:r>
+        <w:t xml:space="preserve"/>
+      </w:r>
+    </w:p>
+    <w:p>
+      <w:pPr>
+        <w:pStyle w:val="Heading2"/>
+      </w:pPr>
+      <w:r>
+        <w:t xml:space="preserve">Session 7 — v0.6.0 Full Bay</w:t>
+      </w:r>
+    </w:p>
+    <w:p>
+      <w:r>
+        <w:t xml:space="preserve">Date: March 22, 2026</w:t>
+      </w:r>
+    </w:p>
+    <w:p>
+      <w:r>
+        <w:t xml:space="preserve">Version: v0.6.0 Full Bay</w:t>
+      </w:r>
+    </w:p>
+    <w:p>
+      <w:r>
+        <w:t xml:space="preserve">Session: 7</w:t>
+      </w:r>
+    </w:p>
+    <w:p>
+      <w:pPr>
+        <w:pStyle w:val="ListBullet"/>
+      </w:pPr>
+      <w:r>
+        <w:t xml:space="preserve">Module 1 complete — all planned features shipped</w:t>
+      </w:r>
+    </w:p>
+    <w:p>
+      <w:pPr>
+        <w:pStyle w:val="ListBullet"/>
+      </w:pPr>
+      <w:r>
+        <w:t xml:space="preserve">getRepairOrder() one-time fetch query added to database</w:t>
+      </w:r>
+    </w:p>
+    <w:p>
+      <w:pPr>
+        <w:pStyle w:val="ListBullet"/>
+      </w:pPr>
+      <w:r>
+        <w:t xml:space="preserve">Technicians row added to the Repair Orders hub screen</w:t>
+      </w:r>
+    </w:p>
+    <w:p>
+      <w:pPr>
+        <w:pStyle w:val="ListBullet"/>
+      </w:pPr>
+      <w:r>
+        <w:t xml:space="preserve">Assigned technician shown in RO detail header with wrench icon and specialty</w:t>
+      </w:r>
+    </w:p>
+    <w:p>
+      <w:pPr>
+        <w:pStyle w:val="ListBullet"/>
+      </w:pPr>
+      <w:r>
+        <w:t xml:space="preserve">Assign Technician action on non-closed RO detail — opens bottom sheet picker with current selection checkmark, "+ New Technician" shortcut, and Remove option</w:t>
+      </w:r>
+    </w:p>
+    <w:p>
+      <w:pPr>
+        <w:pStyle w:val="ListBullet"/>
+      </w:pPr>
+      <w:r>
+        <w:t xml:space="preserve">New/edit technician form — name, specialty, phone with formatter; delete with confirmation</w:t>
+      </w:r>
+    </w:p>
+    <w:p>
+      <w:pPr>
+        <w:pStyle w:val="ListBullet"/>
+      </w:pPr>
+      <w:r>
+        <w:t xml:space="preserve">Technician list screen with add button in nav bar, initials avatar, specialty subtitle</w:t>
+      </w:r>
+    </w:p>
+    <w:p>
+      <w:pPr>
+        <w:pStyle w:val="ListBullet"/>
+      </w:pPr>
+      <w:r>
+        <w:t xml:space="preserve">Technicians table added (schema v14) — name, specialty, phone fields</w:t>
+      </w:r>
+    </w:p>
+    <w:p>
+      <w:pPr>
+        <w:pStyle w:val="ListBullet"/>
+      </w:pPr>
+      <w:r>
+        <w:t xml:space="preserve">Edit RO form — edit the internal note on a repair order from the ACTIONS section on any non-closed RO</w:t>
+      </w:r>
+    </w:p>
+    <w:p>
+      <w:pPr>
+        <w:pStyle w:val="ListBullet"/>
+      </w:pPr>
+      <w:r>
+        <w:t xml:space="preserve">RO list status filter pill bar (All / Open / In Progress / Completed / Closed) — filters live as you tap, empty state adapts to active filter</w:t>
+      </w:r>
+    </w:p>
+    <w:p>
+      <w:r>
+        <w:rPr>
+          <w:b/>
+        </w:rPr>
+        <w:t xml:space="preserve">What was built</w:t>
+      </w:r>
+    </w:p>
+    <w:p>
+      <w:pPr>
+        <w:pStyle w:val="ListBullet"/>
+      </w:pPr>
+      <w:r>
+        <w:t xml:space="preserve">Migration blocks used from == N which would skip migrations on devices jumping multiple schema versions — corrected to from &lt; N throughout</w:t>
+      </w:r>
+    </w:p>
+    <w:p>
+      <w:r>
+        <w:rPr>
+          <w:b/>
+        </w:rPr>
+        <w:t xml:space="preserve">Bugs fixed</w:t>
+      </w:r>
+    </w:p>
+    <w:p>
+      <w:pPr>
+        <w:pStyle w:val="ListBullet"/>
+      </w:pPr>
+      <w:r>
+        <w:t xml:space="preserve">lib/features/repair_orders/ro_detail_screen.dart — removed NO PLATE display filter</w:t>
+      </w:r>
+    </w:p>
+    <w:p>
+      <w:pPr>
+        <w:pStyle w:val="ListBullet"/>
+      </w:pPr>
+      <w:r>
+        <w:t xml:space="preserve">lib/features/estimates/estimate_form_screen.dart — removed NO PLATE display filters in picker and selected row</w:t>
+      </w:r>
+    </w:p>
+    <w:p>
+      <w:pPr>
+        <w:pStyle w:val="ListBullet"/>
+      </w:pPr>
+      <w:r>
+        <w:t xml:space="preserve">lib/features/estimates/estimate_detail_screen.dart — removed NO PLATE display filter; plate shown as-is</w:t>
+      </w:r>
+    </w:p>
+    <w:p>
+      <w:pPr>
+        <w:pStyle w:val="ListBullet"/>
+      </w:pPr>
+      <w:r>
+        <w:t xml:space="preserve">lib/features/vehicles/vehicle_form_screen.dart — NO PLATE stored when plate field is empty</w:t>
+      </w:r>
+    </w:p>
+    <w:p>
+      <w:pPr>
+        <w:pStyle w:val="ListBullet"/>
+      </w:pPr>
+      <w:r>
+        <w:t xml:space="preserve">lib/features/customers/customer_detail_screen.dart — internal note shown in CONTACT section</w:t>
+      </w:r>
+    </w:p>
+    <w:p>
+      <w:pPr>
+        <w:pStyle w:val="ListBullet"/>
+      </w:pPr>
+      <w:r>
+        <w:t xml:space="preserve">lib/features/customers/customer_form_screen.dart — internal note field added</w:t>
+      </w:r>
+    </w:p>
+    <w:p>
+      <w:pPr>
+        <w:pStyle w:val="ListBullet"/>
+      </w:pPr>
+      <w:r>
+        <w:t xml:space="preserve">lib/features/repair_orders/ro_detail_screen.dart — declined items filtered out; mark-done checkmark toggle; Edit Estimate action row; customer complaint in header</w:t>
+      </w:r>
+    </w:p>
+    <w:p>
+      <w:pPr>
+        <w:pStyle w:val="ListBullet"/>
+      </w:pPr>
+      <w:r>
+        <w:t xml:space="preserve">lib/features/estimates/estimate_detail_screen.dart — approval badge on each row; action sheet to approve/decline/reset; declined items styled with strikethrough; totals footnote for declined; declinedTotal excluded from subtotal</w:t>
+      </w:r>
+    </w:p>
+    <w:p>
+      <w:pPr>
+        <w:pStyle w:val="ListBullet"/>
+      </w:pPr>
+      <w:r>
+        <w:t xml:space="preserve">lib/features/estimates/estimate_form_screen.dart — customer complaint field; internal note field; _PickerSheet updated with createNew and sublabel support; vehicle picker shows plate</w:t>
+      </w:r>
+    </w:p>
+    <w:p>
+      <w:pPr>
+        <w:pStyle w:val="ListBullet"/>
+      </w:pPr>
+      <w:r>
+        <w:t xml:space="preserve">lib/features/estimates/line_item_form_screen.dart — unit cost + markup % / $ / list fields with auto-sync; labor picker row; vendorSheet with + Add Vendor</w:t>
+      </w:r>
+    </w:p>
+    <w:p>
+      <w:pPr>
+        <w:pStyle w:val="ListBullet"/>
+      </w:pPr>
+      <w:r>
+        <w:t xml:space="preserve">lib/database/database.dart — added unitCost, parentLaborId (v10), customerComplaint (v11), internalNote, isDone (v12), approvalStatus (v13); bumped schemaVersion to 13; fixed all migration blocks to from &lt; N</w:t>
+      </w:r>
+    </w:p>
+    <w:p>
+      <w:r>
+        <w:rPr>
+          <w:b/>
+        </w:rPr>
+        <w:t xml:space="preserve">Files modified</w:t>
+      </w:r>
+    </w:p>
+    <w:p>
+      <w:r>
+        <w:t xml:space="preserve">Begin Module 3 — Invoice PDF generation from a closed repair order.</w:t>
+      </w:r>
+    </w:p>
+    <w:p>
+      <w:r>
+        <w:t xml:space="preserve">Next session</w:t>
       </w:r>
     </w:p>
     <w:p>

</xml_diff>

<commit_message>
v0.7.0 Parts Counter — Module 2 Phase 1: inventory, markup rules, settings screen
- Parts inventory: list with stock badges, add/edit/delete form (schema v15)
- Catalog picker on Add Part: auto-fills description, cost, sell price
- Stock deduction on RO mark-done; restore on uncheck (schema v16)
- Tiered markup rules: auto-apply on cost entry, add/edit/delete (schema v17)
- Settings screen: shop info, default labor rate, tax rate, markup rules
- Default tax rate applied to new estimates automatically
- Cmd+, and sidebar gear icon navigate to Settings screen
- Select-all on tap for pre-populated numeric fields
- Fixed: StreamProvider empty on first picker tap (ref.watch in build)
- Fixed: search bar clipped behind nav bar (SafeArea wrapping)

Co-Authored-By: Claude Sonnet 4.6 <noreply@anthropic.com>
</commit_message>
<xml_diff>
--- a/docs/AutoShopPro_Build_Log.docx
+++ b/docs/AutoShopPro_Build_Log.docx
@@ -1710,6 +1710,268 @@
       </w:pPr>
       <w:r>
         <w:t xml:space="preserve">Build Sessions</w:t>
+      </w:r>
+    </w:p>
+    <w:p>
+      <w:r>
+        <w:t xml:space="preserve"/>
+      </w:r>
+    </w:p>
+    <w:p>
+      <w:pPr>
+        <w:pStyle w:val="Heading2"/>
+      </w:pPr>
+      <w:r>
+        <w:t xml:space="preserve">Session 8 — v0.7.0 Parts Counter</w:t>
+      </w:r>
+    </w:p>
+    <w:p>
+      <w:r>
+        <w:t xml:space="preserve">Date: March 22, 2026</w:t>
+      </w:r>
+    </w:p>
+    <w:p>
+      <w:r>
+        <w:t xml:space="preserve">Version: v0.7.0 Parts Counter</w:t>
+      </w:r>
+    </w:p>
+    <w:p>
+      <w:r>
+        <w:t xml:space="preserve">Session: 8</w:t>
+      </w:r>
+    </w:p>
+    <w:p>
+      <w:pPr>
+        <w:pStyle w:val="ListBullet"/>
+      </w:pPr>
+      <w:r>
+        <w:t xml:space="preserve">Removed old settings dialog in favor of full settings screen navigation</w:t>
+      </w:r>
+    </w:p>
+    <w:p>
+      <w:pPr>
+        <w:pStyle w:val="ListBullet"/>
+      </w:pPr>
+      <w:r>
+        <w:t xml:space="preserve">Select-all on tap for pre-populated numeric fields (stock qty, low stock threshold, line item qty)</w:t>
+      </w:r>
+    </w:p>
+    <w:p>
+      <w:pPr>
+        <w:pStyle w:val="ListBullet"/>
+      </w:pPr>
+      <w:r>
+        <w:t xml:space="preserve">Default tax rate applied to new estimates automatically on creation</w:t>
+      </w:r>
+    </w:p>
+    <w:p>
+      <w:pPr>
+        <w:pStyle w:val="ListBullet"/>
+      </w:pPr>
+      <w:r>
+        <w:t xml:space="preserve">Markup Rules — tiered cost-range matrix; add, edit (tap row), and delete (swipe) rules; auto-applies matching tier markup % when cost is typed on Add Part form (schema v17)</w:t>
+      </w:r>
+    </w:p>
+    <w:p>
+      <w:pPr>
+        <w:pStyle w:val="ListBullet"/>
+      </w:pPr>
+      <w:r>
+        <w:t xml:space="preserve">Settings: Shop Info (shop name), Labor (default labor rate), Tax (default tax rate), Parts Markup Rules sections</w:t>
+      </w:r>
+    </w:p>
+    <w:p>
+      <w:pPr>
+        <w:pStyle w:val="ListBullet"/>
+      </w:pPr>
+      <w:r>
+        <w:t xml:space="preserve">Settings screen — dedicated full screen at /settings, accessible from sidebar gear icon (bottom) and Cmd+, menu bar shortcut</w:t>
+      </w:r>
+    </w:p>
+    <w:p>
+      <w:pPr>
+        <w:pStyle w:val="ListBullet"/>
+      </w:pPr>
+      <w:r>
+        <w:t xml:space="preserve">Stock deduction on RO mark-done — checking off a parts line item on an RO deducts qty from inventory; unchecking restores it (schema v16 adds inventoryPartId to estimate_line_items)</w:t>
+      </w:r>
+    </w:p>
+    <w:p>
+      <w:pPr>
+        <w:pStyle w:val="ListBullet"/>
+      </w:pPr>
+      <w:r>
+        <w:t xml:space="preserve">Catalog picker on Add Part form — pick a part from inventory to auto-fill description, cost, and sell price; markup sync runs automatically after</w:t>
+      </w:r>
+    </w:p>
+    <w:p>
+      <w:pPr>
+        <w:pStyle w:val="ListBullet"/>
+      </w:pPr>
+      <w:r>
+        <w:t xml:space="preserve">Parts Inventory — list screen with searchable parts, color-coded stock badges (In Stock / Low Stock / Out of Stock), add/edit/delete form with part number, cost, sell price, stock qty, and low stock threshold (schema v15)</w:t>
+      </w:r>
+    </w:p>
+    <w:p>
+      <w:r>
+        <w:rPr>
+          <w:b/>
+        </w:rPr>
+        <w:t xml:space="preserve">What was built</w:t>
+      </w:r>
+    </w:p>
+    <w:p>
+      <w:pPr>
+        <w:pStyle w:val="ListBullet"/>
+      </w:pPr>
+      <w:r>
+        <w:t xml:space="preserve">Stock deduction was incorrectly placed at estimate save time — moved to RO mark-done toggle for accurate real-world tracking</w:t>
+      </w:r>
+    </w:p>
+    <w:p>
+      <w:pPr>
+        <w:pStyle w:val="ListBullet"/>
+      </w:pPr>
+      <w:r>
+        <w:t xml:space="preserve">Parts Inventory search bar clipped behind nav bar — fixed by wrapping CustomScrollView in SafeArea</w:t>
+      </w:r>
+    </w:p>
+    <w:p>
+      <w:pPr>
+        <w:pStyle w:val="ListBullet"/>
+      </w:pPr>
+      <w:r>
+        <w:t xml:space="preserve">StreamProvider data empty on first picker tap — fixed by ref.watch()-ing all picker providers in build() so streams are active before user taps</w:t>
+      </w:r>
+    </w:p>
+    <w:p>
+      <w:r>
+        <w:rPr>
+          <w:b/>
+        </w:rPr>
+        <w:t xml:space="preserve">Bugs fixed</w:t>
+      </w:r>
+    </w:p>
+    <w:p>
+      <w:pPr>
+        <w:pStyle w:val="ListBullet"/>
+      </w:pPr>
+      <w:r>
+        <w:t xml:space="preserve">lib/features/settings/markup_rules_provider.dart</w:t>
+      </w:r>
+    </w:p>
+    <w:p>
+      <w:pPr>
+        <w:pStyle w:val="ListBullet"/>
+      </w:pPr>
+      <w:r>
+        <w:t xml:space="preserve">lib/features/settings/settings_screen.dart</w:t>
+      </w:r>
+    </w:p>
+    <w:p>
+      <w:pPr>
+        <w:pStyle w:val="ListBullet"/>
+      </w:pPr>
+      <w:r>
+        <w:t xml:space="preserve">lib/features/inventory/part_form_screen.dart</w:t>
+      </w:r>
+    </w:p>
+    <w:p>
+      <w:pPr>
+        <w:pStyle w:val="ListBullet"/>
+      </w:pPr>
+      <w:r>
+        <w:t xml:space="preserve">lib/features/inventory/part_list_screen.dart</w:t>
+      </w:r>
+    </w:p>
+    <w:p>
+      <w:pPr>
+        <w:pStyle w:val="ListBullet"/>
+      </w:pPr>
+      <w:r>
+        <w:t xml:space="preserve">lib/features/inventory/inventory_provider.dart</w:t>
+      </w:r>
+    </w:p>
+    <w:p>
+      <w:r>
+        <w:rPr>
+          <w:b/>
+        </w:rPr>
+        <w:t xml:space="preserve">Files added</w:t>
+      </w:r>
+    </w:p>
+    <w:p>
+      <w:pPr>
+        <w:pStyle w:val="ListBullet"/>
+      </w:pPr>
+      <w:r>
+        <w:t xml:space="preserve">lib/router.dart — /settings route added; /parts/:partId/edit route added</w:t>
+      </w:r>
+    </w:p>
+    <w:p>
+      <w:pPr>
+        <w:pStyle w:val="ListBullet"/>
+      </w:pPr>
+      <w:r>
+        <w:t xml:space="preserve">lib/main.dart — removed old settings dialog; Cmd+, navigates to /settings; sidebar gear icon at bottom; Settings highlighted when active</w:t>
+      </w:r>
+    </w:p>
+    <w:p>
+      <w:pPr>
+        <w:pStyle w:val="ListBullet"/>
+      </w:pPr>
+      <w:r>
+        <w:t xml:space="preserve">lib/features/repair_orders/ro_detail_screen.dart — _toggleDone deducts/restores inventory stock for catalog-linked parts</w:t>
+      </w:r>
+    </w:p>
+    <w:p>
+      <w:pPr>
+        <w:pStyle w:val="ListBullet"/>
+      </w:pPr>
+      <w:r>
+        <w:t xml:space="preserve">lib/features/estimates/estimate_form_screen.dart — reads defaultTaxRate from settings on estimate creation</w:t>
+      </w:r>
+    </w:p>
+    <w:p>
+      <w:pPr>
+        <w:pStyle w:val="ListBullet"/>
+      </w:pPr>
+      <w:r>
+        <w:t xml:space="preserve">lib/features/estimates/estimate_detail_screen.dart — stock-aware delete removed (stock tracks on RO mark-done instead)</w:t>
+      </w:r>
+    </w:p>
+    <w:p>
+      <w:pPr>
+        <w:pStyle w:val="ListBullet"/>
+      </w:pPr>
+      <w:r>
+        <w:t xml:space="preserve">lib/features/estimates/line_item_form_screen.dart — catalog picker row + sheet; markup tier auto-apply on cost change; ref.watch for vendors/inventory/markup providers</w:t>
+      </w:r>
+    </w:p>
+    <w:p>
+      <w:pPr>
+        <w:pStyle w:val="ListBullet"/>
+      </w:pPr>
+      <w:r>
+        <w:t xml:space="preserve">lib/database/database.dart — added InventoryParts table (v15), inventoryPartId on line items (v16), MarkupRules table + shopName + defaultTaxRate on ShopSettings (v17); schema v17</w:t>
+      </w:r>
+    </w:p>
+    <w:p>
+      <w:r>
+        <w:rPr>
+          <w:b/>
+        </w:rPr>
+        <w:t xml:space="preserve">Files modified</w:t>
+      </w:r>
+    </w:p>
+    <w:p>
+      <w:r>
+        <w:t xml:space="preserve">Begin Module 3 — Invoice PDF generation from a closed repair order.</w:t>
+      </w:r>
+    </w:p>
+    <w:p>
+      <w:r>
+        <w:t xml:space="preserve">Next session</w:t>
       </w:r>
     </w:p>
     <w:p>

</xml_diff>

<commit_message>
v0.7.1 Smooth Operator — inline search in pickers, service templates, global search, default approve, line item chevrons + right-click
Co-Authored-By: Claude Sonnet 4.6 <noreply@anthropic.com>
</commit_message>
<xml_diff>
--- a/docs/AutoShopPro_Build_Log.docx
+++ b/docs/AutoShopPro_Build_Log.docx
@@ -1710,6 +1710,220 @@
       </w:pPr>
       <w:r>
         <w:t xml:space="preserve">Build Sessions</w:t>
+      </w:r>
+    </w:p>
+    <w:p>
+      <w:r>
+        <w:t xml:space="preserve"/>
+      </w:r>
+    </w:p>
+    <w:p>
+      <w:pPr>
+        <w:pStyle w:val="Heading2"/>
+      </w:pPr>
+      <w:r>
+        <w:t xml:space="preserve">Session 9 — v0.7.1 Smooth Operator</w:t>
+      </w:r>
+    </w:p>
+    <w:p>
+      <w:r>
+        <w:t xml:space="preserve">Date: March 22, 2026</w:t>
+      </w:r>
+    </w:p>
+    <w:p>
+      <w:r>
+        <w:t xml:space="preserve">Version: v0.7.1 Smooth Operator</w:t>
+      </w:r>
+    </w:p>
+    <w:p>
+      <w:r>
+        <w:t xml:space="preserve">Session: 9</w:t>
+      </w:r>
+    </w:p>
+    <w:p>
+      <w:pPr>
+        <w:pStyle w:val="ListBullet"/>
+      </w:pPr>
+      <w:r>
+        <w:t xml:space="preserve">Global search screen — Search in sidebar + Cmd+F shortcut; searches customers, vehicles, estimates, and ROs simultaneously; results grouped by section; tap any result to navigate directly to it</w:t>
+      </w:r>
+    </w:p>
+    <w:p>
+      <w:pPr>
+        <w:pStyle w:val="ListBullet"/>
+      </w:pPr>
+      <w:r>
+        <w:t xml:space="preserve">Rate/hr placeholder on template form shows the actual shop default dollar value (e.g. 120.00) loaded from settings</w:t>
+      </w:r>
+    </w:p>
+    <w:p>
+      <w:pPr>
+        <w:pStyle w:val="ListBullet"/>
+      </w:pPr>
+      <w:r>
+        <w:t xml:space="preserve">Apply Template action on estimates — "Apply Template" row under ADD ITEMS opens a searchable template picker; selecting one instantly adds a pre-filled approved labor line using the template rate or the shop default</w:t>
+      </w:r>
+    </w:p>
+    <w:p>
+      <w:pPr>
+        <w:pStyle w:val="ListBullet"/>
+      </w:pPr>
+      <w:r>
+        <w:t xml:space="preserve">Service Templates (schema v18) — new ServiceTemplates table; manage templates at Settings → Service Templates; each template stores a name, labor description, default hours, and optional rate override</w:t>
+      </w:r>
+    </w:p>
+    <w:p>
+      <w:pPr>
+        <w:pStyle w:val="ListBullet"/>
+      </w:pPr>
+      <w:r>
+        <w:t xml:space="preserve">Inline search in all picker sheets — customer, vehicle, vendor, labor, technician, and template pickers autofocus a search field on open; list filters as you type; "No results" message when nothing matches</w:t>
+      </w:r>
+    </w:p>
+    <w:p>
+      <w:pPr>
+        <w:pStyle w:val="ListBullet"/>
+      </w:pPr>
+      <w:r>
+        <w:t xml:space="preserve">Chevron + right-click on estimate line items — gray chevron on every row makes edit affordance obvious; right-click shows Edit / Delete context menu</w:t>
+      </w:r>
+    </w:p>
+    <w:p>
+      <w:pPr>
+        <w:pStyle w:val="ListBullet"/>
+      </w:pPr>
+      <w:r>
+        <w:t xml:space="preserve">Default approve — new line items now save as approved automatically; no more tapping each item to approve it</w:t>
+      </w:r>
+    </w:p>
+    <w:p>
+      <w:r>
+        <w:rPr>
+          <w:b/>
+        </w:rPr>
+        <w:t xml:space="preserve">What was built</w:t>
+      </w:r>
+    </w:p>
+    <w:p>
+      <w:pPr>
+        <w:pStyle w:val="ListBullet"/>
+      </w:pPr>
+      <w:r>
+        <w:t xml:space="preserve">lib/features/search/search_screen.dart</w:t>
+      </w:r>
+    </w:p>
+    <w:p>
+      <w:pPr>
+        <w:pStyle w:val="ListBullet"/>
+      </w:pPr>
+      <w:r>
+        <w:t xml:space="preserve">lib/features/service_templates/service_template_form_screen.dart</w:t>
+      </w:r>
+    </w:p>
+    <w:p>
+      <w:pPr>
+        <w:pStyle w:val="ListBullet"/>
+      </w:pPr>
+      <w:r>
+        <w:t xml:space="preserve">lib/features/service_templates/service_template_list_screen.dart</w:t>
+      </w:r>
+    </w:p>
+    <w:p>
+      <w:pPr>
+        <w:pStyle w:val="ListBullet"/>
+      </w:pPr>
+      <w:r>
+        <w:t xml:space="preserve">lib/features/service_templates/service_templates_provider.dart</w:t>
+      </w:r>
+    </w:p>
+    <w:p>
+      <w:r>
+        <w:rPr>
+          <w:b/>
+        </w:rPr>
+        <w:t xml:space="preserve">Files added</w:t>
+      </w:r>
+    </w:p>
+    <w:p>
+      <w:pPr>
+        <w:pStyle w:val="ListBullet"/>
+      </w:pPr>
+      <w:r>
+        <w:t xml:space="preserve">lib/router.dart — /settings/service-templates routes; /search route; _ServiceTemplateEditLoader loader class</w:t>
+      </w:r>
+    </w:p>
+    <w:p>
+      <w:pPr>
+        <w:pStyle w:val="ListBullet"/>
+      </w:pPr>
+      <w:r>
+        <w:t xml:space="preserve">lib/main.dart — Search sidebar item above Settings; Cmd+F shortcut; _openSearch helper; _selectedIndex handles /search route</w:t>
+      </w:r>
+    </w:p>
+    <w:p>
+      <w:pPr>
+        <w:pStyle w:val="ListBullet"/>
+      </w:pPr>
+      <w:r>
+        <w:t xml:space="preserve">lib/features/settings/settings_screen.dart — Service Templates navigation row added; go_router import added</w:t>
+      </w:r>
+    </w:p>
+    <w:p>
+      <w:pPr>
+        <w:pStyle w:val="ListBullet"/>
+      </w:pPr>
+      <w:r>
+        <w:t xml:space="preserve">lib/features/repair_orders/ro_detail_screen.dart — _TechPickerSheet converted to StatefulWidget with inline search</w:t>
+      </w:r>
+    </w:p>
+    <w:p>
+      <w:pPr>
+        <w:pStyle w:val="ListBullet"/>
+      </w:pPr>
+      <w:r>
+        <w:t xml:space="preserve">lib/features/estimates/estimate_form_screen.dart — _PickerSheet converted to StatefulWidget with inline CupertinoSearchTextField</w:t>
+      </w:r>
+    </w:p>
+    <w:p>
+      <w:pPr>
+        <w:pStyle w:val="ListBullet"/>
+      </w:pPr>
+      <w:r>
+        <w:t xml:space="preserve">lib/features/estimates/estimate_detail_screen.dart — chevron on line item rows; onSecondaryTapUp right-click context menu; _applyTemplate method; Apply Template action row; _TemplatePickerSheet widget</w:t>
+      </w:r>
+    </w:p>
+    <w:p>
+      <w:pPr>
+        <w:pStyle w:val="ListBullet"/>
+      </w:pPr>
+      <w:r>
+        <w:t xml:space="preserve">lib/features/estimates/line_item_form_screen.dart — approvalStatus defaults to approved on insert; _VendorPickerSheet and _LaborPickerSheet converted to StatefulWidget with inline search</w:t>
+      </w:r>
+    </w:p>
+    <w:p>
+      <w:pPr>
+        <w:pStyle w:val="ListBullet"/>
+      </w:pPr>
+      <w:r>
+        <w:t xml:space="preserve">lib/database/database.dart — added ServiceTemplates table (schema v18); searchCustomers, searchVehicles, searchEstimates, searchRepairOrders methods; ServiceTemplates CRUD queries</w:t>
+      </w:r>
+    </w:p>
+    <w:p>
+      <w:r>
+        <w:rPr>
+          <w:b/>
+        </w:rPr>
+        <w:t xml:space="preserve">Files modified</w:t>
+      </w:r>
+    </w:p>
+    <w:p>
+      <w:r>
+        <w:t xml:space="preserve">Begin Module 3 — Invoice PDF generation from a closed repair order.</w:t>
+      </w:r>
+    </w:p>
+    <w:p>
+      <w:r>
+        <w:t xml:space="preserve">Next session</w:t>
       </w:r>
     </w:p>
     <w:p>

</xml_diff>

<commit_message>
v0.8.0 Linked Up — template linked parts, inventory markup, labor names, polish
- Service Templates: link inventory parts with qty; Apply Template inserts labor
  + all linked parts as grouped line items in one tap
- Inventory part form: Cost | Markup % | Sell Price inline row with auto-tier
  rules from Settings and bidirectional sync
- Part categories: Part / Fluid / Filter / Chemical picker + blue badge on list
- Labor name shown as bold title in estimate/RO detail and invoice PDFs;
  description as subtitle
- Hours × rate = total live calc on template form and line item form (all editable)
- Select-all on tap for all number fields app-wide
- Smart money formatting: UI omits .00 cents; invoice PDFs keep 2 decimal places
- Database schema v20: category on inventory_parts, service_template_parts table

Co-Authored-By: Claude Sonnet 4.6 <noreply@anthropic.com>
</commit_message>
<xml_diff>
--- a/docs/AutoShopPro_Build_Log.docx
+++ b/docs/AutoShopPro_Build_Log.docx
@@ -1710,6 +1710,220 @@
       </w:pPr>
       <w:r>
         <w:t xml:space="preserve">Build Sessions</w:t>
+      </w:r>
+    </w:p>
+    <w:p>
+      <w:r>
+        <w:t xml:space="preserve"/>
+      </w:r>
+    </w:p>
+    <w:p>
+      <w:pPr>
+        <w:pStyle w:val="Heading2"/>
+      </w:pPr>
+      <w:r>
+        <w:t xml:space="preserve">Session 10 — v0.8.0 Linked Up</w:t>
+      </w:r>
+    </w:p>
+    <w:p>
+      <w:r>
+        <w:t xml:space="preserve">Date: March 22, 2026</w:t>
+      </w:r>
+    </w:p>
+    <w:p>
+      <w:r>
+        <w:t xml:space="preserve">Version: v0.8.0 Linked Up</w:t>
+      </w:r>
+    </w:p>
+    <w:p>
+      <w:r>
+        <w:t xml:space="preserve">Session: 10</w:t>
+      </w:r>
+    </w:p>
+    <w:p>
+      <w:pPr>
+        <w:pStyle w:val="ListBullet"/>
+      </w:pPr>
+      <w:r>
+        <w:t xml:space="preserve">Apply Template inserts linked parts — when a template is applied to an estimate, the labor line is inserted first, then all linked inventory parts are inserted as part line items grouped under it with current cost/sell price from inventory</w:t>
+      </w:r>
+    </w:p>
+    <w:p>
+      <w:pPr>
+        <w:pStyle w:val="ListBullet"/>
+      </w:pPr>
+      <w:r>
+        <w:t xml:space="preserve">Service Template linked parts (schema v20) — template form has a full LINKED PARTS section; add inventory parts with a quantity; searchable picker filters already-linked parts; save replaces all links; editing a template reloads existing links</w:t>
+      </w:r>
+    </w:p>
+    <w:p>
+      <w:pPr>
+        <w:pStyle w:val="ListBullet"/>
+      </w:pPr>
+      <w:r>
+        <w:t xml:space="preserve">Markup on inventory part form — replaced separate Cost and Sell Price fields with an inline Cost | Markup % | Sell Price row; markup tier from Settings auto-applies when cost is typed; editing Sell Price back-calculates Markup %</w:t>
+      </w:r>
+    </w:p>
+    <w:p>
+      <w:pPr>
+        <w:pStyle w:val="ListBullet"/>
+      </w:pPr>
+      <w:r>
+        <w:t xml:space="preserve">Part categories — inventory parts now have a category field (Part / Fluid / Filter / Chemical); action sheet picker on the form; blue badge shown on list rows for non-Part categories</w:t>
+      </w:r>
+    </w:p>
+    <w:p>
+      <w:pPr>
+        <w:pStyle w:val="ListBullet"/>
+      </w:pPr>
+      <w:r>
+        <w:t xml:space="preserve">Smart money formatting — UI screens omit .00 cents (e.g. $90 not $90.00) but preserve real cents (e.g. $13.50); invoice PDFs always show two decimal places as official documents</w:t>
+      </w:r>
+    </w:p>
+    <w:p>
+      <w:pPr>
+        <w:pStyle w:val="ListBullet"/>
+      </w:pPr>
+      <w:r>
+        <w:t xml:space="preserve">Select-all on tap — tapping any number text field now selects all existing text so you can type a new value without deleting manually; applied consistently across all forms app-wide</w:t>
+      </w:r>
+    </w:p>
+    <w:p>
+      <w:pPr>
+        <w:pStyle w:val="ListBullet"/>
+      </w:pPr>
+      <w:r>
+        <w:t xml:space="preserve">Hours × rate = total live calc — service template form and line item form both have Cost | Markup or Hours | Rate | Total rows where all three fields are editable; changing any field recalculates the others with bidirectional sync</w:t>
+      </w:r>
+    </w:p>
+    <w:p>
+      <w:pPr>
+        <w:pStyle w:val="ListBullet"/>
+      </w:pPr>
+      <w:r>
+        <w:t xml:space="preserve">Labor name as title — labor lines in estimate detail, RO detail, and invoice PDFs now show the template name (e.g. "Oil Change") as a bold title with the detailed description as a smaller subtitle below</w:t>
+      </w:r>
+    </w:p>
+    <w:p>
+      <w:r>
+        <w:rPr>
+          <w:b/>
+        </w:rPr>
+        <w:t xml:space="preserve">What was built</w:t>
+      </w:r>
+    </w:p>
+    <w:p>
+      <w:pPr>
+        <w:pStyle w:val="ListBullet"/>
+      </w:pPr>
+      <w:r>
+        <w:t xml:space="preserve">lib/features/vehicles/vehicle_form_screen.dart — select-all onTap + contextMenuBuilder on all fields</w:t>
+      </w:r>
+    </w:p>
+    <w:p>
+      <w:pPr>
+        <w:pStyle w:val="ListBullet"/>
+      </w:pPr>
+      <w:r>
+        <w:t xml:space="preserve">lib/features/settings/settings_screen.dart — select-all onTap on markup rule dialog fields; placeholder cleanup</w:t>
+      </w:r>
+    </w:p>
+    <w:p>
+      <w:pPr>
+        <w:pStyle w:val="ListBullet"/>
+      </w:pPr>
+      <w:r>
+        <w:t xml:space="preserve">lib/features/estimates/line_item_form_screen.dart — _laborTotal controller with bidirectional hours×rate sync; select-all onTap on markup fields; placeholder cleanup</w:t>
+      </w:r>
+    </w:p>
+    <w:p>
+      <w:pPr>
+        <w:pStyle w:val="ListBullet"/>
+      </w:pPr>
+      <w:r>
+        <w:t xml:space="preserve">lib/features/invoices/invoice_service.dart — _lineRow optional subtitle param; labor rows pass laborName as title + description as subtitle; simple invoice renderer also updated</w:t>
+      </w:r>
+    </w:p>
+    <w:p>
+      <w:pPr>
+        <w:pStyle w:val="ListBullet"/>
+      </w:pPr>
+      <w:r>
+        <w:t xml:space="preserve">lib/features/repair_orders/ro_detail_screen.dart — same _LineItemRow laborName display + smart _money() helper</w:t>
+      </w:r>
+    </w:p>
+    <w:p>
+      <w:pPr>
+        <w:pStyle w:val="ListBullet"/>
+      </w:pPr>
+      <w:r>
+        <w:t xml:space="preserve">lib/features/estimates/estimate_detail_screen.dart — _LineItemRow shows laborName as bold title + description as subtitle; smart _money() helper</w:t>
+      </w:r>
+    </w:p>
+    <w:p>
+      <w:pPr>
+        <w:pStyle w:val="ListBullet"/>
+      </w:pPr>
+      <w:r>
+        <w:t xml:space="preserve">lib/features/estimates/estimate_detail_screen.dart — _applyTemplate now passes laborName, captures labor line id, fetches and inserts linked template parts</w:t>
+      </w:r>
+    </w:p>
+    <w:p>
+      <w:pPr>
+        <w:pStyle w:val="ListBullet"/>
+      </w:pPr>
+      <w:r>
+        <w:t xml:space="preserve">lib/features/service_templates/service_template_form_screen.dart — _total controller with bidirectional hours×rate sync; full LINKED PARTS section with _PartPickerSheet, qty dialog, _LinkedPartRow; save/load linked parts logic</w:t>
+      </w:r>
+    </w:p>
+    <w:p>
+      <w:pPr>
+        <w:pStyle w:val="ListBullet"/>
+      </w:pPr>
+      <w:r>
+        <w:t xml:space="preserve">lib/features/inventory/part_list_screen.dart — blue category badge on list rows; smart sell price formatting</w:t>
+      </w:r>
+    </w:p>
+    <w:p>
+      <w:pPr>
+        <w:pStyle w:val="ListBullet"/>
+      </w:pPr>
+      <w:r>
+        <w:t xml:space="preserve">lib/features/inventory/part_form_screen.dart — added _markupPercentCtrl; _applyMarkupTier, _recalcSellPrice, _onSellPriceChanged; _markupRow inline Cost|Markup%|Sell Price widget; _loadDefaultMarkup; category picker</w:t>
+      </w:r>
+    </w:p>
+    <w:p>
+      <w:pPr>
+        <w:pStyle w:val="ListBullet"/>
+      </w:pPr>
+      <w:r>
+        <w:t xml:space="preserve">lib/database/database.g.dart — regenerated via build_runner</w:t>
+      </w:r>
+    </w:p>
+    <w:p>
+      <w:pPr>
+        <w:pStyle w:val="ListBullet"/>
+      </w:pPr>
+      <w:r>
+        <w:t xml:space="preserve">lib/database/database.dart — added category column to InventoryParts; added ServiceTemplateParts table (schema v20); migration v20; watchTemplatePartsForTemplate, getTemplatePartsForTemplate, insertTemplatePart, deleteTemplatePart, deleteAllTemplatePartsForTemplate</w:t>
+      </w:r>
+    </w:p>
+    <w:p>
+      <w:r>
+        <w:rPr>
+          <w:b/>
+        </w:rPr>
+        <w:t xml:space="preserve">Files modified</w:t>
+      </w:r>
+    </w:p>
+    <w:p>
+      <w:r>
+        <w:t xml:space="preserve">Begin Module 3 — Invoice PDF generation from a closed repair order.</w:t>
+      </w:r>
+    </w:p>
+    <w:p>
+      <w:r>
+        <w:t xml:space="preserve">Next session</w:t>
       </w:r>
     </w:p>
     <w:p>

</xml_diff>

<commit_message>
Fix version history: add v0.7.0 to README, rename v0.3.0 Estimate → Write-Up
- README.md: added missing v0.7.0 Parts Counter entry
- README.md: fixed v0.4.0 description (removed duplicate "Module 1 complete" label)
- AutoShopPro_Build_Log.docx: renamed all 6 occurrences of v0.3.0 Estimate → v0.3.0 Write-Up

Co-Authored-By: Claude Sonnet 4.6 <noreply@anthropic.com>
</commit_message>
<xml_diff>
--- a/docs/AutoShopPro_Build_Log.docx
+++ b/docs/AutoShopPro_Build_Log.docx
@@ -3205,7 +3205,7 @@
         <w:pStyle w:val="ListBullet"/>
       </w:pPr>
       <w:r>
-        <w:t xml:space="preserve">Version renamed from v0.3.0 Estimate → v0.3.0 Write-Up across all docs</w:t>
+        <w:t>Version renamed from v0.3.0 Write-Up → v0.3.0 Write-Up across all docs</w:t>
       </w:r>
     </w:p>
     <w:p>
@@ -3428,7 +3428,7 @@
         <w:pStyle w:val="Heading2"/>
       </w:pPr>
       <w:r>
-        <w:t xml:space="preserve">Session 4 (continued) — v0.3.0 Estimate</w:t>
+        <w:t>Session 4 (continued) — v0.3.0 Write-Up</w:t>
       </w:r>
     </w:p>
     <w:p>
@@ -3438,7 +3438,7 @@
     </w:p>
     <w:p>
       <w:r>
-        <w:t xml:space="preserve">Version: v0.3.0 Estimate</w:t>
+        <w:t>Version: v0.3.0 Write-Up</w:t>
       </w:r>
     </w:p>
     <w:p>
@@ -3451,7 +3451,7 @@
         <w:pStyle w:val="ListBullet"/>
       </w:pPr>
       <w:r>
-        <w:t xml:space="preserve">module_plan.md and README.md updated to reflect v0.3.0 Estimate</w:t>
+        <w:t>module_plan.md and README.md updated to reflect v0.3.0 Write-Up</w:t>
       </w:r>
     </w:p>
     <w:p>
@@ -3563,7 +3563,7 @@
         <w:pStyle w:val="ListBullet"/>
       </w:pPr>
       <w:r>
-        <w:t xml:space="preserve">README.md — version updated to v0.3.0 Estimate</w:t>
+        <w:t>README.md — version updated to v0.3.0 Write-Up</w:t>
       </w:r>
     </w:p>
     <w:p>
@@ -3709,7 +3709,7 @@
         <w:pStyle w:val="Heading2"/>
       </w:pPr>
       <w:r>
-        <w:t>Session 4 — v0.3.0 Estimate</w:t>
+        <w:t>Session 4 — v0.3.0 Write-Up</w:t>
       </w:r>
     </w:p>
     <w:tbl>

</xml_diff>

<commit_message>
Fix build log: remove duplicate Session 6, rename Session 4a/4b
- Removed duplicate v0.5.0 Sign-Off entry (Session 6 appeared twice)
- Renamed Session 4 split entries to 4a (main build) and 4b (wrap-up)
  so they read as two halves of one session, not a mistake

Co-Authored-By: Claude Sonnet 4.6 <noreply@anthropic.com>
</commit_message>
<xml_diff>
--- a/docs/AutoShopPro_Build_Log.docx
+++ b/docs/AutoShopPro_Build_Log.docx
@@ -2928,7 +2928,7 @@
         <w:pStyle w:val="Heading2"/>
       </w:pPr>
       <w:r>
-        <w:t xml:space="preserve">Session 6 — v0.5.0 Sign-Off</w:t>
+        <w:t xml:space="preserve">Session 5 — v0.4.0 Open Bay</w:t>
       </w:r>
     </w:p>
     <w:p>
@@ -2938,132 +2938,108 @@
     </w:p>
     <w:p>
       <w:r>
-        <w:t xml:space="preserve">Version: v0.5.0 Sign-Off</w:t>
-      </w:r>
-    </w:p>
-    <w:p>
-      <w:r>
-        <w:t xml:space="preserve">Session: 6</w:t>
-      </w:r>
-    </w:p>
-    <w:p>
-      <w:pPr>
-        <w:pStyle w:val="ListBullet"/>
-      </w:pPr>
-      <w:r>
-        <w:t xml:space="preserve">Migration pattern corrected from from == N to from &lt; N with PRAGMA guards to safely handle devices jumping multiple versions</w:t>
-      </w:r>
-    </w:p>
-    <w:p>
-      <w:pPr>
-        <w:pStyle w:val="ListBullet"/>
-      </w:pPr>
-      <w:r>
-        <w:t xml:space="preserve">Totals section shows "X items declined −$Y.YY" footnote in red when items are declined</w:t>
-      </w:r>
-    </w:p>
-    <w:p>
-      <w:pPr>
-        <w:pStyle w:val="ListBullet"/>
-      </w:pPr>
-      <w:r>
-        <w:t xml:space="preserve">Declined items display with strikethrough + gray text on estimate; excluded entirely from repair order</w:t>
-      </w:r>
-    </w:p>
-    <w:p>
-      <w:pPr>
-        <w:pStyle w:val="ListBullet"/>
-      </w:pPr>
-      <w:r>
-        <w:t xml:space="preserve">Partial estimate approval — tap approval circle badge on any line item to approve or decline it (schema v13, approvalStatus column)</w:t>
-      </w:r>
-    </w:p>
-    <w:p>
-      <w:pPr>
-        <w:pStyle w:val="ListBullet"/>
-      </w:pPr>
-      <w:r>
-        <w:t xml:space="preserve">contextMenuBuilder added to all CupertinoTextFields for right-click copy/cut/paste on macOS (standing rule saved to memory)</w:t>
-      </w:r>
-    </w:p>
-    <w:p>
-      <w:pPr>
-        <w:pStyle w:val="ListBullet"/>
-      </w:pPr>
-      <w:r>
-        <w:t xml:space="preserve">"+ New Customer" / "+ New Vehicle" / "+ Add Vendor" rows added to all picker sheets so you can create records without leaving the form</w:t>
-      </w:r>
-    </w:p>
-    <w:p>
-      <w:pPr>
-        <w:pStyle w:val="ListBullet"/>
-      </w:pPr>
-      <w:r>
-        <w:t xml:space="preserve">Edit Estimate link added to non-closed RO detail screens</w:t>
-      </w:r>
-    </w:p>
-    <w:p>
-      <w:pPr>
-        <w:pStyle w:val="ListBullet"/>
-      </w:pPr>
-      <w:r>
-        <w:t xml:space="preserve">Mark items done on repair order — checkmark circle toggle per line item when RO is not closed (schema v12)</w:t>
-      </w:r>
-    </w:p>
-    <w:p>
-      <w:pPr>
-        <w:pStyle w:val="ListBullet"/>
-      </w:pPr>
-      <w:r>
-        <w:t xml:space="preserve">"NO PLATE" stored when plate field is left empty on vehicle save</w:t>
-      </w:r>
-    </w:p>
-    <w:p>
-      <w:pPr>
-        <w:pStyle w:val="ListBullet"/>
-      </w:pPr>
-      <w:r>
-        <w:t xml:space="preserve">License plate shown in vehicle picker dropdown and selected row on estimate form</w:t>
-      </w:r>
-    </w:p>
-    <w:p>
-      <w:pPr>
-        <w:pStyle w:val="ListBullet"/>
-      </w:pPr>
-      <w:r>
-        <w:t xml:space="preserve">Internal note field on customer form — shown on customer detail, auto-populates estimate internal note when customer is picked (schema v12)</w:t>
-      </w:r>
-    </w:p>
-    <w:p>
-      <w:pPr>
-        <w:pStyle w:val="ListBullet"/>
-      </w:pPr>
-      <w:r>
-        <w:t xml:space="preserve">Customer complaint field added to new estimate form and displayed in estimate/RO detail header (schema v11)</w:t>
-      </w:r>
-    </w:p>
-    <w:p>
-      <w:pPr>
-        <w:pStyle w:val="ListBullet"/>
-      </w:pPr>
-      <w:r>
-        <w:t xml:space="preserve">Parts grouped under their linked labor sub-header in estimate detail and RO detail screens</w:t>
-      </w:r>
-    </w:p>
-    <w:p>
-      <w:pPr>
-        <w:pStyle w:val="ListBullet"/>
-      </w:pPr>
-      <w:r>
-        <w:t xml:space="preserve">Parts can be linked to a labor line via a labor picker on the Add Part form (parentLaborId, schema v10)</w:t>
-      </w:r>
-    </w:p>
-    <w:p>
-      <w:pPr>
-        <w:pStyle w:val="ListBullet"/>
-      </w:pPr>
-      <w:r>
-        <w:t xml:space="preserve">Unit cost + markup % / markup $ / unit list price fields on Add Part form — editing markup % auto-updates markup $ and vice versa (schema v10)</w:t>
+        <w:t xml:space="preserve">Version: v0.4.0 Open Bay</w:t>
+      </w:r>
+    </w:p>
+    <w:p>
+      <w:r>
+        <w:t xml:space="preserve">Session: 5</w:t>
+      </w:r>
+    </w:p>
+    <w:p>
+      <w:pPr>
+        <w:pStyle w:val="ListBullet"/>
+      </w:pPr>
+      <w:r>
+        <w:t>Version renamed from v0.3.0 Write-Up → v0.3.0 Write-Up across all docs</w:t>
+      </w:r>
+    </w:p>
+    <w:p>
+      <w:pPr>
+        <w:pStyle w:val="ListBullet"/>
+      </w:pPr>
+      <w:r>
+        <w:t xml:space="preserve">Design rule saved permanently to CLAUDE.md so all future sessions follow it</w:t>
+      </w:r>
+    </w:p>
+    <w:p>
+      <w:pPr>
+        <w:pStyle w:val="ListBullet"/>
+      </w:pPr>
+      <w:r>
+        <w:t xml:space="preserve">Button/action design rule standardized — all actions use list-row style (blue icon + blue label + gray chevron, under small-caps section header)</w:t>
+      </w:r>
+    </w:p>
+    <w:p>
+      <w:pPr>
+        <w:pStyle w:val="ListBullet"/>
+      </w:pPr>
+      <w:r>
+        <w:t xml:space="preserve">Repair Orders hub row enabled — was Coming soon, now navigates to /repair-orders/ros</w:t>
+      </w:r>
+    </w:p>
+    <w:p>
+      <w:pPr>
+        <w:pStyle w:val="ListBullet"/>
+      </w:pPr>
+      <w:r>
+        <w:t xml:space="preserve">View Repair Order link on estimate detail once RO exists (green icon, RO number subtitle)</w:t>
+      </w:r>
+    </w:p>
+    <w:p>
+      <w:pPr>
+        <w:pStyle w:val="ListBullet"/>
+      </w:pPr>
+      <w:r>
+        <w:t xml:space="preserve">Convert to Repair Order action on estimate detail screen (list-row style under ACTIONS)</w:t>
+      </w:r>
+    </w:p>
+    <w:p>
+      <w:pPr>
+        <w:pStyle w:val="ListBullet"/>
+      </w:pPr>
+      <w:r>
+        <w:t xml:space="preserve">Status advancement flow: Open → In Progress → Completed → Closed, each with contextual icon (wrench / checkmark / lock)</w:t>
+      </w:r>
+    </w:p>
+    <w:p>
+      <w:pPr>
+        <w:pStyle w:val="ListBullet"/>
+      </w:pPr>
+      <w:r>
+        <w:t xml:space="preserve">RO detail screen — status badge, customer/vehicle header, line items (read from linked estimate), totals, ACTIONS section with status advancement row</w:t>
+      </w:r>
+    </w:p>
+    <w:p>
+      <w:pPr>
+        <w:pStyle w:val="ListBullet"/>
+      </w:pPr>
+      <w:r>
+        <w:t xml:space="preserve">RO list screen — color-coded status dots (blue=Open, orange=In Progress, green=Completed, gray=Closed), customer name, vehicle label, status text + chevron</w:t>
+      </w:r>
+    </w:p>
+    <w:p>
+      <w:pPr>
+        <w:pStyle w:val="ListBullet"/>
+      </w:pPr>
+      <w:r>
+        <w:t xml:space="preserve">repair_orders_provider.dart — repairOrdersProvider, repairOrderProvider, roForEstimateProvider (Riverpod StreamProviders)</w:t>
+      </w:r>
+    </w:p>
+    <w:p>
+      <w:pPr>
+        <w:pStyle w:val="ListBullet"/>
+      </w:pPr>
+      <w:r>
+        <w:t xml:space="preserve">RepairOrderWithDetails helper class for joined RO + customer + vehicle queries</w:t>
+      </w:r>
+    </w:p>
+    <w:p>
+      <w:pPr>
+        <w:pStyle w:val="ListBullet"/>
+      </w:pPr>
+      <w:r>
+        <w:t xml:space="preserve">Repair Orders table — schema v9, full CRUD (insertRepairOrder, updateRepairOrder, deleteRepairOrder, watchAllRepairOrders, watchRepairOrder, watchRoForEstimate)</w:t>
       </w:r>
     </w:p>
     <w:p>
@@ -3079,7 +3055,23 @@
         <w:pStyle w:val="ListBullet"/>
       </w:pPr>
       <w:r>
-        <w:t xml:space="preserve">Migration blocks used from == N which would skip migrations on devices jumping multiple schema versions — corrected to from &lt; N throughout</w:t>
+        <w:t xml:space="preserve">lib/features/repair_orders/ro_detail_screen.dart</w:t>
+      </w:r>
+    </w:p>
+    <w:p>
+      <w:pPr>
+        <w:pStyle w:val="ListBullet"/>
+      </w:pPr>
+      <w:r>
+        <w:t xml:space="preserve">lib/features/repair_orders/ro_list_screen.dart</w:t>
+      </w:r>
+    </w:p>
+    <w:p>
+      <w:pPr>
+        <w:pStyle w:val="ListBullet"/>
+      </w:pPr>
+      <w:r>
+        <w:t xml:space="preserve">lib/features/repair_orders/repair_orders_provider.dart</w:t>
       </w:r>
     </w:p>
     <w:p>
@@ -3087,71 +3079,71 @@
         <w:rPr>
           <w:b/>
         </w:rPr>
-        <w:t xml:space="preserve">Bugs fixed</w:t>
-      </w:r>
-    </w:p>
-    <w:p>
-      <w:pPr>
-        <w:pStyle w:val="ListBullet"/>
-      </w:pPr>
-      <w:r>
-        <w:t xml:space="preserve">lib/features/vehicles/vehicle_form_screen.dart — NO PLATE stored when plate field is empty</w:t>
-      </w:r>
-    </w:p>
-    <w:p>
-      <w:pPr>
-        <w:pStyle w:val="ListBullet"/>
-      </w:pPr>
-      <w:r>
-        <w:t xml:space="preserve">lib/features/customers/customer_detail_screen.dart — internal note shown in CONTACT section</w:t>
-      </w:r>
-    </w:p>
-    <w:p>
-      <w:pPr>
-        <w:pStyle w:val="ListBullet"/>
-      </w:pPr>
-      <w:r>
-        <w:t xml:space="preserve">lib/features/customers/customer_form_screen.dart — internal note field added</w:t>
-      </w:r>
-    </w:p>
-    <w:p>
-      <w:pPr>
-        <w:pStyle w:val="ListBullet"/>
-      </w:pPr>
-      <w:r>
-        <w:t xml:space="preserve">lib/features/repair_orders/ro_detail_screen.dart — declined items filtered out; mark-done checkmark toggle; Edit Estimate action row; customer complaint in header</w:t>
-      </w:r>
-    </w:p>
-    <w:p>
-      <w:pPr>
-        <w:pStyle w:val="ListBullet"/>
-      </w:pPr>
-      <w:r>
-        <w:t xml:space="preserve">lib/features/estimates/estimate_detail_screen.dart — approval badge on each row; action sheet to approve/decline/reset; declined items styled with strikethrough; totals footnote for declined; declinedTotal excluded from subtotal</w:t>
-      </w:r>
-    </w:p>
-    <w:p>
-      <w:pPr>
-        <w:pStyle w:val="ListBullet"/>
-      </w:pPr>
-      <w:r>
-        <w:t xml:space="preserve">lib/features/estimates/estimate_form_screen.dart — customer complaint field; internal note field; _PickerSheet updated with createNew and sublabel support; vehicle picker shows plate</w:t>
-      </w:r>
-    </w:p>
-    <w:p>
-      <w:pPr>
-        <w:pStyle w:val="ListBullet"/>
-      </w:pPr>
-      <w:r>
-        <w:t xml:space="preserve">lib/features/estimates/line_item_form_screen.dart — unit cost + markup % / $ / list fields with auto-sync; labor picker row; vendorSheet with + Add Vendor</w:t>
-      </w:r>
-    </w:p>
-    <w:p>
-      <w:pPr>
-        <w:pStyle w:val="ListBullet"/>
-      </w:pPr>
-      <w:r>
-        <w:t xml:space="preserve">lib/database/database.dart — added unitCost, parentLaborId (v10), customerComplaint (v11), internalNote, isDone (v12), approvalStatus (v13); bumped schemaVersion to 13; fixed all migration blocks to from &lt; N</w:t>
+        <w:t xml:space="preserve">Files added</w:t>
+      </w:r>
+    </w:p>
+    <w:p>
+      <w:pPr>
+        <w:pStyle w:val="ListBullet"/>
+      </w:pPr>
+      <w:r>
+        <w:t xml:space="preserve">README.md — v0.4.0 Open Bay added to Project Status</w:t>
+      </w:r>
+    </w:p>
+    <w:p>
+      <w:pPr>
+        <w:pStyle w:val="ListBullet"/>
+      </w:pPr>
+      <w:r>
+        <w:t xml:space="preserve">docs/module_plan.md — RO tasks checked off, v0.4.0 infrastructure section added</w:t>
+      </w:r>
+    </w:p>
+    <w:p>
+      <w:pPr>
+        <w:pStyle w:val="ListBullet"/>
+      </w:pPr>
+      <w:r>
+        <w:t xml:space="preserve">CLAUDE.md — Button &amp; Action Design Rule section added, What's Built So Far updated, schema v9, version bumped to v0.4.0 Open Bay</w:t>
+      </w:r>
+    </w:p>
+    <w:p>
+      <w:pPr>
+        <w:pStyle w:val="ListBullet"/>
+      </w:pPr>
+      <w:r>
+        <w:t xml:space="preserve">lib/router.dart — /repair-orders/ros and /repair-orders/ros/:roId routes added</w:t>
+      </w:r>
+    </w:p>
+    <w:p>
+      <w:pPr>
+        <w:pStyle w:val="ListBullet"/>
+      </w:pPr>
+      <w:r>
+        <w:t xml:space="preserve">lib/features/repair_orders/repair_orders_screen.dart — Repair Orders row enabled, navigates to /repair-orders/ros</w:t>
+      </w:r>
+    </w:p>
+    <w:p>
+      <w:pPr>
+        <w:pStyle w:val="ListBullet"/>
+      </w:pPr>
+      <w:r>
+        <w:t xml:space="preserve">lib/features/estimates/estimate_detail_screen.dart — Convert to RO / View RO banner, Add Labor/Part as list-row actions, _ActionRow widget, removed _AddButton</w:t>
+      </w:r>
+    </w:p>
+    <w:p>
+      <w:pPr>
+        <w:pStyle w:val="ListBullet"/>
+      </w:pPr>
+      <w:r>
+        <w:t xml:space="preserve">lib/database/database.g.dart — regenerated by build_runner</w:t>
+      </w:r>
+    </w:p>
+    <w:p>
+      <w:pPr>
+        <w:pStyle w:val="ListBullet"/>
+      </w:pPr>
+      <w:r>
+        <w:t xml:space="preserve">lib/database/database.dart — RepairOrders table, RepairOrderWithDetails, schemaVersion 8→9, migration from &lt; 9, RO queries</w:t>
       </w:r>
     </w:p>
     <w:p>
@@ -3164,7 +3156,7 @@
     </w:p>
     <w:p>
       <w:r>
-        <w:t xml:space="preserve">Begin Module 3 — Invoice PDF generation from a closed repair order.</w:t>
+        <w:t xml:space="preserve">Polish and bug-finding session — review all screens for UX issues, fix any rough edges, check edge cases (empty states, missing data, navigation flows).</w:t>
       </w:r>
     </w:p>
     <w:p>
@@ -3182,253 +3174,7 @@
         <w:pStyle w:val="Heading2"/>
       </w:pPr>
       <w:r>
-        <w:t xml:space="preserve">Session 5 — v0.4.0 Open Bay</w:t>
-      </w:r>
-    </w:p>
-    <w:p>
-      <w:r>
-        <w:t xml:space="preserve">Date: March 22, 2026</w:t>
-      </w:r>
-    </w:p>
-    <w:p>
-      <w:r>
-        <w:t xml:space="preserve">Version: v0.4.0 Open Bay</w:t>
-      </w:r>
-    </w:p>
-    <w:p>
-      <w:r>
-        <w:t xml:space="preserve">Session: 5</w:t>
-      </w:r>
-    </w:p>
-    <w:p>
-      <w:pPr>
-        <w:pStyle w:val="ListBullet"/>
-      </w:pPr>
-      <w:r>
-        <w:t>Version renamed from v0.3.0 Write-Up → v0.3.0 Write-Up across all docs</w:t>
-      </w:r>
-    </w:p>
-    <w:p>
-      <w:pPr>
-        <w:pStyle w:val="ListBullet"/>
-      </w:pPr>
-      <w:r>
-        <w:t xml:space="preserve">Design rule saved permanently to CLAUDE.md so all future sessions follow it</w:t>
-      </w:r>
-    </w:p>
-    <w:p>
-      <w:pPr>
-        <w:pStyle w:val="ListBullet"/>
-      </w:pPr>
-      <w:r>
-        <w:t xml:space="preserve">Button/action design rule standardized — all actions use list-row style (blue icon + blue label + gray chevron, under small-caps section header)</w:t>
-      </w:r>
-    </w:p>
-    <w:p>
-      <w:pPr>
-        <w:pStyle w:val="ListBullet"/>
-      </w:pPr>
-      <w:r>
-        <w:t xml:space="preserve">Repair Orders hub row enabled — was Coming soon, now navigates to /repair-orders/ros</w:t>
-      </w:r>
-    </w:p>
-    <w:p>
-      <w:pPr>
-        <w:pStyle w:val="ListBullet"/>
-      </w:pPr>
-      <w:r>
-        <w:t xml:space="preserve">View Repair Order link on estimate detail once RO exists (green icon, RO number subtitle)</w:t>
-      </w:r>
-    </w:p>
-    <w:p>
-      <w:pPr>
-        <w:pStyle w:val="ListBullet"/>
-      </w:pPr>
-      <w:r>
-        <w:t xml:space="preserve">Convert to Repair Order action on estimate detail screen (list-row style under ACTIONS)</w:t>
-      </w:r>
-    </w:p>
-    <w:p>
-      <w:pPr>
-        <w:pStyle w:val="ListBullet"/>
-      </w:pPr>
-      <w:r>
-        <w:t xml:space="preserve">Status advancement flow: Open → In Progress → Completed → Closed, each with contextual icon (wrench / checkmark / lock)</w:t>
-      </w:r>
-    </w:p>
-    <w:p>
-      <w:pPr>
-        <w:pStyle w:val="ListBullet"/>
-      </w:pPr>
-      <w:r>
-        <w:t xml:space="preserve">RO detail screen — status badge, customer/vehicle header, line items (read from linked estimate), totals, ACTIONS section with status advancement row</w:t>
-      </w:r>
-    </w:p>
-    <w:p>
-      <w:pPr>
-        <w:pStyle w:val="ListBullet"/>
-      </w:pPr>
-      <w:r>
-        <w:t xml:space="preserve">RO list screen — color-coded status dots (blue=Open, orange=In Progress, green=Completed, gray=Closed), customer name, vehicle label, status text + chevron</w:t>
-      </w:r>
-    </w:p>
-    <w:p>
-      <w:pPr>
-        <w:pStyle w:val="ListBullet"/>
-      </w:pPr>
-      <w:r>
-        <w:t xml:space="preserve">repair_orders_provider.dart — repairOrdersProvider, repairOrderProvider, roForEstimateProvider (Riverpod StreamProviders)</w:t>
-      </w:r>
-    </w:p>
-    <w:p>
-      <w:pPr>
-        <w:pStyle w:val="ListBullet"/>
-      </w:pPr>
-      <w:r>
-        <w:t xml:space="preserve">RepairOrderWithDetails helper class for joined RO + customer + vehicle queries</w:t>
-      </w:r>
-    </w:p>
-    <w:p>
-      <w:pPr>
-        <w:pStyle w:val="ListBullet"/>
-      </w:pPr>
-      <w:r>
-        <w:t xml:space="preserve">Repair Orders table — schema v9, full CRUD (insertRepairOrder, updateRepairOrder, deleteRepairOrder, watchAllRepairOrders, watchRepairOrder, watchRoForEstimate)</w:t>
-      </w:r>
-    </w:p>
-    <w:p>
-      <w:r>
-        <w:rPr>
-          <w:b/>
-        </w:rPr>
-        <w:t xml:space="preserve">What was built</w:t>
-      </w:r>
-    </w:p>
-    <w:p>
-      <w:pPr>
-        <w:pStyle w:val="ListBullet"/>
-      </w:pPr>
-      <w:r>
-        <w:t xml:space="preserve">lib/features/repair_orders/ro_detail_screen.dart</w:t>
-      </w:r>
-    </w:p>
-    <w:p>
-      <w:pPr>
-        <w:pStyle w:val="ListBullet"/>
-      </w:pPr>
-      <w:r>
-        <w:t xml:space="preserve">lib/features/repair_orders/ro_list_screen.dart</w:t>
-      </w:r>
-    </w:p>
-    <w:p>
-      <w:pPr>
-        <w:pStyle w:val="ListBullet"/>
-      </w:pPr>
-      <w:r>
-        <w:t xml:space="preserve">lib/features/repair_orders/repair_orders_provider.dart</w:t>
-      </w:r>
-    </w:p>
-    <w:p>
-      <w:r>
-        <w:rPr>
-          <w:b/>
-        </w:rPr>
-        <w:t xml:space="preserve">Files added</w:t>
-      </w:r>
-    </w:p>
-    <w:p>
-      <w:pPr>
-        <w:pStyle w:val="ListBullet"/>
-      </w:pPr>
-      <w:r>
-        <w:t xml:space="preserve">README.md — v0.4.0 Open Bay added to Project Status</w:t>
-      </w:r>
-    </w:p>
-    <w:p>
-      <w:pPr>
-        <w:pStyle w:val="ListBullet"/>
-      </w:pPr>
-      <w:r>
-        <w:t xml:space="preserve">docs/module_plan.md — RO tasks checked off, v0.4.0 infrastructure section added</w:t>
-      </w:r>
-    </w:p>
-    <w:p>
-      <w:pPr>
-        <w:pStyle w:val="ListBullet"/>
-      </w:pPr>
-      <w:r>
-        <w:t xml:space="preserve">CLAUDE.md — Button &amp; Action Design Rule section added, What's Built So Far updated, schema v9, version bumped to v0.4.0 Open Bay</w:t>
-      </w:r>
-    </w:p>
-    <w:p>
-      <w:pPr>
-        <w:pStyle w:val="ListBullet"/>
-      </w:pPr>
-      <w:r>
-        <w:t xml:space="preserve">lib/router.dart — /repair-orders/ros and /repair-orders/ros/:roId routes added</w:t>
-      </w:r>
-    </w:p>
-    <w:p>
-      <w:pPr>
-        <w:pStyle w:val="ListBullet"/>
-      </w:pPr>
-      <w:r>
-        <w:t xml:space="preserve">lib/features/repair_orders/repair_orders_screen.dart — Repair Orders row enabled, navigates to /repair-orders/ros</w:t>
-      </w:r>
-    </w:p>
-    <w:p>
-      <w:pPr>
-        <w:pStyle w:val="ListBullet"/>
-      </w:pPr>
-      <w:r>
-        <w:t xml:space="preserve">lib/features/estimates/estimate_detail_screen.dart — Convert to RO / View RO banner, Add Labor/Part as list-row actions, _ActionRow widget, removed _AddButton</w:t>
-      </w:r>
-    </w:p>
-    <w:p>
-      <w:pPr>
-        <w:pStyle w:val="ListBullet"/>
-      </w:pPr>
-      <w:r>
-        <w:t xml:space="preserve">lib/database/database.g.dart — regenerated by build_runner</w:t>
-      </w:r>
-    </w:p>
-    <w:p>
-      <w:pPr>
-        <w:pStyle w:val="ListBullet"/>
-      </w:pPr>
-      <w:r>
-        <w:t xml:space="preserve">lib/database/database.dart — RepairOrders table, RepairOrderWithDetails, schemaVersion 8→9, migration from &lt; 9, RO queries</w:t>
-      </w:r>
-    </w:p>
-    <w:p>
-      <w:r>
-        <w:rPr>
-          <w:b/>
-        </w:rPr>
-        <w:t xml:space="preserve">Files modified</w:t>
-      </w:r>
-    </w:p>
-    <w:p>
-      <w:r>
-        <w:t xml:space="preserve">Polish and bug-finding session — review all screens for UX issues, fix any rough edges, check edge cases (empty states, missing data, navigation flows).</w:t>
-      </w:r>
-    </w:p>
-    <w:p>
-      <w:r>
-        <w:t xml:space="preserve">Next session</w:t>
-      </w:r>
-    </w:p>
-    <w:p>
-      <w:r>
-        <w:t xml:space="preserve"/>
-      </w:r>
-    </w:p>
-    <w:p>
-      <w:pPr>
-        <w:pStyle w:val="Heading2"/>
-      </w:pPr>
-      <w:r>
-        <w:t>Session 4 (continued) — v0.3.0 Write-Up</w:t>
+        <w:t>Session 4b — v0.3.0 Write-Up</w:t>
       </w:r>
     </w:p>
     <w:p>
@@ -3709,7 +3455,7 @@
         <w:pStyle w:val="Heading2"/>
       </w:pPr>
       <w:r>
-        <w:t>Session 4 — v0.3.0 Write-Up</w:t>
+        <w:t>Session 4a — v0.3.0 Write-Up</w:t>
       </w:r>
     </w:p>
     <w:tbl>

</xml_diff>

<commit_message>
v0.9.0 Dialed In — UX polish: linked parts dropdown, part numbers, add-part under labor, number field select-all
Co-Authored-By: Claude Sonnet 4.6 <noreply@anthropic.com>
</commit_message>
<xml_diff>
--- a/docs/AutoShopPro_Build_Log.docx
+++ b/docs/AutoShopPro_Build_Log.docx
@@ -1710,6 +1710,268 @@
       </w:pPr>
       <w:r>
         <w:t xml:space="preserve">Build Sessions</w:t>
+      </w:r>
+    </w:p>
+    <w:p>
+      <w:r>
+        <w:t xml:space="preserve"/>
+      </w:r>
+    </w:p>
+    <w:p>
+      <w:pPr>
+        <w:pStyle w:val="Heading2"/>
+      </w:pPr>
+      <w:r>
+        <w:t xml:space="preserve">Session 11 — v0.9.0 Dialed In</w:t>
+      </w:r>
+    </w:p>
+    <w:p>
+      <w:r>
+        <w:t xml:space="preserve">Date: March 22, 2026</w:t>
+      </w:r>
+    </w:p>
+    <w:p>
+      <w:r>
+        <w:t xml:space="preserve">Version: v0.9.0 Dialed In</w:t>
+      </w:r>
+    </w:p>
+    <w:p>
+      <w:r>
+        <w:t xml:space="preserve">Session: 11</w:t>
+      </w:r>
+    </w:p>
+    <w:p>
+      <w:pPr>
+        <w:pStyle w:val="ListBullet"/>
+      </w:pPr>
+      <w:r>
+        <w:t xml:space="preserve">Other category added to parts inventory — inventory parts can now be categorised as Other in addition to Part / Fluid / Filter / Chemical</w:t>
+      </w:r>
+    </w:p>
+    <w:p>
+      <w:pPr>
+        <w:pStyle w:val="ListBullet"/>
+      </w:pPr>
+      <w:r>
+        <w:t xml:space="preserve">Number fields select-all on tap, text fields do not — corrected across line_item_form_screen, part_form_screen, and service_template_form_screen; only numeric keyboard fields get the select-all onTap behavior</w:t>
+      </w:r>
+    </w:p>
+    <w:p>
+      <w:pPr>
+        <w:pStyle w:val="ListBullet"/>
+      </w:pPr>
+      <w:r>
+        <w:t xml:space="preserve">New estimate from vehicle page uses form — tapping New Estimate on the vehicle detail screen now navigates to the New Estimate form with customer and vehicle pre-filled, so the user can add complaints before saving</w:t>
+      </w:r>
+    </w:p>
+    <w:p>
+      <w:pPr>
+        <w:pStyle w:val="ListBullet"/>
+      </w:pPr>
+      <w:r>
+        <w:t xml:space="preserve">Line preview labor+parts total — the live preview at the bottom of Add Labor shows a three-row breakdown: labor cost / parts cost / total when linked template parts are present</w:t>
+      </w:r>
+    </w:p>
+    <w:p>
+      <w:pPr>
+        <w:pStyle w:val="ListBullet"/>
+      </w:pPr>
+      <w:r>
+        <w:t xml:space="preserve">Part number on line items (schema v21) — parts line items now have an optional Part # field; shown as a gray subtitle on estimate and RO detail rows; auto-filled from inventory when a catalog part is picked</w:t>
+      </w:r>
+    </w:p>
+    <w:p>
+      <w:pPr>
+        <w:pStyle w:val="ListBullet"/>
+      </w:pPr>
+      <w:r>
+        <w:t xml:space="preserve">Linked parts dropdown in Add Labor form — when a service template is chosen via the Operation picker on the Add Labor form, a collapsible LINKED PARTS section appears below with checkboxes and qty fields; selected parts are inserted as part lines linked to the new labor entry on save</w:t>
+      </w:r>
+    </w:p>
+    <w:p>
+      <w:pPr>
+        <w:pStyle w:val="ListBullet"/>
+      </w:pPr>
+      <w:r>
+        <w:t xml:space="preserve">Template linked parts as opt-in dropdown — when a service template is applied to an estimate, linked parts appear in a collapsible picker sheet (all unchecked by default); user selects which parts to add and sets quantities before confirming</w:t>
+      </w:r>
+    </w:p>
+    <w:p>
+      <w:pPr>
+        <w:pStyle w:val="ListBullet"/>
+      </w:pPr>
+      <w:r>
+        <w:t xml:space="preserve">Customer concern on estimate detail — CUSTOMER CONCERN section now displays on the estimate detail screen (bullet list, one per complaint); previously it was only saved to the DB and sent to PDFs</w:t>
+      </w:r>
+    </w:p>
+    <w:p>
+      <w:pPr>
+        <w:pStyle w:val="ListBullet"/>
+      </w:pPr>
+      <w:r>
+        <w:t xml:space="preserve">Add Part button under each labor row — estimate detail screen shows an indented "Add Part" row beneath every labor line; tapping it opens the Add Part form with parentLaborId pre-linked so the part groups under that labor entry automatically</w:t>
+      </w:r>
+    </w:p>
+    <w:p>
+      <w:r>
+        <w:rPr>
+          <w:b/>
+        </w:rPr>
+        <w:t xml:space="preserve">What was built</w:t>
+      </w:r>
+    </w:p>
+    <w:p>
+      <w:pPr>
+        <w:pStyle w:val="ListBullet"/>
+      </w:pPr>
+      <w:r>
+        <w:t xml:space="preserve">Service template not loading on first tap — fixed: added ref.watch(serviceTemplatesProvider) in build() to warm the stream before the callback fires</w:t>
+      </w:r>
+    </w:p>
+    <w:p>
+      <w:pPr>
+        <w:pStyle w:val="ListBullet"/>
+      </w:pPr>
+      <w:r>
+        <w:t xml:space="preserve">Template linked parts all checked by default — fixed: parts now start unchecked in the picker sheet</w:t>
+      </w:r>
+    </w:p>
+    <w:p>
+      <w:r>
+        <w:rPr>
+          <w:b/>
+        </w:rPr>
+        <w:t xml:space="preserve">Bugs fixed</w:t>
+      </w:r>
+    </w:p>
+    <w:p>
+      <w:pPr>
+        <w:pStyle w:val="ListBullet"/>
+      </w:pPr>
+      <w:r>
+        <w:t xml:space="preserve">lib/features/invoices/invoice_service.dart — buildEstimatePdf, showEstimateActions; customerComplaint bullet list in all PDF builders</w:t>
+      </w:r>
+    </w:p>
+    <w:p>
+      <w:pPr>
+        <w:pStyle w:val="ListBullet"/>
+      </w:pPr>
+      <w:r>
+        <w:t xml:space="preserve">lib/features/inventory/part_list_screen.dart — right-click context menu with Edit/Delete on each row</w:t>
+      </w:r>
+    </w:p>
+    <w:p>
+      <w:pPr>
+        <w:pStyle w:val="ListBullet"/>
+      </w:pPr>
+      <w:r>
+        <w:t xml:space="preserve">lib/features/settings/settings_screen.dart — added PEOPLE section with Technicians navigation row</w:t>
+      </w:r>
+    </w:p>
+    <w:p>
+      <w:pPr>
+        <w:pStyle w:val="ListBullet"/>
+      </w:pPr>
+      <w:r>
+        <w:t xml:space="preserve">lib/features/repair_orders/repair_orders_screen.dart — removed Technicians row (moved to Settings)</w:t>
+      </w:r>
+    </w:p>
+    <w:p>
+      <w:pPr>
+        <w:pStyle w:val="ListBullet"/>
+      </w:pPr>
+      <w:r>
+        <w:t xml:space="preserve">lib/features/customers/customer_detail_screen.dart — _HistorySection showing estimates and ROs per customer</w:t>
+      </w:r>
+    </w:p>
+    <w:p>
+      <w:pPr>
+        <w:pStyle w:val="ListBullet"/>
+      </w:pPr>
+      <w:r>
+        <w:t xml:space="preserve">lib/router.dart — line-items/part route reads parentLaborId query param; estimates/new route reads customerId and vehicleId query params</w:t>
+      </w:r>
+    </w:p>
+    <w:p>
+      <w:pPr>
+        <w:pStyle w:val="ListBullet"/>
+      </w:pPr>
+      <w:r>
+        <w:t xml:space="preserve">lib/features/vehicles/vehicle_detail_screen.dart — _newEstimate navigates to form with query params instead of silently inserting</w:t>
+      </w:r>
+    </w:p>
+    <w:p>
+      <w:pPr>
+        <w:pStyle w:val="ListBullet"/>
+      </w:pPr>
+      <w:r>
+        <w:t xml:space="preserve">lib/features/service_templates/service_template_form_screen.dart — _field helper select-all made conditional on keyboardType; linked parts quantity removed (set at estimate time); partNumber shown in subtitle</w:t>
+      </w:r>
+    </w:p>
+    <w:p>
+      <w:pPr>
+        <w:pStyle w:val="ListBullet"/>
+      </w:pPr>
+      <w:r>
+        <w:t xml:space="preserve">lib/features/inventory/part_form_screen.dart — Other added to categories; _field helper select-all made conditional on keyboardType</w:t>
+      </w:r>
+    </w:p>
+    <w:p>
+      <w:pPr>
+        <w:pStyle w:val="ListBullet"/>
+      </w:pPr>
+      <w:r>
+        <w:t xml:space="preserve">lib/features/estimates/line_item_form_screen.dart — parentLaborId constructor param; _linkedTemplateParts list with collapsible dropdown UI; _LinkedPartQtyRow widget; _LinePreview updated with labor+parts+total breakdown; selectAllOnTap param on _Field; numeric fields pass selectAllOnTap: true; partNumber controller wired through save/edit</w:t>
+      </w:r>
+    </w:p>
+    <w:p>
+      <w:pPr>
+        <w:pStyle w:val="ListBullet"/>
+      </w:pPr>
+      <w:r>
+        <w:t xml:space="preserve">lib/features/estimates/estimate_form_screen.dart — preCustomerId / preVehicleId params; initState loads and pre-fills customer+vehicle when opened from vehicle page</w:t>
+      </w:r>
+    </w:p>
+    <w:p>
+      <w:pPr>
+        <w:pStyle w:val="ListBullet"/>
+      </w:pPr>
+      <w:r>
+        <w:t xml:space="preserve">lib/features/estimates/estimate_detail_screen.dart — Add Part button under each labor row; CUSTOMER CONCERN section; _TemplatePartsSheet with unchecked-by-default parts; ref.watch(serviceTemplatesProvider) to warm stream</w:t>
+      </w:r>
+    </w:p>
+    <w:p>
+      <w:pPr>
+        <w:pStyle w:val="ListBullet"/>
+      </w:pPr>
+      <w:r>
+        <w:t xml:space="preserve">lib/database/database.g.dart — regenerated via build_runner</w:t>
+      </w:r>
+    </w:p>
+    <w:p>
+      <w:pPr>
+        <w:pStyle w:val="ListBullet"/>
+      </w:pPr>
+      <w:r>
+        <w:t xml:space="preserve">lib/database/database.dart — added partNumber column to EstimateLineItems (schema v21); migration v21; watchEstimatesForCustomer, watchRepairOrdersForCustomer stream queries</w:t>
+      </w:r>
+    </w:p>
+    <w:p>
+      <w:r>
+        <w:rPr>
+          <w:b/>
+        </w:rPr>
+        <w:t xml:space="preserve">Files modified</w:t>
+      </w:r>
+    </w:p>
+    <w:p>
+      <w:r>
+        <w:t xml:space="preserve">Continue UX polish or begin Module 3 — payments and invoice PDF from closed RO.</w:t>
+      </w:r>
+    </w:p>
+    <w:p>
+      <w:r>
+        <w:t xml:space="preserve">Next session</w:t>
       </w:r>
     </w:p>
     <w:p>

</xml_diff>

<commit_message>
v0.10.0 Buttoned Up — Other items, RO comment, simplified status, UX polish
- Other line item type (name/description/cost/list price) on estimates and ROs
- RO invoice comment field — editable on RO detail, prints on PDF invoices
- Simplified RO status: Open → Closed only; filter pills updated
- Complete All Services button on open ROs
- Edit Repair Order consolidates Edit Estimate + Edit Record
- Customer concern editable after entry (Add/Edit link on section title)
- Vehicle history section on vehicle detail page
- Scrollbars and hover cursors on vendor, technician, part list screens
- Desktop dropdown context menus (approval badge, category picker, invoices)
- After saving vehicle → navigate to vehicle detail page
- Labor form: Name first, then Description; Total syncs Hours not Rate
- Schema v23: comment column on repair_orders
- Apply Template removed from ADD ITEMS (available via Add Labor → Operation)

Co-Authored-By: Claude Sonnet 4.6 <noreply@anthropic.com>
</commit_message>
<xml_diff>
--- a/docs/AutoShopPro_Build_Log.docx
+++ b/docs/AutoShopPro_Build_Log.docx
@@ -1710,6 +1710,308 @@
       </w:pPr>
       <w:r>
         <w:t xml:space="preserve">Build Sessions</w:t>
+      </w:r>
+    </w:p>
+    <w:p>
+      <w:r>
+        <w:t xml:space="preserve"/>
+      </w:r>
+    </w:p>
+    <w:p>
+      <w:pPr>
+        <w:pStyle w:val="Heading2"/>
+      </w:pPr>
+      <w:r>
+        <w:t xml:space="preserve">Session 13 — v0.10.0 Buttoned Up</w:t>
+      </w:r>
+    </w:p>
+    <w:p>
+      <w:r>
+        <w:t xml:space="preserve">Date: March 23, 2026</w:t>
+      </w:r>
+    </w:p>
+    <w:p>
+      <w:r>
+        <w:t xml:space="preserve">Version: v0.10.0 Buttoned Up</w:t>
+      </w:r>
+    </w:p>
+    <w:p>
+      <w:r>
+        <w:t xml:space="preserve">Session: 13</w:t>
+      </w:r>
+    </w:p>
+    <w:p>
+      <w:pPr>
+        <w:pStyle w:val="ListBullet"/>
+      </w:pPr>
+      <w:r>
+        <w:t xml:space="preserve">Apply Template removed from ADD ITEMS — redundant now that template access is built into Add Labor via the Operation picker</w:t>
+      </w:r>
+    </w:p>
+    <w:p>
+      <w:pPr>
+        <w:pStyle w:val="ListBullet"/>
+      </w:pPr>
+      <w:r>
+        <w:t xml:space="preserve">Schema v23 migration — comment column added to repair_orders table; database.g.dart regenerated</w:t>
+      </w:r>
+    </w:p>
+    <w:p>
+      <w:pPr>
+        <w:pStyle w:val="ListBullet"/>
+      </w:pPr>
+      <w:r>
+        <w:t xml:space="preserve">RO invoice comment — INVOICE COMMENT section on every RO detail with Add/Edit link; comment text is printed on both Itemized and Simple Invoice PDFs between the totals and the thank-you footer</w:t>
+      </w:r>
+    </w:p>
+    <w:p>
+      <w:pPr>
+        <w:pStyle w:val="ListBullet"/>
+      </w:pPr>
+      <w:r>
+        <w:t xml:space="preserve">"Other" line item type — new type alongside labor and parts; form has Name (required), Description, Cost, and List Price fields; displayed in an OTHER section on estimate and RO detail screens; name shown as title via laborName field</w:t>
+      </w:r>
+    </w:p>
+    <w:p>
+      <w:pPr>
+        <w:pStyle w:val="ListBullet"/>
+      </w:pPr>
+      <w:r>
+        <w:t xml:space="preserve">Edit Repair Order consolidated — replaced separate "Edit Estimate" and "Edit Record" buttons with a single "Edit Repair Order" row navigating to the linked estimate</w:t>
+      </w:r>
+    </w:p>
+    <w:p>
+      <w:pPr>
+        <w:pStyle w:val="ListBullet"/>
+      </w:pPr>
+      <w:r>
+        <w:t xml:space="preserve">Simplified RO status: Open → Closed only — removed In Progress and Completed statuses; "Close Repair Order" is now the single advancement action; RO list filters updated to All / Open / Closed</w:t>
+      </w:r>
+    </w:p>
+    <w:p>
+      <w:pPr>
+        <w:pStyle w:val="ListBullet"/>
+      </w:pPr>
+      <w:r>
+        <w:t xml:space="preserve">"Complete All Services" button on open ROs — shown in ACTIONS when any line item is unchecked; tapping it marks every item done and deducts inventory stock in one operation</w:t>
+      </w:r>
+    </w:p>
+    <w:p>
+      <w:pPr>
+        <w:pStyle w:val="ListBullet"/>
+      </w:pPr>
+      <w:r>
+        <w:t xml:space="preserve">Vehicle history section on vehicle detail page — _VehicleHistorySection widget shows a chronological list of estimates and ROs for that vehicle; if an estimate has a linked RO only the RO row is shown (same deduplication logic as customer detail)</w:t>
+      </w:r>
+    </w:p>
+    <w:p>
+      <w:pPr>
+        <w:pStyle w:val="ListBullet"/>
+      </w:pPr>
+      <w:r>
+        <w:t xml:space="preserve">Customer concern editable after entry — CUSTOMER CONCERN section header now has an Add/Edit blue link on the right; tapping it opens a dialog with a multi-line text field to set or change the complaint</w:t>
+      </w:r>
+    </w:p>
+    <w:p>
+      <w:pPr>
+        <w:pStyle w:val="ListBullet"/>
+      </w:pPr>
+      <w:r>
+        <w:t xml:space="preserve">Duplicate customer concerns removed from estimate detail header — the complaint text was showing both in the customer/vehicle header card and in the CUSTOMER CONCERN section; header copy removed</w:t>
+      </w:r>
+    </w:p>
+    <w:p>
+      <w:pPr>
+        <w:pStyle w:val="ListBullet"/>
+      </w:pPr>
+      <w:r>
+        <w:t xml:space="preserve">Typing in Total updates Hours — previously updating the Total box would back-calculate Rate; now it back-calculates Hours so Rate stays fixed as entered</w:t>
+      </w:r>
+    </w:p>
+    <w:p>
+      <w:pPr>
+        <w:pStyle w:val="ListBullet"/>
+      </w:pPr>
+      <w:r>
+        <w:t xml:space="preserve">Labor form field order — Labor Name is now the first field (with autofocus), Labor Description second; makes naming the service the first action when adding labor</w:t>
+      </w:r>
+    </w:p>
+    <w:p>
+      <w:pPr>
+        <w:pStyle w:val="ListBullet"/>
+      </w:pPr>
+      <w:r>
+        <w:t xml:space="preserve">After saving a new vehicle → navigate to vehicle detail — vehicle_form_screen.dart captures the returned newId and calls context.go() to the vehicle detail page instead of popping back to the customer page</w:t>
+      </w:r>
+    </w:p>
+    <w:p>
+      <w:pPr>
+        <w:pStyle w:val="ListBullet"/>
+      </w:pPr>
+      <w:r>
+        <w:t xml:space="preserve">Desktop dropdown context menus — replaced CupertinoActionSheet with showContextMenu on macOS/Windows for: approval badge on estimate line items, category picker on part form, invoice actions on estimate detail and RO detail</w:t>
+      </w:r>
+    </w:p>
+    <w:p>
+      <w:pPr>
+        <w:pStyle w:val="ListBullet"/>
+      </w:pPr>
+      <w:r>
+        <w:t xml:space="preserve">Hover cursors on list rows — MouseRegion with SystemMouseCursors.click wraps every tappable row in vendor, technician, and part list screens</w:t>
+      </w:r>
+    </w:p>
+    <w:p>
+      <w:pPr>
+        <w:pStyle w:val="ListBullet"/>
+      </w:pPr>
+      <w:r>
+        <w:t xml:space="preserve">Scrollbars on vendor, technician, and part list screens — CupertinoScrollbar wraps each ListView/CustomScrollView so the scroll indicator appears on desktop</w:t>
+      </w:r>
+    </w:p>
+    <w:p>
+      <w:r>
+        <w:rPr>
+          <w:b/>
+        </w:rPr>
+        <w:t xml:space="preserve">What was built</w:t>
+      </w:r>
+    </w:p>
+    <w:p>
+      <w:pPr>
+        <w:pStyle w:val="ListBullet"/>
+      </w:pPr>
+      <w:r>
+        <w:t xml:space="preserve">lib/router.dart — line-items/other route added</w:t>
+      </w:r>
+    </w:p>
+    <w:p>
+      <w:pPr>
+        <w:pStyle w:val="ListBullet"/>
+      </w:pPr>
+      <w:r>
+        <w:t xml:space="preserve">lib/features/invoices/invoice_service.dart — comment param in buildInvoicePdf, buildSimpleInvoicePdf, _buildBytes, _handleSave/Print/Email, showInvoiceActions; comment printed before footer in both PDF layouts</w:t>
+      </w:r>
+    </w:p>
+    <w:p>
+      <w:pPr>
+        <w:pStyle w:val="ListBullet"/>
+      </w:pPr>
+      <w:r>
+        <w:t xml:space="preserve">lib/features/customers/customer_detail_screen.dart — roDot/roStatusLabel simplified to Open/Closed</w:t>
+      </w:r>
+    </w:p>
+    <w:p>
+      <w:pPr>
+        <w:pStyle w:val="ListBullet"/>
+      </w:pPr>
+      <w:r>
+        <w:t xml:space="preserve">lib/features/repair_orders/ro_list_screen.dart — filters All/Open/Closed; statusLabel/statusColor simplified</w:t>
+      </w:r>
+    </w:p>
+    <w:p>
+      <w:pPr>
+        <w:pStyle w:val="ListBullet"/>
+      </w:pPr>
+      <w:r>
+        <w:t xml:space="preserve">lib/features/repair_orders/ro_detail_screen.dart — status simplified to Open/Closed; Complete All button; Edit Repair Order consolidated; otherLines section; _RoLineItemRow shows laborName for other type; INVOICE COMMENT section + _editComment dialog; _generateInvoice passes ro.comment</w:t>
+      </w:r>
+    </w:p>
+    <w:p>
+      <w:pPr>
+        <w:pStyle w:val="ListBullet"/>
+      </w:pPr>
+      <w:r>
+        <w:t xml:space="preserve">lib/features/estimates/line_item_form_screen.dart — _isOther getter; Other form fields (Name/Description/Cost/List Price); Other save logic; Labor Name first in labor form; total→hours sync</w:t>
+      </w:r>
+    </w:p>
+    <w:p>
+      <w:pPr>
+        <w:pStyle w:val="ListBullet"/>
+      </w:pPr>
+      <w:r>
+        <w:t xml:space="preserve">lib/features/estimates/estimate_detail_screen.dart — duplicate concerns removed from header; customer concern Add/Edit link + dialog; Convert to RO moved to ACTIONS; otherLines section; Add Other button; Apply Template removed; approval badge uses showContextMenu on desktop; _LineItemRow shows laborName for other type</w:t>
+      </w:r>
+    </w:p>
+    <w:p>
+      <w:pPr>
+        <w:pStyle w:val="ListBullet"/>
+      </w:pPr>
+      <w:r>
+        <w:t xml:space="preserve">lib/features/vehicles/vehicle_detail_screen.dart — _VehicleHistorySection; _VehicleHistoryRow; watchEstimatesForVehicle + watchRepairOrdersForVehicle streams</w:t>
+      </w:r>
+    </w:p>
+    <w:p>
+      <w:pPr>
+        <w:pStyle w:val="ListBullet"/>
+      </w:pPr>
+      <w:r>
+        <w:t xml:space="preserve">lib/features/vehicles/vehicle_form_screen.dart — on insert, captures newId and navigates to vehicle detail instead of popping</w:t>
+      </w:r>
+    </w:p>
+    <w:p>
+      <w:pPr>
+        <w:pStyle w:val="ListBullet"/>
+      </w:pPr>
+      <w:r>
+        <w:t xml:space="preserve">lib/features/inventory/part_form_screen.dart — category picker uses showContextMenu on desktop, CupertinoActionSheet on mobile</w:t>
+      </w:r>
+    </w:p>
+    <w:p>
+      <w:pPr>
+        <w:pStyle w:val="ListBullet"/>
+      </w:pPr>
+      <w:r>
+        <w:t xml:space="preserve">lib/features/inventory/part_list_screen.dart — CupertinoScrollbar; MouseRegion hover cursor on rows</w:t>
+      </w:r>
+    </w:p>
+    <w:p>
+      <w:pPr>
+        <w:pStyle w:val="ListBullet"/>
+      </w:pPr>
+      <w:r>
+        <w:t xml:space="preserve">lib/features/technicians/technician_list_screen.dart — CupertinoScrollbar; MouseRegion hover cursor on rows</w:t>
+      </w:r>
+    </w:p>
+    <w:p>
+      <w:pPr>
+        <w:pStyle w:val="ListBullet"/>
+      </w:pPr>
+      <w:r>
+        <w:t xml:space="preserve">lib/features/vendors/vendor_list_screen.dart — CupertinoScrollbar; MouseRegion hover cursor on rows</w:t>
+      </w:r>
+    </w:p>
+    <w:p>
+      <w:pPr>
+        <w:pStyle w:val="ListBullet"/>
+      </w:pPr>
+      <w:r>
+        <w:t xml:space="preserve">lib/database/database.g.dart — regenerated via build_runner</w:t>
+      </w:r>
+    </w:p>
+    <w:p>
+      <w:pPr>
+        <w:pStyle w:val="ListBullet"/>
+      </w:pPr>
+      <w:r>
+        <w:t xml:space="preserve">lib/database/database.dart — comment column on RepairOrders; schema v23; migration v23; watchEstimatesForVehicle and watchRepairOrdersForVehicle stream methods</w:t>
+      </w:r>
+    </w:p>
+    <w:p>
+      <w:r>
+        <w:rPr>
+          <w:b/>
+        </w:rPr>
+        <w:t xml:space="preserve">Files modified</w:t>
+      </w:r>
+    </w:p>
+    <w:p>
+      <w:r>
+        <w:t xml:space="preserve">Invoice PDF from closed RO (Module 3), or continue UX polish.</w:t>
+      </w:r>
+    </w:p>
+    <w:p>
+      <w:r>
+        <w:t xml:space="preserve">Next session</w:t>
       </w:r>
     </w:p>
     <w:p>

</xml_diff>

<commit_message>
v0.10.0 Buttoned Up (cont.) — estimate dates, RO dates, declined items on RO + invoices
- Estimate date: editable date picker on estimate detail, estimateDate column (schema v24)
- RO service date: read-only on detail screen, editable only via Edit Repair Order form
- RO list: shows date on each row, sorted by id descending for consistent order
- Declined items: DECLINED section on RO detail (gray strikethrough, red X, not in totals)
- Declined items on invoices: DECLINED — NOT BILLED section in both PDF layouts

Co-Authored-By: Claude Sonnet 4.6 <noreply@anthropic.com>
</commit_message>
<xml_diff>
--- a/docs/AutoShopPro_Build_Log.docx
+++ b/docs/AutoShopPro_Build_Log.docx
@@ -1710,6 +1710,164 @@
       </w:pPr>
       <w:r>
         <w:t xml:space="preserve">Build Sessions</w:t>
+      </w:r>
+    </w:p>
+    <w:p>
+      <w:r>
+        <w:t xml:space="preserve"/>
+      </w:r>
+    </w:p>
+    <w:p>
+      <w:pPr>
+        <w:pStyle w:val="Heading2"/>
+      </w:pPr>
+      <w:r>
+        <w:t xml:space="preserve">Session 13 (cont.) — v0.10.0 Buttoned Up</w:t>
+      </w:r>
+    </w:p>
+    <w:p>
+      <w:r>
+        <w:t xml:space="preserve">Date: March 23, 2026</w:t>
+      </w:r>
+    </w:p>
+    <w:p>
+      <w:r>
+        <w:t xml:space="preserve">Version: v0.10.0 Buttoned Up</w:t>
+      </w:r>
+    </w:p>
+    <w:p>
+      <w:r>
+        <w:t xml:space="preserve">Session: 13 (cont.)</w:t>
+      </w:r>
+    </w:p>
+    <w:p>
+      <w:pPr>
+        <w:pStyle w:val="ListBullet"/>
+      </w:pPr>
+      <w:r>
+        <w:t xml:space="preserve">Declined items on invoices — both Itemized and Simple Invoice PDFs now include a "DECLINED — NOT BILLED" section after the totals; items shown in gray with strikethrough; not included in any totals or tax</w:t>
+      </w:r>
+    </w:p>
+    <w:p>
+      <w:pPr>
+        <w:pStyle w:val="ListBullet"/>
+      </w:pPr>
+      <w:r>
+        <w:t xml:space="preserve">Declined items on RO detail — a DECLINED section appears below TOTALS showing items the customer declined; each row shows a red X icon, gray strikethrough text, and the item price; declined items are never counted in totals</w:t>
+      </w:r>
+    </w:p>
+    <w:p>
+      <w:pPr>
+        <w:pStyle w:val="ListBullet"/>
+      </w:pPr>
+      <w:r>
+        <w:t xml:space="preserve">RO list sort fixed — ROs now sort by id descending (most recent first) instead of createdAt, which was unreliable for historical test data</w:t>
+      </w:r>
+    </w:p>
+    <w:p>
+      <w:pPr>
+        <w:pStyle w:val="ListBullet"/>
+      </w:pPr>
+      <w:r>
+        <w:t xml:space="preserve">RO list shows dates — each row now shows the service date (or createdAt when no service date) as a third line under the vehicle label</w:t>
+      </w:r>
+    </w:p>
+    <w:p>
+      <w:pPr>
+        <w:pStyle w:val="ListBullet"/>
+      </w:pPr>
+      <w:r>
+        <w:t xml:space="preserve">RO service date read-only on detail screen — removed tappable GestureDetector; date is now display-only on the RO view and only editable via the Edit Repair Order form</w:t>
+      </w:r>
+    </w:p>
+    <w:p>
+      <w:pPr>
+        <w:pStyle w:val="ListBullet"/>
+      </w:pPr>
+      <w:r>
+        <w:t xml:space="preserve">Estimate date field — tappable date row on estimate detail (blue, with chevron); stored as estimateDate nullable column; falls back to createdAt when null; schema v24 migration</w:t>
+      </w:r>
+    </w:p>
+    <w:p>
+      <w:r>
+        <w:rPr>
+          <w:b/>
+        </w:rPr>
+        <w:t xml:space="preserve">What was built</w:t>
+      </w:r>
+    </w:p>
+    <w:p>
+      <w:pPr>
+        <w:pStyle w:val="ListBullet"/>
+      </w:pPr>
+      <w:r>
+        <w:t xml:space="preserve">lib/features/invoices/invoice_service.dart — declinedItems param added to buildInvoicePdf, buildSimpleInvoicePdf, _buildBytes, _handleSave/Print/Email, showInvoiceActions; DECLINED section printed after totals in both PDF layouts</w:t>
+      </w:r>
+    </w:p>
+    <w:p>
+      <w:pPr>
+        <w:pStyle w:val="ListBullet"/>
+      </w:pPr>
+      <w:r>
+        <w:t xml:space="preserve">lib/features/repair_orders/ro_list_screen.dart — date row added to each _RoRow</w:t>
+      </w:r>
+    </w:p>
+    <w:p>
+      <w:pPr>
+        <w:pStyle w:val="ListBullet"/>
+      </w:pPr>
+      <w:r>
+        <w:t xml:space="preserve">lib/features/repair_orders/ro_form_screen.dart — SERVICE DATE picker section added alongside Internal Note</w:t>
+      </w:r>
+    </w:p>
+    <w:p>
+      <w:pPr>
+        <w:pStyle w:val="ListBullet"/>
+      </w:pPr>
+      <w:r>
+        <w:t xml:space="preserve">lib/features/repair_orders/ro_detail_screen.dart — service date row changed to read-only Container; declinedItems split; DECLINED section with _DeclinedItemRow; _generateInvoice passes declinedItems to showInvoiceActions</w:t>
+      </w:r>
+    </w:p>
+    <w:p>
+      <w:pPr>
+        <w:pStyle w:val="ListBullet"/>
+      </w:pPr>
+      <w:r>
+        <w:t xml:space="preserve">lib/features/estimates/estimate_detail_screen.dart — _pickEstimateDate method; tappable Estimate Date row in customer header area</w:t>
+      </w:r>
+    </w:p>
+    <w:p>
+      <w:pPr>
+        <w:pStyle w:val="ListBullet"/>
+      </w:pPr>
+      <w:r>
+        <w:t xml:space="preserve">lib/database/database.g.dart — regenerated via build_runner</w:t>
+      </w:r>
+    </w:p>
+    <w:p>
+      <w:pPr>
+        <w:pStyle w:val="ListBullet"/>
+      </w:pPr>
+      <w:r>
+        <w:t xml:space="preserve">lib/database/database.dart — estimateDate nullable column on Estimates; schema v24; migration v24; watchAllRepairOrders sorts by id descending</w:t>
+      </w:r>
+    </w:p>
+    <w:p>
+      <w:r>
+        <w:rPr>
+          <w:b/>
+        </w:rPr>
+        <w:t xml:space="preserve">Files modified</w:t>
+      </w:r>
+    </w:p>
+    <w:p>
+      <w:r>
+        <w:t xml:space="preserve">Invoice PDF from closed RO (Module 3), or continue UX polish.</w:t>
+      </w:r>
+    </w:p>
+    <w:p>
+      <w:r>
+        <w:t xml:space="preserve">Next session</w:t>
       </w:r>
     </w:p>
     <w:p>

</xml_diff>

<commit_message>
v0.10.1 Buttoned Up — bug fixes and polish
- Fix left-click triggering context menu on invoice, estimate, approval, and category buttons; now shows action sheet on left click, context menu on right click
- Replace "Show in Finder" with "Open" on save dialogs (opens PDF directly)
- Add hover cursors to vehicle tiles and history rows on customer detail
- Replace CupertinoButton.filled with list-row style on Add Parts confirm button
- Rename patch versions to inherit parent minor name (v0.1.1 → Bones, v0.7.1 → Parts Counter)

Co-Authored-By: Claude Sonnet 4.6 <noreply@anthropic.com>
</commit_message>
<xml_diff>
--- a/docs/AutoShopPro_Build_Log.docx
+++ b/docs/AutoShopPro_Build_Log.docx
@@ -1710,6 +1710,212 @@
       </w:pPr>
       <w:r>
         <w:t xml:space="preserve">Build Sessions</w:t>
+      </w:r>
+    </w:p>
+    <w:p>
+      <w:r>
+        <w:t xml:space="preserve"/>
+      </w:r>
+    </w:p>
+    <w:p>
+      <w:pPr>
+        <w:pStyle w:val="Heading2"/>
+      </w:pPr>
+      <w:r>
+        <w:t xml:space="preserve">Session 13 — v0.10.1 Buttoned Up</w:t>
+      </w:r>
+    </w:p>
+    <w:p>
+      <w:r>
+        <w:t xml:space="preserve">Date: March 23, 2026</w:t>
+      </w:r>
+    </w:p>
+    <w:p>
+      <w:r>
+        <w:t xml:space="preserve">Version: v0.10.1 Buttoned Up</w:t>
+      </w:r>
+    </w:p>
+    <w:p>
+      <w:r>
+        <w:t xml:space="preserve">Session: 13</w:t>
+      </w:r>
+    </w:p>
+    <w:p>
+      <w:pPr>
+        <w:pStyle w:val="ListBullet"/>
+      </w:pPr>
+      <w:r>
+        <w:t xml:space="preserve">Patch naming rule — patches now inherit the name of their parent minor version (e.g. v0.10.1 → Buttoned Up); updated v0.1.1 to Bones and v0.7.1 to Parts Counter in all docs</w:t>
+      </w:r>
+    </w:p>
+    <w:p>
+      <w:pPr>
+        <w:pStyle w:val="ListBullet"/>
+      </w:pPr>
+      <w:r>
+        <w:t xml:space="preserve">List-row button — replaced CupertinoButton.filled with the standard list-row style on the "Add Parts" confirm button in the template parts picker sheet</w:t>
+      </w:r>
+    </w:p>
+    <w:p>
+      <w:pPr>
+        <w:pStyle w:val="ListBullet"/>
+      </w:pPr>
+      <w:r>
+        <w:t xml:space="preserve">Hover cursors — added MouseRegion(cursor: SystemMouseCursors.click) to vehicle tile rows and history rows on the customer detail screen</w:t>
+      </w:r>
+    </w:p>
+    <w:p>
+      <w:pPr>
+        <w:pStyle w:val="ListBullet"/>
+      </w:pPr>
+      <w:r>
+        <w:t xml:space="preserve">Open button — replaced "Show in Finder" with "Open" on the save-to-downloads confirmation dialog for both invoices and estimates; opens the PDF directly in Preview</w:t>
+      </w:r>
+    </w:p>
+    <w:p>
+      <w:pPr>
+        <w:pStyle w:val="ListBullet"/>
+      </w:pPr>
+      <w:r>
+        <w:t xml:space="preserve">Left-click fix — invoice buttons (Itemized Invoice, Simple Invoice), estimate Save/Print/Email, approval badge, and category picker all showed a context menu dropdown on left click; fixed to show a CupertinoActionSheet modal on left click and the context menu on right click</w:t>
+      </w:r>
+    </w:p>
+    <w:p>
+      <w:r>
+        <w:rPr>
+          <w:b/>
+        </w:rPr>
+        <w:t xml:space="preserve">What was built</w:t>
+      </w:r>
+    </w:p>
+    <w:p>
+      <w:pPr>
+        <w:pStyle w:val="ListBullet"/>
+      </w:pPr>
+      <w:r>
+        <w:t xml:space="preserve">Add Parts confirm button used CupertinoButton.filled instead of list-row style</w:t>
+      </w:r>
+    </w:p>
+    <w:p>
+      <w:pPr>
+        <w:pStyle w:val="ListBullet"/>
+      </w:pPr>
+      <w:r>
+        <w:t xml:space="preserve">Vehicle and history rows on customer detail had no pointer cursor on hover</w:t>
+      </w:r>
+    </w:p>
+    <w:p>
+      <w:pPr>
+        <w:pStyle w:val="ListBullet"/>
+      </w:pPr>
+      <w:r>
+        <w:t xml:space="preserve">"Show in Finder" opened Finder instead of the PDF</w:t>
+      </w:r>
+    </w:p>
+    <w:p>
+      <w:pPr>
+        <w:pStyle w:val="ListBullet"/>
+      </w:pPr>
+      <w:r>
+        <w:t xml:space="preserve">Right click on those same rows did nothing</w:t>
+      </w:r>
+    </w:p>
+    <w:p>
+      <w:pPr>
+        <w:pStyle w:val="ListBullet"/>
+      </w:pPr>
+      <w:r>
+        <w:t xml:space="preserve">Left click on invoice/estimate/approval/category rows triggered a context menu dropdown instead of a proper action</w:t>
+      </w:r>
+    </w:p>
+    <w:p>
+      <w:r>
+        <w:rPr>
+          <w:b/>
+        </w:rPr>
+        <w:t xml:space="preserve">Bugs fixed</w:t>
+      </w:r>
+    </w:p>
+    <w:p>
+      <w:pPr>
+        <w:pStyle w:val="ListBullet"/>
+      </w:pPr>
+      <w:r>
+        <w:t xml:space="preserve">CLAUDE.md — version bumped to v0.10.1; patch naming convention documented</w:t>
+      </w:r>
+    </w:p>
+    <w:p>
+      <w:pPr>
+        <w:pStyle w:val="ListBullet"/>
+      </w:pPr>
+      <w:r>
+        <w:t xml:space="preserve">README.md — v0.10.1 entry added; v0.7.1 renamed Parts Counter; v0.1.1 renamed Bones</w:t>
+      </w:r>
+    </w:p>
+    <w:p>
+      <w:pPr>
+        <w:pStyle w:val="ListBullet"/>
+      </w:pPr>
+      <w:r>
+        <w:t xml:space="preserve">docs/module_plan.md — v0.1.1 renamed Bones, v0.7.1 renamed Parts Counter, v0.10.1 section added</w:t>
+      </w:r>
+    </w:p>
+    <w:p>
+      <w:pPr>
+        <w:pStyle w:val="ListBullet"/>
+      </w:pPr>
+      <w:r>
+        <w:t xml:space="preserve">lib/features/customers/customer_detail_screen.dart — MouseRegion added to _VehicleTile and _HistoryRow</w:t>
+      </w:r>
+    </w:p>
+    <w:p>
+      <w:pPr>
+        <w:pStyle w:val="ListBullet"/>
+      </w:pPr>
+      <w:r>
+        <w:t xml:space="preserve">lib/features/invoices/invoice_service.dart — _handleSave dialogs: "Show in Finder" replaced with "Open" using open without -R flag; button order swapped (OK default, Open secondary)</w:t>
+      </w:r>
+    </w:p>
+    <w:p>
+      <w:pPr>
+        <w:pStyle w:val="ListBullet"/>
+      </w:pPr>
+      <w:r>
+        <w:t xml:space="preserve">lib/features/inventory/part_form_screen.dart — category picker GestureDetector changed from onTapUp to onTap + onSecondaryTapUp</w:t>
+      </w:r>
+    </w:p>
+    <w:p>
+      <w:pPr>
+        <w:pStyle w:val="ListBullet"/>
+      </w:pPr>
+      <w:r>
+        <w:t xml:space="preserve">lib/features/estimates/estimate_detail_screen.dart — _ActionRow gains onSecondaryTapUp param; Save/Print/Email row uses onTap; approval badge uses onTap + onSecondaryTapUp; _showApprovalSheet takes optional position; Add Parts confirm button replaced with list-row style</w:t>
+      </w:r>
+    </w:p>
+    <w:p>
+      <w:pPr>
+        <w:pStyle w:val="ListBullet"/>
+      </w:pPr>
+      <w:r>
+        <w:t xml:space="preserve">lib/features/repair_orders/ro_detail_screen.dart — invoice GestureDetectors changed from onTapUp to onTap + onSecondaryTapUp</w:t>
+      </w:r>
+    </w:p>
+    <w:p>
+      <w:r>
+        <w:rPr>
+          <w:b/>
+        </w:rPr>
+        <w:t xml:space="preserve">Files modified</w:t>
+      </w:r>
+    </w:p>
+    <w:p>
+      <w:r>
+        <w:t xml:space="preserve">Invoice screens (list + detail) for closed ROs, or continue UX polish.</w:t>
+      </w:r>
+    </w:p>
+    <w:p>
+      <w:r>
+        <w:t xml:space="preserve">Next session</w:t>
       </w:r>
     </w:p>
     <w:p>

</xml_diff>

<commit_message>
v0.10.2 Buttoned Up — audit & bug fixes
- Cascade deletes: customer → vehicles/estimates/line items/ROs
- Archive vendors and technicians (soft-delete, schema v25)
- RO detail tax rate sourced from linked estimate
- Other items now included in invoice PDFs
- Invoice date uses RO service date instead of today
- Stock floor: inventory cannot go below zero
- Complete All: confirmation dialog + skips declined items
- Estimates sorted newest-first
- Search: vehicle year and RO number matching
- Router edit loaders: futures cached in initState (no re-fire)

Co-Authored-By: Claude Sonnet 4.6 <noreply@anthropic.com>
</commit_message>
<xml_diff>
--- a/docs/AutoShopPro_Build_Log.docx
+++ b/docs/AutoShopPro_Build_Log.docx
@@ -1710,6 +1710,332 @@
       </w:pPr>
       <w:r>
         <w:t xml:space="preserve">Build Sessions</w:t>
+      </w:r>
+    </w:p>
+    <w:p>
+      <w:r>
+        <w:t xml:space="preserve"/>
+      </w:r>
+    </w:p>
+    <w:p>
+      <w:pPr>
+        <w:pStyle w:val="Heading2"/>
+      </w:pPr>
+      <w:r>
+        <w:t xml:space="preserve">Session 14 — v0.10.2 Buttoned Up</w:t>
+      </w:r>
+    </w:p>
+    <w:p>
+      <w:r>
+        <w:t xml:space="preserve">Date: March 25, 2026</w:t>
+      </w:r>
+    </w:p>
+    <w:p>
+      <w:r>
+        <w:t xml:space="preserve">Version: v0.10.2 Buttoned Up</w:t>
+      </w:r>
+    </w:p>
+    <w:p>
+      <w:r>
+        <w:t xml:space="preserve">Session: 14</w:t>
+      </w:r>
+    </w:p>
+    <w:p>
+      <w:pPr>
+        <w:pStyle w:val="ListBullet"/>
+      </w:pPr>
+      <w:r>
+        <w:t xml:space="preserve">Router edit loader fix — all 8 edit loader widgets now cache their database future in initState instead of creating it in build(); prevents repeated DB queries on every rebuild</w:t>
+      </w:r>
+    </w:p>
+    <w:p>
+      <w:pPr>
+        <w:pStyle w:val="ListBullet"/>
+      </w:pPr>
+      <w:r>
+        <w:t xml:space="preserve">Search enhancements — vehicle year is now included in vehicle search; typing an RO number (e.g. "RO 42" or just "42") finds the matching repair order</w:t>
+      </w:r>
+    </w:p>
+    <w:p>
+      <w:pPr>
+        <w:pStyle w:val="ListBullet"/>
+      </w:pPr>
+      <w:r>
+        <w:t xml:space="preserve">Estimate list order — estimates now sorted newest-first (by id DESC)</w:t>
+      </w:r>
+    </w:p>
+    <w:p>
+      <w:pPr>
+        <w:pStyle w:val="ListBullet"/>
+      </w:pPr>
+      <w:r>
+        <w:t xml:space="preserve">Complete All improvements — added confirmation dialog showing item count; declined items are now correctly filtered out</w:t>
+      </w:r>
+    </w:p>
+    <w:p>
+      <w:pPr>
+        <w:pStyle w:val="ListBullet"/>
+      </w:pPr>
+      <w:r>
+        <w:t xml:space="preserve">Stock floor — inventory stock can no longer go negative; deductions are clamped to 0 on both individual toggle and Complete All</w:t>
+      </w:r>
+    </w:p>
+    <w:p>
+      <w:pPr>
+        <w:pStyle w:val="ListBullet"/>
+      </w:pPr>
+      <w:r>
+        <w:t xml:space="preserve">Invoice date fix — invoice date was always the PDF generation date (today); now uses the RO service date (or createdAt as fallback)</w:t>
+      </w:r>
+    </w:p>
+    <w:p>
+      <w:pPr>
+        <w:pStyle w:val="ListBullet"/>
+      </w:pPr>
+      <w:r>
+        <w:t xml:space="preserve">Other items in invoices — OTHER line items were missing from both Itemized and Simple invoice PDFs; now included in their own OTHER section</w:t>
+      </w:r>
+    </w:p>
+    <w:p>
+      <w:pPr>
+        <w:pStyle w:val="ListBullet"/>
+      </w:pPr>
+      <w:r>
+        <w:t xml:space="preserve">RO tax rate fix — RO detail and invoice PDFs now read taxRate from the linked estimate instead of defaulting to 0%</w:t>
+      </w:r>
+    </w:p>
+    <w:p>
+      <w:pPr>
+        <w:pStyle w:val="ListBullet"/>
+      </w:pPr>
+      <w:r>
+        <w:t xml:space="preserve">Archive technicians — replaced hard delete with soft-delete (isArchived flag, schema v25); archived technicians hidden from lists and pickers but existing ROs that reference them are preserved</w:t>
+      </w:r>
+    </w:p>
+    <w:p>
+      <w:pPr>
+        <w:pStyle w:val="ListBullet"/>
+      </w:pPr>
+      <w:r>
+        <w:t xml:space="preserve">Archive vendors — replaced hard delete with soft-delete (isArchived flag, schema v25); archived vendors hidden from lists and pickers but all existing records are preserved</w:t>
+      </w:r>
+    </w:p>
+    <w:p>
+      <w:pPr>
+        <w:pStyle w:val="ListBullet"/>
+      </w:pPr>
+      <w:r>
+        <w:t xml:space="preserve">Cascade deletes — deleting a customer now removes all linked vehicles, estimates, line items, and ROs; deleting a vehicle removes its estimates and ROs; deleting an estimate removes its line items; deleting a service template removes its linked parts</w:t>
+      </w:r>
+    </w:p>
+    <w:p>
+      <w:r>
+        <w:rPr>
+          <w:b/>
+        </w:rPr>
+        <w:t xml:space="preserve">What was built</w:t>
+      </w:r>
+    </w:p>
+    <w:p>
+      <w:pPr>
+        <w:pStyle w:val="ListBullet"/>
+      </w:pPr>
+      <w:r>
+        <w:t xml:space="preserve">Edit loader widgets (customer, vehicle, vendor, etc.) re-queried the database on every UI rebuild</w:t>
+      </w:r>
+    </w:p>
+    <w:p>
+      <w:pPr>
+        <w:pStyle w:val="ListBullet"/>
+      </w:pPr>
+      <w:r>
+        <w:t xml:space="preserve">RO number search did not work</w:t>
+      </w:r>
+    </w:p>
+    <w:p>
+      <w:pPr>
+        <w:pStyle w:val="ListBullet"/>
+      </w:pPr>
+      <w:r>
+        <w:t xml:space="preserve">Searching for a vehicle by year returned no results</w:t>
+      </w:r>
+    </w:p>
+    <w:p>
+      <w:pPr>
+        <w:pStyle w:val="ListBullet"/>
+      </w:pPr>
+      <w:r>
+        <w:t xml:space="preserve">Estimate list showed oldest estimates first</w:t>
+      </w:r>
+    </w:p>
+    <w:p>
+      <w:pPr>
+        <w:pStyle w:val="ListBullet"/>
+      </w:pPr>
+      <w:r>
+        <w:t xml:space="preserve">Complete All marked declined items as done and tried to deduct their stock</w:t>
+      </w:r>
+    </w:p>
+    <w:p>
+      <w:pPr>
+        <w:pStyle w:val="ListBullet"/>
+      </w:pPr>
+      <w:r>
+        <w:t xml:space="preserve">Marking parts done on an RO could push stock quantity below zero</w:t>
+      </w:r>
+    </w:p>
+    <w:p>
+      <w:pPr>
+        <w:pStyle w:val="ListBullet"/>
+      </w:pPr>
+      <w:r>
+        <w:t xml:space="preserve">Invoice date showed today's date instead of the RO service date</w:t>
+      </w:r>
+    </w:p>
+    <w:p>
+      <w:pPr>
+        <w:pStyle w:val="ListBullet"/>
+      </w:pPr>
+      <w:r>
+        <w:t xml:space="preserve">Invoice PDFs omitted all "Other" line items entirely</w:t>
+      </w:r>
+    </w:p>
+    <w:p>
+      <w:pPr>
+        <w:pStyle w:val="ListBullet"/>
+      </w:pPr>
+      <w:r>
+        <w:t xml:space="preserve">RO detail showed $0.00 tax even when the estimate had a tax rate set</w:t>
+      </w:r>
+    </w:p>
+    <w:p>
+      <w:pPr>
+        <w:pStyle w:val="ListBullet"/>
+      </w:pPr>
+      <w:r>
+        <w:t xml:space="preserve">Vendors and technicians could be permanently deleted, breaking historical line items and ROs that referenced them</w:t>
+      </w:r>
+    </w:p>
+    <w:p>
+      <w:pPr>
+        <w:pStyle w:val="ListBullet"/>
+      </w:pPr>
+      <w:r>
+        <w:t xml:space="preserve">Deleting a customer left orphaned vehicles, estimates, line items, and ROs in the database</w:t>
+      </w:r>
+    </w:p>
+    <w:p>
+      <w:r>
+        <w:rPr>
+          <w:b/>
+        </w:rPr>
+        <w:t xml:space="preserve">Bugs fixed</w:t>
+      </w:r>
+    </w:p>
+    <w:p>
+      <w:pPr>
+        <w:pStyle w:val="ListBullet"/>
+      </w:pPr>
+      <w:r>
+        <w:t xml:space="preserve">CLAUDE.md — version bumped to v0.10.2</w:t>
+      </w:r>
+    </w:p>
+    <w:p>
+      <w:pPr>
+        <w:pStyle w:val="ListBullet"/>
+      </w:pPr>
+      <w:r>
+        <w:t xml:space="preserve">README.md — v0.10.2 entry added</w:t>
+      </w:r>
+    </w:p>
+    <w:p>
+      <w:pPr>
+        <w:pStyle w:val="ListBullet"/>
+      </w:pPr>
+      <w:r>
+        <w:t xml:space="preserve">docs/module_plan.md — v0.10.2 audit section added</w:t>
+      </w:r>
+    </w:p>
+    <w:p>
+      <w:pPr>
+        <w:pStyle w:val="ListBullet"/>
+      </w:pPr>
+      <w:r>
+        <w:t xml:space="preserve">lib/router.dart — all 8 edit loaders converted to cached futures in initState or StreamProvider.when()</w:t>
+      </w:r>
+    </w:p>
+    <w:p>
+      <w:pPr>
+        <w:pStyle w:val="ListBullet"/>
+      </w:pPr>
+      <w:r>
+        <w:t xml:space="preserve">lib/features/customers/customers_provider.dart — added customerProvider and vehicleProvider StreamProvider.family</w:t>
+      </w:r>
+    </w:p>
+    <w:p>
+      <w:pPr>
+        <w:pStyle w:val="ListBullet"/>
+      </w:pPr>
+      <w:r>
+        <w:t xml:space="preserve">lib/features/repair_orders/ro_detail_screen.dart — tax rate from linked estimate, Complete All confirmation + declined filter, stock floor clamping</w:t>
+      </w:r>
+    </w:p>
+    <w:p>
+      <w:pPr>
+        <w:pStyle w:val="ListBullet"/>
+      </w:pPr>
+      <w:r>
+        <w:t xml:space="preserve">lib/features/invoices/invoice_service.dart — OTHER section in both PDF builders, invoice date from serviceDate</w:t>
+      </w:r>
+    </w:p>
+    <w:p>
+      <w:pPr>
+        <w:pStyle w:val="ListBullet"/>
+      </w:pPr>
+      <w:r>
+        <w:t xml:space="preserve">lib/features/technicians/technician_form_screen.dart — archive instead of delete, contextMenuBuilder on fields</w:t>
+      </w:r>
+    </w:p>
+    <w:p>
+      <w:pPr>
+        <w:pStyle w:val="ListBullet"/>
+      </w:pPr>
+      <w:r>
+        <w:t xml:space="preserve">lib/features/vendors/vendor_list_screen.dart — archive instead of delete in context menu and dialog</w:t>
+      </w:r>
+    </w:p>
+    <w:p>
+      <w:pPr>
+        <w:pStyle w:val="ListBullet"/>
+      </w:pPr>
+      <w:r>
+        <w:t xml:space="preserve">lib/features/vendors/vendor_form_screen.dart — archive instead of delete, contextMenuBuilder on fields</w:t>
+      </w:r>
+    </w:p>
+    <w:p>
+      <w:pPr>
+        <w:pStyle w:val="ListBullet"/>
+      </w:pPr>
+      <w:r>
+        <w:t xml:space="preserve">lib/database/database.dart — isArchived on vendors and technicians (schema v25), cascade deletes, watchAllVendors/watchAllTechnicians filter archived, archiveVendor/archiveTechnician methods, estimate list orderBy, search enhancements</w:t>
+      </w:r>
+    </w:p>
+    <w:p>
+      <w:r>
+        <w:rPr>
+          <w:b/>
+        </w:rPr>
+        <w:t xml:space="preserve">Files modified</w:t>
+      </w:r>
+    </w:p>
+    <w:p>
+      <w:r>
+        <w:t xml:space="preserve">Invoice screens (list + detail) for closed ROs, or payments module.</w:t>
+      </w:r>
+    </w:p>
+    <w:p>
+      <w:r>
+        <w:t xml:space="preserve">Next session</w:t>
       </w:r>
     </w:p>
     <w:p>

</xml_diff>

<commit_message>
v0.10.3 Buttoned Up — data integrity overhaul
- All price/cost/rate DB columns converted from REAL to INTEGER cents (schema v26)
- New lib/core/utils/money.dart: toCents(), fromCents(), formatMoney(), formatMoneyFull()
- Foreign key constraints (.references()) on all FK columns; PRAGMA foreign_keys = ON at DB open
- Multi-step DAO deletes wrapped in transaction() for atomicity
- analysis_options.yaml upgraded to production-strict lint rules
- MIT LICENSE file added (ShopRag Labs)
- All UI screens, PDFs, and CSV import/export updated to use cents helpers

Co-Authored-By: Claude Sonnet 4.6 <noreply@anthropic.com>
</commit_message>
<xml_diff>
--- a/docs/AutoShopPro_Build_Log.docx
+++ b/docs/AutoShopPro_Build_Log.docx
@@ -1710,6 +1710,284 @@
       </w:pPr>
       <w:r>
         <w:t xml:space="preserve">Build Sessions</w:t>
+      </w:r>
+    </w:p>
+    <w:p>
+      <w:r>
+        <w:t xml:space="preserve"/>
+      </w:r>
+    </w:p>
+    <w:p>
+      <w:pPr>
+        <w:pStyle w:val="Heading2"/>
+      </w:pPr>
+      <w:r>
+        <w:t xml:space="preserve">Session 15 — v0.10.3 Buttoned Up</w:t>
+      </w:r>
+    </w:p>
+    <w:p>
+      <w:r>
+        <w:t xml:space="preserve">Date: March 25, 2026</w:t>
+      </w:r>
+    </w:p>
+    <w:p>
+      <w:r>
+        <w:t xml:space="preserve">Version: v0.10.3 Buttoned Up</w:t>
+      </w:r>
+    </w:p>
+    <w:p>
+      <w:r>
+        <w:t xml:space="preserve">Session: 15</w:t>
+      </w:r>
+    </w:p>
+    <w:p>
+      <w:pPr>
+        <w:pStyle w:val="ListBullet"/>
+      </w:pPr>
+      <w:r>
+        <w:t xml:space="preserve">Strict linting — analysis_options.yaml upgraded with production-strict rules: missing_return as error, avoid_print, avoid_dynamic_calls, unawaited_futures, always_declare_return_types, and more</w:t>
+      </w:r>
+    </w:p>
+    <w:p>
+      <w:pPr>
+        <w:pStyle w:val="ListBullet"/>
+      </w:pPr>
+      <w:r>
+        <w:t xml:space="preserve">Transaction safety — deleteCustomer, deleteVehicle, deleteEstimate, deleteServiceTemplate, and clearAllCustomerData all wrapped in transaction() for atomicity</w:t>
+      </w:r>
+    </w:p>
+    <w:p>
+      <w:pPr>
+        <w:pStyle w:val="ListBullet"/>
+      </w:pPr>
+      <w:r>
+        <w:t xml:space="preserve">Foreign key constraints — all FK columns annotated with .references() and onDelete cascade/setNull; PRAGMA foreign_keys = ON enabled at DB open time</w:t>
+      </w:r>
+    </w:p>
+    <w:p>
+      <w:pPr>
+        <w:pStyle w:val="ListBullet"/>
+      </w:pPr>
+      <w:r>
+        <w:t xml:space="preserve">money.dart utility — new lib/core/utils/money.dart with toCents(), fromCents(), formatMoney() (omits .00 in UI), and formatMoneyFull() (always 2 decimal places for PDFs)</w:t>
+      </w:r>
+    </w:p>
+    <w:p>
+      <w:pPr>
+        <w:pStyle w:val="ListBullet"/>
+      </w:pPr>
+      <w:r>
+        <w:t xml:space="preserve">Money as integer cents — all price/cost/rate columns in the database converted from REAL (floating point) to INTEGER (cents); eliminates floating-point rounding errors on financial totals; schema v26 migration converts existing data via ROUND(col * 100)</w:t>
+      </w:r>
+    </w:p>
+    <w:p>
+      <w:pPr>
+        <w:pStyle w:val="ListBullet"/>
+      </w:pPr>
+      <w:r>
+        <w:t xml:space="preserve">MIT LICENSE — added standard MIT license file at repo root (copyright ShopRag Labs)</w:t>
+      </w:r>
+    </w:p>
+    <w:p>
+      <w:r>
+        <w:rPr>
+          <w:b/>
+        </w:rPr>
+        <w:t xml:space="preserve">What was built</w:t>
+      </w:r>
+    </w:p>
+    <w:p>
+      <w:pPr>
+        <w:pStyle w:val="ListBullet"/>
+      </w:pPr>
+      <w:r>
+        <w:t xml:space="preserve">Multi-step delete operations (cascade delete customer + all children) were not atomic — a crash mid-way could leave data in a partial state</w:t>
+      </w:r>
+    </w:p>
+    <w:p>
+      <w:pPr>
+        <w:pStyle w:val="ListBullet"/>
+      </w:pPr>
+      <w:r>
+        <w:t xml:space="preserve">No foreign key enforcement — deleting a parent record could silently leave orphaned children with no referential integrity check at the DB level</w:t>
+      </w:r>
+    </w:p>
+    <w:p>
+      <w:pPr>
+        <w:pStyle w:val="ListBullet"/>
+      </w:pPr>
+      <w:r>
+        <w:t xml:space="preserve">All price/cost/rate values were stored as REAL (floating point) in SQLite, causing rounding errors on financial totals (e.g. $120.00 stored as 119.99999... cents)</w:t>
+      </w:r>
+    </w:p>
+    <w:p>
+      <w:r>
+        <w:rPr>
+          <w:b/>
+        </w:rPr>
+        <w:t xml:space="preserve">Bugs fixed</w:t>
+      </w:r>
+    </w:p>
+    <w:p>
+      <w:pPr>
+        <w:pStyle w:val="ListBullet"/>
+      </w:pPr>
+      <w:r>
+        <w:t xml:space="preserve">lib/core/utils/money.dart — toCents(), fromCents(), formatMoney(), formatMoneyFull()</w:t>
+      </w:r>
+    </w:p>
+    <w:p>
+      <w:pPr>
+        <w:pStyle w:val="ListBullet"/>
+      </w:pPr>
+      <w:r>
+        <w:t xml:space="preserve">LICENSE — MIT license (ShopRag Labs)</w:t>
+      </w:r>
+    </w:p>
+    <w:p>
+      <w:r>
+        <w:rPr>
+          <w:b/>
+        </w:rPr>
+        <w:t xml:space="preserve">Files added</w:t>
+      </w:r>
+    </w:p>
+    <w:p>
+      <w:pPr>
+        <w:pStyle w:val="ListBullet"/>
+      </w:pPr>
+      <w:r>
+        <w:t xml:space="preserve">CLAUDE.md — version bumped to v0.10.3</w:t>
+      </w:r>
+    </w:p>
+    <w:p>
+      <w:pPr>
+        <w:pStyle w:val="ListBullet"/>
+      </w:pPr>
+      <w:r>
+        <w:t xml:space="preserve">README.md — v0.10.3 entry</w:t>
+      </w:r>
+    </w:p>
+    <w:p>
+      <w:pPr>
+        <w:pStyle w:val="ListBullet"/>
+      </w:pPr>
+      <w:r>
+        <w:t xml:space="preserve">docs/module_plan.md — v0.10.3 section added</w:t>
+      </w:r>
+    </w:p>
+    <w:p>
+      <w:pPr>
+        <w:pStyle w:val="ListBullet"/>
+      </w:pPr>
+      <w:r>
+        <w:t xml:space="preserve">analysis_options.yaml — upgraded to production-strict lint rules</w:t>
+      </w:r>
+    </w:p>
+    <w:p>
+      <w:pPr>
+        <w:pStyle w:val="ListBullet"/>
+      </w:pPr>
+      <w:r>
+        <w:t xml:space="preserve">lib/features/data/data_service.dart — toCents() on CSV import inserts, fromCents() on CSV export display</w:t>
+      </w:r>
+    </w:p>
+    <w:p>
+      <w:pPr>
+        <w:pStyle w:val="ListBullet"/>
+      </w:pPr>
+      <w:r>
+        <w:t xml:space="preserve">lib/features/repair_orders/ro_detail_screen.dart — fromCents() on all unitPrice display and total calculations</w:t>
+      </w:r>
+    </w:p>
+    <w:p>
+      <w:pPr>
+        <w:pStyle w:val="ListBullet"/>
+      </w:pPr>
+      <w:r>
+        <w:t xml:space="preserve">lib/features/invoices/invoice_service.dart — fromCents() on all unitPrice calculations and PDF display in all 3 invoice builders</w:t>
+      </w:r>
+    </w:p>
+    <w:p>
+      <w:pPr>
+        <w:pStyle w:val="ListBullet"/>
+      </w:pPr>
+      <w:r>
+        <w:t xml:space="preserve">lib/features/service_templates/service_template_form_screen.dart — toCents()/fromCents() on defaultRate</w:t>
+      </w:r>
+    </w:p>
+    <w:p>
+      <w:pPr>
+        <w:pStyle w:val="ListBullet"/>
+      </w:pPr>
+      <w:r>
+        <w:t xml:space="preserve">lib/features/settings/settings_screen.dart — toCents()/fromCents() on labor rate and markup rule min/max cost</w:t>
+      </w:r>
+    </w:p>
+    <w:p>
+      <w:pPr>
+        <w:pStyle w:val="ListBullet"/>
+      </w:pPr>
+      <w:r>
+        <w:t xml:space="preserve">lib/features/inventory/part_list_screen.dart — formatMoney() for sellPrice display</w:t>
+      </w:r>
+    </w:p>
+    <w:p>
+      <w:pPr>
+        <w:pStyle w:val="ListBullet"/>
+      </w:pPr>
+      <w:r>
+        <w:t xml:space="preserve">lib/features/inventory/part_form_screen.dart — toCents()/fromCents() on cost and sellPrice</w:t>
+      </w:r>
+    </w:p>
+    <w:p>
+      <w:pPr>
+        <w:pStyle w:val="ListBullet"/>
+      </w:pPr>
+      <w:r>
+        <w:t xml:space="preserve">lib/features/estimates/estimate_list_screen.dart — fromCents() in subtotal fold</w:t>
+      </w:r>
+    </w:p>
+    <w:p>
+      <w:pPr>
+        <w:pStyle w:val="ListBullet"/>
+      </w:pPr>
+      <w:r>
+        <w:t xml:space="preserve">lib/features/estimates/estimate_detail_screen.dart — fromCents() on all display and total calculations</w:t>
+      </w:r>
+    </w:p>
+    <w:p>
+      <w:pPr>
+        <w:pStyle w:val="ListBullet"/>
+      </w:pPr>
+      <w:r>
+        <w:t xml:space="preserve">lib/features/estimates/line_item_form_screen.dart — toCents()/fromCents() on all read/write paths, template part sellPrice conversion</w:t>
+      </w:r>
+    </w:p>
+    <w:p>
+      <w:pPr>
+        <w:pStyle w:val="ListBullet"/>
+      </w:pPr>
+      <w:r>
+        <w:t xml:space="preserve">lib/database/database.dart — schema v26, money columns REAL→INTEGER, FK .references() annotations, PRAGMA foreign_keys = ON, transaction() wrapping on 5 DAO delete methods</w:t>
+      </w:r>
+    </w:p>
+    <w:p>
+      <w:r>
+        <w:rPr>
+          <w:b/>
+        </w:rPr>
+        <w:t xml:space="preserve">Files modified</w:t>
+      </w:r>
+    </w:p>
+    <w:p>
+      <w:r>
+        <w:t xml:space="preserve">Invoice list + detail screens for closed ROs, or payments module.</w:t>
+      </w:r>
+    </w:p>
+    <w:p>
+      <w:r>
+        <w:t xml:space="preserve">Next session</w:t>
       </w:r>
     </w:p>
     <w:p>

</xml_diff>

<commit_message>
v0.11.0 On the Books — invoice list + dashboard KPIs
- Invoice list screen: Invoices sidebar item shows all closed ROs as
  invoices (INV-XXXX, customer, vehicle, date) with search
- Dashboard screen: KPI cards for open ROs, this-month revenue +
  invoice count, all-time totals and ARO
- dashboard_provider.dart: FutureProvider.autoDispose calculates KPIs
  from closed ROs and their line items
- getLineItemsForEstimate() DB method for one-time line item fetch
- About dialog version corrected to 0.10.3
- Sidebar "Payments" renamed to "Invoices" with doc icon

Co-Authored-By: Claude Sonnet 4.6 <noreply@anthropic.com>
</commit_message>
<xml_diff>
--- a/docs/AutoShopPro_Build_Log.docx
+++ b/docs/AutoShopPro_Build_Log.docx
@@ -1710,6 +1710,220 @@
       </w:pPr>
       <w:r>
         <w:t xml:space="preserve">Build Sessions</w:t>
+      </w:r>
+    </w:p>
+    <w:p>
+      <w:r>
+        <w:t xml:space="preserve"/>
+      </w:r>
+    </w:p>
+    <w:p>
+      <w:pPr>
+        <w:pStyle w:val="Heading2"/>
+      </w:pPr>
+      <w:r>
+        <w:t xml:space="preserve">Session 16 — v0.11.0 On the Books</w:t>
+      </w:r>
+    </w:p>
+    <w:p>
+      <w:r>
+        <w:t xml:space="preserve">Date: March 27, 2026</w:t>
+      </w:r>
+    </w:p>
+    <w:p>
+      <w:r>
+        <w:t xml:space="preserve">Version: v0.11.0 On the Books</w:t>
+      </w:r>
+    </w:p>
+    <w:p>
+      <w:r>
+        <w:t xml:space="preserve">Session: 16</w:t>
+      </w:r>
+    </w:p>
+    <w:p>
+      <w:pPr>
+        <w:pStyle w:val="ListBullet"/>
+      </w:pPr>
+      <w:r>
+        <w:t xml:space="preserve">Default permission mode set to acceptEdits in ~/.claude/settings.json — tool calls no longer prompt for file read/write permission</w:t>
+      </w:r>
+    </w:p>
+    <w:p>
+      <w:pPr>
+        <w:pStyle w:val="ListBullet"/>
+      </w:pPr>
+      <w:r>
+        <w:t xml:space="preserve">Sidebar "Payments" renamed to "Invoices" with document icon to match the new screen name</w:t>
+      </w:r>
+    </w:p>
+    <w:p>
+      <w:pPr>
+        <w:pStyle w:val="ListBullet"/>
+      </w:pPr>
+      <w:r>
+        <w:t xml:space="preserve">About dialog version fixed — was still showing "Version 0.5.0"; now correctly shows v0.10.3</w:t>
+      </w:r>
+    </w:p>
+    <w:p>
+      <w:pPr>
+        <w:pStyle w:val="ListBullet"/>
+      </w:pPr>
+      <w:r>
+        <w:t xml:space="preserve">getLineItemsForEstimate() DB method — one-time (non-streaming) fetch of all line items for an estimate; used by dashboard revenue calculation to avoid N+1 stream subscriptions</w:t>
+      </w:r>
+    </w:p>
+    <w:p>
+      <w:pPr>
+        <w:pStyle w:val="ListBullet"/>
+      </w:pPr>
+      <w:r>
+        <w:t xml:space="preserve">dashboard_provider.dart — FutureProvider.autoDispose calculates all KPI values from closed ROs + their line items; refresh button in nav bar to recalculate on demand</w:t>
+      </w:r>
+    </w:p>
+    <w:p>
+      <w:pPr>
+        <w:pStyle w:val="ListBullet"/>
+      </w:pPr>
+      <w:r>
+        <w:t xml:space="preserve">Dashboard screen — replaces Dashboard placeholder with live KPI cards: Open ROs (live), Invoices This Month, Revenue This Month, Total Invoices All Time, Total Revenue All Time, and ARO (average repair order all time)</w:t>
+      </w:r>
+    </w:p>
+    <w:p>
+      <w:pPr>
+        <w:pStyle w:val="ListBullet"/>
+      </w:pPr>
+      <w:r>
+        <w:t xml:space="preserve">Invoice list screen — "Invoices" sidebar item (was Payments placeholder) now shows all closed ROs as invoices; each row displays invoice number (INV-XXXX), customer name, vehicle, and service date; searchable by invoice number, customer, or vehicle; empty state guides user to close an RO</w:t>
+      </w:r>
+    </w:p>
+    <w:p>
+      <w:r>
+        <w:rPr>
+          <w:b/>
+        </w:rPr>
+        <w:t xml:space="preserve">What was built</w:t>
+      </w:r>
+    </w:p>
+    <w:p>
+      <w:pPr>
+        <w:pStyle w:val="ListBullet"/>
+      </w:pPr>
+      <w:r>
+        <w:t xml:space="preserve">Sidebar "Payments" label did not match the actual module (invoices, not payment processing)</w:t>
+      </w:r>
+    </w:p>
+    <w:p>
+      <w:pPr>
+        <w:pStyle w:val="ListBullet"/>
+      </w:pPr>
+      <w:r>
+        <w:t xml:space="preserve">About dialog showed stale version number "Version 0.5.0" despite app being on v0.10.3</w:t>
+      </w:r>
+    </w:p>
+    <w:p>
+      <w:r>
+        <w:rPr>
+          <w:b/>
+        </w:rPr>
+        <w:t xml:space="preserve">Bugs fixed</w:t>
+      </w:r>
+    </w:p>
+    <w:p>
+      <w:pPr>
+        <w:pStyle w:val="ListBullet"/>
+      </w:pPr>
+      <w:r>
+        <w:t xml:space="preserve">lib/features/dashboard/dashboard_provider.dart — FutureProvider.autoDispose for KPI calculation</w:t>
+      </w:r>
+    </w:p>
+    <w:p>
+      <w:pPr>
+        <w:pStyle w:val="ListBullet"/>
+      </w:pPr>
+      <w:r>
+        <w:t xml:space="preserve">lib/features/dashboard/dashboard_screen.dart — KPI dashboard with grouped stats sections</w:t>
+      </w:r>
+    </w:p>
+    <w:p>
+      <w:pPr>
+        <w:pStyle w:val="ListBullet"/>
+      </w:pPr>
+      <w:r>
+        <w:t xml:space="preserve">lib/features/invoices/invoice_list_screen.dart — invoice list with search, hover rows, empty state</w:t>
+      </w:r>
+    </w:p>
+    <w:p>
+      <w:r>
+        <w:rPr>
+          <w:b/>
+        </w:rPr>
+        <w:t xml:space="preserve">Files added</w:t>
+      </w:r>
+    </w:p>
+    <w:p>
+      <w:pPr>
+        <w:pStyle w:val="ListBullet"/>
+      </w:pPr>
+      <w:r>
+        <w:t xml:space="preserve">CLAUDE.md — version bumped to v0.11.0</w:t>
+      </w:r>
+    </w:p>
+    <w:p>
+      <w:pPr>
+        <w:pStyle w:val="ListBullet"/>
+      </w:pPr>
+      <w:r>
+        <w:t xml:space="preserve">README.md — v0.11.0 entry</w:t>
+      </w:r>
+    </w:p>
+    <w:p>
+      <w:pPr>
+        <w:pStyle w:val="ListBullet"/>
+      </w:pPr>
+      <w:r>
+        <w:t xml:space="preserve">docs/module_plan.md — v0.11.0 section added; invoice list + dashboard items checked off</w:t>
+      </w:r>
+    </w:p>
+    <w:p>
+      <w:pPr>
+        <w:pStyle w:val="ListBullet"/>
+      </w:pPr>
+      <w:r>
+        <w:t xml:space="preserve">lib/main.dart — About dialog version updated to 0.10.3; sidebar label changed to "Invoices" with doc icon</w:t>
+      </w:r>
+    </w:p>
+    <w:p>
+      <w:pPr>
+        <w:pStyle w:val="ListBullet"/>
+      </w:pPr>
+      <w:r>
+        <w:t xml:space="preserve">lib/router.dart — /payments routes to InvoiceListScreen; /dashboard routes to DashboardScreen; added imports</w:t>
+      </w:r>
+    </w:p>
+    <w:p>
+      <w:pPr>
+        <w:pStyle w:val="ListBullet"/>
+      </w:pPr>
+      <w:r>
+        <w:t xml:space="preserve">lib/database/database.dart — added getLineItemsForEstimate() one-time fetch method</w:t>
+      </w:r>
+    </w:p>
+    <w:p>
+      <w:r>
+        <w:rPr>
+          <w:b/>
+        </w:rPr>
+        <w:t xml:space="preserve">Files modified</w:t>
+      </w:r>
+    </w:p>
+    <w:p>
+      <w:r>
+        <w:t xml:space="preserve">Invoice detail screen, date range picker on dashboard, or payment processing (Stripe/Square).</w:t>
+      </w:r>
+    </w:p>
+    <w:p>
+      <w:r>
+        <w:t xml:space="preserve">Next session</w:t>
       </w:r>
     </w:p>
     <w:p>

</xml_diff>

<commit_message>
v0.12.0 Full Picture — dashboard expansion, PDF view, nav restructure
- Service date bug fixed (schema v31): Drift stores DateTimes as UNIX
  seconds; prior migrations wrote milliseconds causing year ~58,023
  display; corrected values for all 12 existing ROs
- Service date now editable from estimate detail (roForEstimateProvider)
  and read-only on RO detail screen
- Dashboard: Today, This Week, This Year sections added; gross profit
  dollar amounts in every time period; car count on month/year
- "View PDF" added to invoice action sheet and right-click menu —
  opens PDF directly in Preview with no dialog
- Sidebar renamed "Repair Orders" → "Records"; Invoices moved into
  Records hub alongside Customers, Estimates, Repair Orders, Vendors;
  Payments added as future sidebar placeholder
- Records hub order: Customers → Estimates → Repair Orders → Invoices
  → Vendors
- README v0.10.2 entry backfilled

Co-Authored-By: Claude Sonnet 4.6 <noreply@anthropic.com>
</commit_message>
<xml_diff>
--- a/docs/AutoShopPro_Build_Log.docx
+++ b/docs/AutoShopPro_Build_Log.docx
@@ -1710,6 +1710,244 @@
       </w:pPr>
       <w:r>
         <w:t xml:space="preserve">Build Sessions</w:t>
+      </w:r>
+    </w:p>
+    <w:p>
+      <w:r>
+        <w:t xml:space="preserve"/>
+      </w:r>
+    </w:p>
+    <w:p>
+      <w:pPr>
+        <w:pStyle w:val="Heading2"/>
+      </w:pPr>
+      <w:r>
+        <w:t xml:space="preserve">Session 17 — v0.12.0 Full Picture</w:t>
+      </w:r>
+    </w:p>
+    <w:p>
+      <w:r>
+        <w:t xml:space="preserve">Date: March 29, 2026</w:t>
+      </w:r>
+    </w:p>
+    <w:p>
+      <w:r>
+        <w:t xml:space="preserve">Version: v0.12.0 Full Picture</w:t>
+      </w:r>
+    </w:p>
+    <w:p>
+      <w:r>
+        <w:t xml:space="preserve">Session: 17</w:t>
+      </w:r>
+    </w:p>
+    <w:p>
+      <w:pPr>
+        <w:pStyle w:val="ListBullet"/>
+      </w:pPr>
+      <w:r>
+        <w:t xml:space="preserve">README backfilled v0.10.2 entry that was missing between v0.10.3 and v0.10.1</w:t>
+      </w:r>
+    </w:p>
+    <w:p>
+      <w:pPr>
+        <w:pStyle w:val="ListBullet"/>
+      </w:pPr>
+      <w:r>
+        <w:t xml:space="preserve">Records hub screen order updated: Customers → Estimates → Repair Orders → Invoices → Vendors</w:t>
+      </w:r>
+    </w:p>
+    <w:p>
+      <w:pPr>
+        <w:pStyle w:val="ListBullet"/>
+      </w:pPr>
+      <w:r>
+        <w:t xml:space="preserve">Sidebar "Repair Orders" renamed to "Records"; Invoices moved inside the Records hub screen alongside Customers, Estimates, Repair Orders, Vendors; "Payments" item added to sidebar as future placeholder</w:t>
+      </w:r>
+    </w:p>
+    <w:p>
+      <w:pPr>
+        <w:pStyle w:val="ListBullet"/>
+      </w:pPr>
+      <w:r>
+        <w:t xml:space="preserve">"View PDF" option — first item in invoice action sheet (isDefaultAction: true) and right-click context menu; saves to temp file and opens in Preview with no print dialog</w:t>
+      </w:r>
+    </w:p>
+    <w:p>
+      <w:pPr>
+        <w:pStyle w:val="ListBullet"/>
+      </w:pPr>
+      <w:r>
+        <w:t xml:space="preserve">Gross profit added to every dashboard section — revenue minus known part costs; labor treated as 100% margin since technician wages are not tracked</w:t>
+      </w:r>
+    </w:p>
+    <w:p>
+      <w:pPr>
+        <w:pStyle w:val="ListBullet"/>
+      </w:pPr>
+      <w:r>
+        <w:t xml:space="preserve">Dashboard "This Year" section — invoices closed, revenue, gross profit, and car count for the current calendar year; uses Apple indigo color (#5856D6)</w:t>
+      </w:r>
+    </w:p>
+    <w:p>
+      <w:pPr>
+        <w:pStyle w:val="ListBullet"/>
+      </w:pPr>
+      <w:r>
+        <w:t xml:space="preserve">Dashboard "Today" and "This Week" sections — invoices closed, revenue, and gross profit for each period</w:t>
+      </w:r>
+    </w:p>
+    <w:p>
+      <w:pPr>
+        <w:pStyle w:val="ListBullet"/>
+      </w:pPr>
+      <w:r>
+        <w:t xml:space="preserve">Service date UX — read-only on RO detail screen; editable from within estimate detail via roForEstimateProvider (tappable blue row, date picker, 2-year future limit)</w:t>
+      </w:r>
+    </w:p>
+    <w:p>
+      <w:pPr>
+        <w:pStyle w:val="ListBullet"/>
+      </w:pPr>
+      <w:r>
+        <w:t xml:space="preserve">Service date bug root-cause fix — Drift stores DateTimes as UNIX seconds; prior migrations v27–v30 wrote millisecond values causing dates to display as year ~58,023; fixed in schema v31 with correct local-timezone second values for all 12 existing ROs; safety net clears any remaining out-of-range values</w:t>
+      </w:r>
+    </w:p>
+    <w:p>
+      <w:r>
+        <w:rPr>
+          <w:b/>
+        </w:rPr>
+        <w:t xml:space="preserve">What was built</w:t>
+      </w:r>
+    </w:p>
+    <w:p>
+      <w:pPr>
+        <w:pStyle w:val="ListBullet"/>
+      </w:pPr>
+      <w:r>
+        <w:t xml:space="preserve">Edit buttons on RO detail were confusing — "Edit Record" navigated to estimate; simplified to single "Edit Line Items" → estimate flow; service date now editable from within estimate detail</w:t>
+      </w:r>
+    </w:p>
+    <w:p>
+      <w:pPr>
+        <w:pStyle w:val="ListBullet"/>
+      </w:pPr>
+      <w:r>
+        <w:t xml:space="preserve">All service dates displayed as "—" — root cause: Drift reads stored integer as seconds × 1000 but migrations wrote millisecond timestamps, resulting in DateTime year ~58,023 which _fmtDate rejected as out of range</w:t>
+      </w:r>
+    </w:p>
+    <w:p>
+      <w:r>
+        <w:rPr>
+          <w:b/>
+        </w:rPr>
+        <w:t xml:space="preserve">Bugs fixed</w:t>
+      </w:r>
+    </w:p>
+    <w:p>
+      <w:pPr>
+        <w:pStyle w:val="ListBullet"/>
+      </w:pPr>
+      <w:r>
+        <w:t xml:space="preserve">CLAUDE.md — version bumped to v0.12.0</w:t>
+      </w:r>
+    </w:p>
+    <w:p>
+      <w:pPr>
+        <w:pStyle w:val="ListBullet"/>
+      </w:pPr>
+      <w:r>
+        <w:t xml:space="preserve">README.md — v0.12.0 entry added; v0.10.2 entry backfilled</w:t>
+      </w:r>
+    </w:p>
+    <w:p>
+      <w:pPr>
+        <w:pStyle w:val="ListBullet"/>
+      </w:pPr>
+      <w:r>
+        <w:t xml:space="preserve">docs/module_plan.md — v0.12.0 section added; dashboard KPI items updated</w:t>
+      </w:r>
+    </w:p>
+    <w:p>
+      <w:pPr>
+        <w:pStyle w:val="ListBullet"/>
+      </w:pPr>
+      <w:r>
+        <w:t xml:space="preserve">lib/main.dart — sidebar "Repair Orders"→"Records"; "Payments" item added; _selectedIndex cleaned up</w:t>
+      </w:r>
+    </w:p>
+    <w:p>
+      <w:pPr>
+        <w:pStyle w:val="ListBullet"/>
+      </w:pPr>
+      <w:r>
+        <w:t xml:space="preserve">lib/features/repair_orders/repair_orders_screen.dart — title "Records"; Invoices row added; order: Customers, Estimates, Repair Orders, Invoices, Vendors</w:t>
+      </w:r>
+    </w:p>
+    <w:p>
+      <w:pPr>
+        <w:pStyle w:val="ListBullet"/>
+      </w:pPr>
+      <w:r>
+        <w:t xml:space="preserve">lib/features/invoices/invoice_service.dart — _handleView() saves to temp and opens in Preview; "View PDF" added to action sheet and right-click menu</w:t>
+      </w:r>
+    </w:p>
+    <w:p>
+      <w:pPr>
+        <w:pStyle w:val="ListBullet"/>
+      </w:pPr>
+      <w:r>
+        <w:t xml:space="preserve">lib/features/dashboard/dashboard_screen.dart — Today, This Week, This Year sections added; Gross Profit row in every section</w:t>
+      </w:r>
+    </w:p>
+    <w:p>
+      <w:pPr>
+        <w:pStyle w:val="ListBullet"/>
+      </w:pPr>
+      <w:r>
+        <w:t xml:space="preserve">lib/features/dashboard/dashboard_provider.dart — added closedThisYear, revenueThisYear, carCountThisYear, grossProfitToday, grossProfitThisWeek, grossProfitThisMonth, grossProfitThisYear, grossProfitAllTime to DashboardStats; year date range; GP calculation per RO</w:t>
+      </w:r>
+    </w:p>
+    <w:p>
+      <w:pPr>
+        <w:pStyle w:val="ListBullet"/>
+      </w:pPr>
+      <w:r>
+        <w:t xml:space="preserve">lib/features/estimates/estimate_detail_screen.dart — service date row added (editable via roForEstimateProvider); _pickServiceDate() with 2-year future limit</w:t>
+      </w:r>
+    </w:p>
+    <w:p>
+      <w:pPr>
+        <w:pStyle w:val="ListBullet"/>
+      </w:pPr>
+      <w:r>
+        <w:t xml:space="preserve">lib/features/repair_orders/ro_detail_screen.dart — service date row read-only; edit buttons simplified</w:t>
+      </w:r>
+    </w:p>
+    <w:p>
+      <w:pPr>
+        <w:pStyle w:val="ListBullet"/>
+      </w:pPr>
+      <w:r>
+        <w:t xml:space="preserve">lib/database/database.dart — schemaVersion 30→31; migration v31 corrects service_date and created_at for ROs 1–12 to proper UNIX seconds; safety net clears values &gt; 4102444800</w:t>
+      </w:r>
+    </w:p>
+    <w:p>
+      <w:r>
+        <w:rPr>
+          <w:b/>
+        </w:rPr>
+        <w:t xml:space="preserve">Files modified</w:t>
+      </w:r>
+    </w:p>
+    <w:p>
+      <w:r>
+        <w:t xml:space="preserve">Payment processing (Stripe/Square), invoice detail standalone screen, or technician performance dashboard.</w:t>
+      </w:r>
+    </w:p>
+    <w:p>
+      <w:r>
+        <w:t xml:space="preserve">Next session</w:t>
       </w:r>
     </w:p>
     <w:p>

</xml_diff>

<commit_message>
v0.12.1 Full Picture — Phase 1 production audit fixes
12 critical/high issues resolved:
- AppleScript injection: escape email + path before osascript interpolation
- Estimate locking: read-only when linked RO is closed (open ROs still editable)
- N+1 queries eliminated: bulk line item fetch in dashboard, invoiceTotals, customerStats
- Integer-cents subtotals: all 4 total sites stay in cents; no float rounding
- GP formula: invoice detail only deducts unitCost > 0 items
- Convert-to-RO: atomic db.transaction() + double-tap guard (_converting bool)
- Stock deduction: _toggleDone and _completeAll wrapped in db.transaction()
- Stock clamp removed: check/uncheck is now a no-op (negative stock = accurate)
- Close-RO warning: unchecked parts dialog with "Complete & Close" option
- TTF font in PDFs: Arial from assets; accented characters render correctly
- Migration v8 guard: from < 8 → from == 7 for RENAME operation

Co-Authored-By: Claude Sonnet 4.6 <noreply@anthropic.com>
</commit_message>
<xml_diff>
--- a/docs/AutoShopPro_Build_Log.docx
+++ b/docs/AutoShopPro_Build_Log.docx
@@ -1710,6 +1710,388 @@
       </w:pPr>
       <w:r>
         <w:t xml:space="preserve">Build Sessions</w:t>
+      </w:r>
+    </w:p>
+    <w:p>
+      <w:r>
+        <w:t xml:space="preserve"/>
+      </w:r>
+    </w:p>
+    <w:p>
+      <w:pPr>
+        <w:pStyle w:val="Heading2"/>
+      </w:pPr>
+      <w:r>
+        <w:t xml:space="preserve">Session 20 — v0.12.1 Full Picture</w:t>
+      </w:r>
+    </w:p>
+    <w:p>
+      <w:r>
+        <w:t xml:space="preserve">Date: March 30, 2026</w:t>
+      </w:r>
+    </w:p>
+    <w:p>
+      <w:r>
+        <w:t xml:space="preserve">Version: v0.12.1 Full Picture</w:t>
+      </w:r>
+    </w:p>
+    <w:p>
+      <w:r>
+        <w:t xml:space="preserve">Session: 20</w:t>
+      </w:r>
+    </w:p>
+    <w:p>
+      <w:pPr>
+        <w:pStyle w:val="ListBullet"/>
+      </w:pPr>
+      <w:r>
+        <w:t xml:space="preserve">Migration v8 guard fixed — changed from &lt; 8 to from == 7 for the supplier_id → vendor_id RENAME; prevents crash on devices upgrading from v1–v5 where the column does not yet exist</w:t>
+      </w:r>
+    </w:p>
+    <w:p>
+      <w:pPr>
+        <w:pStyle w:val="ListBullet"/>
+      </w:pPr>
+      <w:r>
+        <w:t xml:space="preserve">TTF font in PDFs — Arial regular + bold loaded from assets via rootBundle; assigned to pw.ThemeData; all three PDF builders (itemized invoice, simple invoice, estimate) now use Arial; fixes boxes for accented characters (José, García, etc.)</w:t>
+      </w:r>
+    </w:p>
+    <w:p>
+      <w:pPr>
+        <w:pStyle w:val="ListBullet"/>
+      </w:pPr>
+      <w:r>
+        <w:t xml:space="preserve">Close RO unchecked-item warning — _advanceStatus now checks for part line items not marked done before closing; dialog offers "Close Anyway" or "Complete &amp; Close" (which marks them done and deducts stock)</w:t>
+      </w:r>
+    </w:p>
+    <w:p>
+      <w:pPr>
+        <w:pStyle w:val="ListBullet"/>
+      </w:pPr>
+      <w:r>
+        <w:t xml:space="preserve">Stock clamp removed — floor clamp at 0 broke check/uncheck symmetry (check + uncheck would inflate stock phantom units); negative stock accurately means "used more than on-hand"; Out of Stock badge handles qty ≤ 0</w:t>
+      </w:r>
+    </w:p>
+    <w:p>
+      <w:pPr>
+        <w:pStyle w:val="ListBullet"/>
+      </w:pPr>
+      <w:r>
+        <w:t xml:space="preserve">Stock deduction transactions — _toggleDone and _completeAll in ro_detail_screen now wrap all line item + inventory updates in db.transaction()</w:t>
+      </w:r>
+    </w:p>
+    <w:p>
+      <w:pPr>
+        <w:pStyle w:val="ListBullet"/>
+      </w:pPr>
+      <w:r>
+        <w:t xml:space="preserve">Double-tap guard on Convert to RO — _ConvertRow converted to ConsumerStatefulWidget with _converting bool; second tap while in-flight returns early; button label changes to "Converting…"</w:t>
+      </w:r>
+    </w:p>
+    <w:p>
+      <w:pPr>
+        <w:pStyle w:val="ListBullet"/>
+      </w:pPr>
+      <w:r>
+        <w:t xml:space="preserve">Convert-to-RO transaction — updateEstimate + insertRepairOrder are now wrapped in db.transaction() so a crash between them cannot leave the estimate approved without an RO</w:t>
+      </w:r>
+    </w:p>
+    <w:p>
+      <w:pPr>
+        <w:pStyle w:val="ListBullet"/>
+      </w:pPr>
+      <w:r>
+        <w:t xml:space="preserve">GP formula fix on invoice detail — gross profit now only deducts items with a known cost (unitCost &gt; 0); previously used unitPrice as fallback, making labor appear 0% margin and overstating costs</w:t>
+      </w:r>
+    </w:p>
+    <w:p>
+      <w:pPr>
+        <w:pStyle w:val="ListBullet"/>
+      </w:pPr>
+      <w:r>
+        <w:t xml:space="preserve">Integer-cents subtotals — all 4 total-calculation sites (estimate detail, RO detail, invoice detail, invoice_service.dart × 2) now stay in integer cents throughout; tax rounded after multiplication; no more floating-point rounding errors</w:t>
+      </w:r>
+    </w:p>
+    <w:p>
+      <w:pPr>
+        <w:pStyle w:val="ListBullet"/>
+      </w:pPr>
+      <w:r>
+        <w:t xml:space="preserve">N+1 query elimination — dashboard, invoice totals, and customer stats providers now bulk-fetch all line items in a single query and look up by map, instead of calling getLineItemsForEstimate() per RO in a loop</w:t>
+      </w:r>
+    </w:p>
+    <w:p>
+      <w:pPr>
+        <w:pStyle w:val="ListBullet"/>
+      </w:pPr>
+      <w:r>
+        <w:t xml:space="preserve">Estimate locking — estimate line items become read-only (no add/edit/delete) once the linked Repair Order is closed; open ROs still allow editing; locked banner shown with lock icon</w:t>
+      </w:r>
+    </w:p>
+    <w:p>
+      <w:pPr>
+        <w:pStyle w:val="ListBullet"/>
+      </w:pPr>
+      <w:r>
+        <w:t xml:space="preserve">AppleScript injection fix — customer email and PDF file path are now escaped before interpolation into osascript; prevents crafted email addresses from executing arbitrary shell commands</w:t>
+      </w:r>
+    </w:p>
+    <w:p>
+      <w:pPr>
+        <w:pStyle w:val="ListBullet"/>
+      </w:pPr>
+      <w:r>
+        <w:t xml:space="preserve">Phase 1 production audit fixes — 12 critical/high issues resolved before any real shop data enters the app</w:t>
+      </w:r>
+    </w:p>
+    <w:p>
+      <w:r>
+        <w:rPr>
+          <w:b/>
+        </w:rPr>
+        <w:t xml:space="preserve">What was built</w:t>
+      </w:r>
+    </w:p>
+    <w:p>
+      <w:pPr>
+        <w:pStyle w:val="ListBullet"/>
+      </w:pPr>
+      <w:r>
+        <w:t xml:space="preserve">Migration v8 used from &lt; 8 instead of from == 7 — RENAME would crash on fresh installs upgrading multiple versions</w:t>
+      </w:r>
+    </w:p>
+    <w:p>
+      <w:pPr>
+        <w:pStyle w:val="ListBullet"/>
+      </w:pPr>
+      <w:r>
+        <w:t xml:space="preserve">PDF Helvetica font — no support for accented characters; names like José rendered as boxes</w:t>
+      </w:r>
+    </w:p>
+    <w:p>
+      <w:pPr>
+        <w:pStyle w:val="ListBullet"/>
+      </w:pPr>
+      <w:r>
+        <w:t xml:space="preserve">RO close skipped stock deduction for unchecked items — parts installed but not checked off were never deducted</w:t>
+      </w:r>
+    </w:p>
+    <w:p>
+      <w:pPr>
+        <w:pStyle w:val="ListBullet"/>
+      </w:pPr>
+      <w:r>
+        <w:t xml:space="preserve">Stock clamp at 0 broke check/uncheck symmetry — phantom stock units created on uncheck</w:t>
+      </w:r>
+    </w:p>
+    <w:p>
+      <w:pPr>
+        <w:pStyle w:val="ListBullet"/>
+      </w:pPr>
+      <w:r>
+        <w:t xml:space="preserve">Stock deduction not atomic — read-modify-write on inventory could race or partially fail</w:t>
+      </w:r>
+    </w:p>
+    <w:p>
+      <w:pPr>
+        <w:pStyle w:val="ListBullet"/>
+      </w:pPr>
+      <w:r>
+        <w:t xml:space="preserve">Double-tap on Convert to RO created duplicate ROs and crashed on stream</w:t>
+      </w:r>
+    </w:p>
+    <w:p>
+      <w:pPr>
+        <w:pStyle w:val="ListBullet"/>
+      </w:pPr>
+      <w:r>
+        <w:t xml:space="preserve">Convert-to-RO not atomic — crash between updateEstimate and insertRepairOrder left inconsistent state</w:t>
+      </w:r>
+    </w:p>
+    <w:p>
+      <w:pPr>
+        <w:pStyle w:val="ListBullet"/>
+      </w:pPr>
+      <w:r>
+        <w:t xml:space="preserve">GP formula used unitPrice fallback for labor — made labor appear 0% margin and overstated cost</w:t>
+      </w:r>
+    </w:p>
+    <w:p>
+      <w:pPr>
+        <w:pStyle w:val="ListBullet"/>
+      </w:pPr>
+      <w:r>
+        <w:t xml:space="preserve">Floating-point subtotals — quantity × fromCents(unitPrice) accumulated rounding errors across many line items</w:t>
+      </w:r>
+    </w:p>
+    <w:p>
+      <w:pPr>
+        <w:pStyle w:val="ListBullet"/>
+      </w:pPr>
+      <w:r>
+        <w:t xml:space="preserve">N+1 DB queries in dashboard/RO/customer providers — one query per RO, O(n) instead of O(1)</w:t>
+      </w:r>
+    </w:p>
+    <w:p>
+      <w:pPr>
+        <w:pStyle w:val="ListBullet"/>
+      </w:pPr>
+      <w:r>
+        <w:t xml:space="preserve">Estimate editable after RO closed — line items could be changed, silently altering closed invoice figures</w:t>
+      </w:r>
+    </w:p>
+    <w:p>
+      <w:pPr>
+        <w:pStyle w:val="ListBullet"/>
+      </w:pPr>
+      <w:r>
+        <w:t xml:space="preserve">Customer email interpolated raw into AppleScript string — RCE via crafted email address</w:t>
+      </w:r>
+    </w:p>
+    <w:p>
+      <w:r>
+        <w:rPr>
+          <w:b/>
+        </w:rPr>
+        <w:t xml:space="preserve">Bugs fixed</w:t>
+      </w:r>
+    </w:p>
+    <w:p>
+      <w:pPr>
+        <w:pStyle w:val="ListBullet"/>
+      </w:pPr>
+      <w:r>
+        <w:t xml:space="preserve">assets/fonts/Arial Bold.ttf — bundled bold font for PDF generation</w:t>
+      </w:r>
+    </w:p>
+    <w:p>
+      <w:pPr>
+        <w:pStyle w:val="ListBullet"/>
+      </w:pPr>
+      <w:r>
+        <w:t xml:space="preserve">assets/fonts/Arial.ttf — bundled font for PDF generation</w:t>
+      </w:r>
+    </w:p>
+    <w:p>
+      <w:r>
+        <w:rPr>
+          <w:b/>
+        </w:rPr>
+        <w:t xml:space="preserve">Files added</w:t>
+      </w:r>
+    </w:p>
+    <w:p>
+      <w:pPr>
+        <w:pStyle w:val="ListBullet"/>
+      </w:pPr>
+      <w:r>
+        <w:t xml:space="preserve">CLAUDE.md — version bumped to v0.12.1</w:t>
+      </w:r>
+    </w:p>
+    <w:p>
+      <w:pPr>
+        <w:pStyle w:val="ListBullet"/>
+      </w:pPr>
+      <w:r>
+        <w:t xml:space="preserve">README.md — v0.12.1 entry added</w:t>
+      </w:r>
+    </w:p>
+    <w:p>
+      <w:pPr>
+        <w:pStyle w:val="ListBullet"/>
+      </w:pPr>
+      <w:r>
+        <w:t xml:space="preserve">docs/module_plan.md — v0.12.1 audit fixes section added</w:t>
+      </w:r>
+    </w:p>
+    <w:p>
+      <w:pPr>
+        <w:pStyle w:val="ListBullet"/>
+      </w:pPr>
+      <w:r>
+        <w:t xml:space="preserve">pubspec.yaml — assets section added with Arial.ttf and Arial Bold.ttf</w:t>
+      </w:r>
+    </w:p>
+    <w:p>
+      <w:pPr>
+        <w:pStyle w:val="ListBullet"/>
+      </w:pPr>
+      <w:r>
+        <w:t xml:space="preserve">lib/database/database.dart — migration v8 guard changed from &lt; 8 to == 7</w:t>
+      </w:r>
+    </w:p>
+    <w:p>
+      <w:pPr>
+        <w:pStyle w:val="ListBullet"/>
+      </w:pPr>
+      <w:r>
+        <w:t xml:space="preserve">lib/features/customers/customers_provider.dart — bulk line item fetch in customerStatsProvider</w:t>
+      </w:r>
+    </w:p>
+    <w:p>
+      <w:pPr>
+        <w:pStyle w:val="ListBullet"/>
+      </w:pPr>
+      <w:r>
+        <w:t xml:space="preserve">lib/features/repair_orders/repair_orders_provider.dart — bulk line item fetch in invoiceTotalsProvider</w:t>
+      </w:r>
+    </w:p>
+    <w:p>
+      <w:pPr>
+        <w:pStyle w:val="ListBullet"/>
+      </w:pPr>
+      <w:r>
+        <w:t xml:space="preserve">lib/features/dashboard/dashboard_provider.dart — bulk line item fetch with getLineItemsForEstimates(); Map lookup replaces per-RO await</w:t>
+      </w:r>
+    </w:p>
+    <w:p>
+      <w:pPr>
+        <w:pStyle w:val="ListBullet"/>
+      </w:pPr>
+      <w:r>
+        <w:t xml:space="preserve">lib/features/invoices/invoice_detail_screen.dart — integer-cents subtotals; GP formula fixed to only deduct unitCost &gt; 0 items</w:t>
+      </w:r>
+    </w:p>
+    <w:p>
+      <w:pPr>
+        <w:pStyle w:val="ListBullet"/>
+      </w:pPr>
+      <w:r>
+        <w:t xml:space="preserve">lib/features/repair_orders/ro_detail_screen.dart — _advanceStatus takes BuildContext; unchecked-item dialog on close with Complete &amp; Close option; _toggleDone wrapped in db.transaction() with clamp removed; _completeAll wrapped in db.transaction() with clamp removed; integer-cents subtotals</w:t>
+      </w:r>
+    </w:p>
+    <w:p>
+      <w:pPr>
+        <w:pStyle w:val="ListBullet"/>
+      </w:pPr>
+      <w:r>
+        <w:t xml:space="preserve">lib/features/estimates/estimate_detail_screen.dart — locked state (ro.status == closed); ADD ITEMS hidden when locked; per-labor Add Part hidden when locked; _LineItemSection and _LineItemRow accept locked param; Dismissible/edit skipped when locked; _ConvertRow → ConsumerStatefulWidget with _converting guard and db.transaction(); integer-cents subtotals</w:t>
+      </w:r>
+    </w:p>
+    <w:p>
+      <w:pPr>
+        <w:pStyle w:val="ListBullet"/>
+      </w:pPr>
+      <w:r>
+        <w:t xml:space="preserve">lib/features/invoices/invoice_service.dart — _escapeForAppleScript() helper; import flutter/services.dart; _loadPdfTheme() loads Arial TTF; all 3 pw.Document() calls use theme; integer-cents subtotals in invoice and estimate PDF builders</w:t>
+      </w:r>
+    </w:p>
+    <w:p>
+      <w:r>
+        <w:rPr>
+          <w:b/>
+        </w:rPr>
+        <w:t xml:space="preserve">Files modified</w:t>
+      </w:r>
+    </w:p>
+    <w:p>
+      <w:r>
+        <w:t xml:space="preserve">Phase 2 audit fixes (tax rate on RO, shop address on invoice, input validation, PDF to app container) or Payments module.</w:t>
+      </w:r>
+    </w:p>
+    <w:p>
+      <w:r>
+        <w:t xml:space="preserve">Next session</w:t>
       </w:r>
     </w:p>
     <w:p>

</xml_diff>

<commit_message>
v0.12.2 Full Picture — Phase 2 + Phase 3 audit fixes
Phase 2 (11 fixes): VIN char validation, ⌘N/⌘F back-stack fix,
negative prices allowed, markup tier gap prevention, markup display
fix (cents-as-dollars), ARO denominator fix, dashboard revenue labels,
PDF temp file cleanup, shop contact info on invoices (schema v32),
tax rate snapshot on RO (schema v33), invoice list totals include tax.

Phase 3 (8 fixes): reopen RO action, parentLaborId null-out on labor
delete, 200ms search debounce, DB indexes on FK columns (schema v34),
markup recomputed at catalog/template insert, About dialog version
constant, template linked-part default quantities, CSV import
per-row transaction.

Co-Authored-By: Claude Sonnet 4.6 <noreply@anthropic.com>
</commit_message>
<xml_diff>
--- a/docs/AutoShopPro_Build_Log.docx
+++ b/docs/AutoShopPro_Build_Log.docx
@@ -1722,6 +1722,468 @@
         <w:pStyle w:val="Heading2"/>
       </w:pPr>
       <w:r>
+        <w:t xml:space="preserve">Session 21 — v0.12.2 Full Picture</w:t>
+      </w:r>
+    </w:p>
+    <w:p>
+      <w:r>
+        <w:t xml:space="preserve">Date: March 30, 2026</w:t>
+      </w:r>
+    </w:p>
+    <w:p>
+      <w:r>
+        <w:t xml:space="preserve">Version: v0.12.2 Full Picture</w:t>
+      </w:r>
+    </w:p>
+    <w:p>
+      <w:r>
+        <w:t xml:space="preserve">Session: 21</w:t>
+      </w:r>
+    </w:p>
+    <w:p>
+      <w:pPr>
+        <w:pStyle w:val="ListBullet"/>
+      </w:pPr>
+      <w:r>
+        <w:t xml:space="preserve">Markup recomputed at catalog insert — catalog picker now calls _applyMarkupTier() + _recalcFromCostAndPercent() instead of back-computing from stale stored sell price; template part insertions use _computeSellPriceCents() helper</w:t>
+      </w:r>
+    </w:p>
+    <w:p>
+      <w:pPr>
+        <w:pStyle w:val="ListBullet"/>
+      </w:pPr>
+      <w:r>
+        <w:t xml:space="preserve">CSV import transaction — each row's DB writes wrapped in _db.transaction(); failed row rolls back cleanly without leaving orphaned customers or estimates</w:t>
+      </w:r>
+    </w:p>
+    <w:p>
+      <w:pPr>
+        <w:pStyle w:val="ListBullet"/>
+      </w:pPr>
+      <w:r>
+        <w:t xml:space="preserve">Template linked-part quantities — each linked part row in the template form now shows an editable qty field; default qty saved to and loaded from DB; previously always 1.0</w:t>
+      </w:r>
+    </w:p>
+    <w:p>
+      <w:pPr>
+        <w:pStyle w:val="ListBullet"/>
+      </w:pPr>
+      <w:r>
+        <w:t xml:space="preserve">Shop contact info — address/phone/email columns added to ShopSettings (schema v32); printed in header of all invoice and estimate PDFs</w:t>
+      </w:r>
+    </w:p>
+    <w:p>
+      <w:pPr>
+        <w:pStyle w:val="ListBullet"/>
+      </w:pPr>
+      <w:r>
+        <w:t xml:space="preserve">Tax rate snapshot — taxRateBps stored on RepairOrder at convert time; invoice PDF always uses the correct rate regardless of future estimate edits</w:t>
+      </w:r>
+    </w:p>
+    <w:p>
+      <w:pPr>
+        <w:pStyle w:val="ListBullet"/>
+      </w:pPr>
+      <w:r>
+        <w:t xml:space="preserve">DB indexes — schema v34 adds 7 CREATE INDEX statements on FK columns; eliminates full-table scans on all common joins</w:t>
+      </w:r>
+    </w:p>
+    <w:p>
+      <w:pPr>
+        <w:pStyle w:val="ListBullet"/>
+      </w:pPr>
+      <w:r>
+        <w:t xml:space="preserve">Search debounce — 200ms Timer in search_screen.dart; keystroke-by-keystroke DB queries eliminated; 4 queries fire only after typing pauses</w:t>
+      </w:r>
+    </w:p>
+    <w:p>
+      <w:pPr>
+        <w:pStyle w:val="ListBullet"/>
+      </w:pPr>
+      <w:r>
+        <w:t xml:space="preserve">Reopen Repair Order — "Reopen Repair Order" row (↺ icon) added to closed RO ACTIONS section; confirmation dialog warns invoice becomes inactive; sets status back to Open</w:t>
+      </w:r>
+    </w:p>
+    <w:p>
+      <w:pPr>
+        <w:pStyle w:val="ListBullet"/>
+      </w:pPr>
+      <w:r>
+        <w:t xml:space="preserve">Phase 3 audit fixes (8 items) — architecture and UX improvements: reopen RO action, parentLaborId null-out on labor delete, 200ms search debounce, DB indexes on all FK columns (schema v34), markup recomputed from tier rules at catalog/template insert, About dialog version constant, template linked-part default quantities editable, CSV import wrapped in per-row transaction</w:t>
+      </w:r>
+    </w:p>
+    <w:p>
+      <w:pPr>
+        <w:pStyle w:val="ListBullet"/>
+      </w:pPr>
+      <w:r>
+        <w:t xml:space="preserve">Phase 2 audit fixes (11 items) — fixes before first paying customer: VIN char validation, keyboard shortcuts back-stack fix, negative prices allowed (coupons), markup tier gap prevention via UI lock, markup display fix (cents shown as dollars), ARO denominator fix, dashboard revenue labels, PDF temp file cleanup, shop contact info on invoices (schema v32), tax rate snapshot on RO (schema v33), invoice list totals include tax</w:t>
+      </w:r>
+    </w:p>
+    <w:p>
+      <w:r>
+        <w:rPr>
+          <w:b/>
+        </w:rPr>
+        <w:t xml:space="preserve">What was built</w:t>
+      </w:r>
+    </w:p>
+    <w:p>
+      <w:pPr>
+        <w:pStyle w:val="ListBullet"/>
+      </w:pPr>
+      <w:r>
+        <w:t xml:space="preserve">Template linked-part qty always saved as 1.0 — no way to set "5 quarts" for an oil change template</w:t>
+      </w:r>
+    </w:p>
+    <w:p>
+      <w:pPr>
+        <w:pStyle w:val="ListBullet"/>
+      </w:pPr>
+      <w:r>
+        <w:t xml:space="preserve">About dialog showed version 0.10.3 — hardcoded stale string; now uses _appVersion constant</w:t>
+      </w:r>
+    </w:p>
+    <w:p>
+      <w:pPr>
+        <w:pStyle w:val="ListBullet"/>
+      </w:pPr>
+      <w:r>
+        <w:t xml:space="preserve">CSV import had no transaction — partial row failure (e.g. estimate created but RO insert crashed) left orphaned records</w:t>
+      </w:r>
+    </w:p>
+    <w:p>
+      <w:pPr>
+        <w:pStyle w:val="ListBullet"/>
+      </w:pPr>
+      <w:r>
+        <w:t xml:space="preserve">Template parts used stored sell price — same stale-price issue; now uses _computeSellPriceCents()</w:t>
+      </w:r>
+    </w:p>
+    <w:p>
+      <w:pPr>
+        <w:pStyle w:val="ListBullet"/>
+      </w:pPr>
+      <w:r>
+        <w:t xml:space="preserve">Catalog picker used stored sell price — stale after markup tier rule changes; now recomputed fresh</w:t>
+      </w:r>
+    </w:p>
+    <w:p>
+      <w:pPr>
+        <w:pStyle w:val="ListBullet"/>
+      </w:pPr>
+      <w:r>
+        <w:t xml:space="preserve">No DB indexes on any FK column — every list screen triggered full table scans</w:t>
+      </w:r>
+    </w:p>
+    <w:p>
+      <w:pPr>
+        <w:pStyle w:val="ListBullet"/>
+      </w:pPr>
+      <w:r>
+        <w:t xml:space="preserve">Search fired 4 DB queries on every keystroke — O(n×4) queries just for typing</w:t>
+      </w:r>
+    </w:p>
+    <w:p>
+      <w:pPr>
+        <w:pStyle w:val="ListBullet"/>
+      </w:pPr>
+      <w:r>
+        <w:t xml:space="preserve">parentLaborId not nulled on labor delete — child parts became ungrouped orphans in the DB</w:t>
+      </w:r>
+    </w:p>
+    <w:p>
+      <w:pPr>
+        <w:pStyle w:val="ListBullet"/>
+      </w:pPr>
+      <w:r>
+        <w:t xml:space="preserve">PDF temp files never deleted — accumulated in /tmp indefinitely; now cleaned up 30–60s after opening</w:t>
+      </w:r>
+    </w:p>
+    <w:p>
+      <w:pPr>
+        <w:pStyle w:val="ListBullet"/>
+      </w:pPr>
+      <w:r>
+        <w:t xml:space="preserve">Dashboard showed "Revenue" — misleading since tax was excluded; renamed to "Revenue (excl. tax)"</w:t>
+      </w:r>
+    </w:p>
+    <w:p>
+      <w:pPr>
+        <w:pStyle w:val="ListBullet"/>
+      </w:pPr>
+      <w:r>
+        <w:t xml:space="preserve">ARO denominator included ROs with no estimate/revenue — average was artificially low</w:t>
+      </w:r>
+    </w:p>
+    <w:p>
+      <w:pPr>
+        <w:pStyle w:val="ListBullet"/>
+      </w:pPr>
+      <w:r>
+        <w:t xml:space="preserve">Markup tier display showed cents as dollars (e.g. $5000 instead of $50) — fromCents() not applied to minCost/maxCost in display</w:t>
+      </w:r>
+    </w:p>
+    <w:p>
+      <w:pPr>
+        <w:pStyle w:val="ListBullet"/>
+      </w:pPr>
+      <w:r>
+        <w:t xml:space="preserve">Negative prices blocked — coupons and discounts require negative values; only a $999,999.99 cap now enforced</w:t>
+      </w:r>
+    </w:p>
+    <w:p>
+      <w:pPr>
+        <w:pStyle w:val="ListBullet"/>
+      </w:pPr>
+      <w:r>
+        <w:t xml:space="preserve">⌘N and ⌘F used context.go — destroyed navigation back stack; fixed to context.push</w:t>
+      </w:r>
+    </w:p>
+    <w:p>
+      <w:pPr>
+        <w:pStyle w:val="ListBullet"/>
+      </w:pPr>
+      <w:r>
+        <w:t xml:space="preserve">VIN decoder accepted VINs with illegal characters (I, O, Q) — now rejected before API call</w:t>
+      </w:r>
+    </w:p>
+    <w:p>
+      <w:r>
+        <w:rPr>
+          <w:b/>
+        </w:rPr>
+        <w:t xml:space="preserve">Bugs fixed</w:t>
+      </w:r>
+    </w:p>
+    <w:p>
+      <w:pPr>
+        <w:pStyle w:val="ListBullet"/>
+      </w:pPr>
+      <w:r>
+        <w:t xml:space="preserve">CLAUDE.md — version bumped to v0.12.2; What's Built updated</w:t>
+      </w:r>
+    </w:p>
+    <w:p>
+      <w:pPr>
+        <w:pStyle w:val="ListBullet"/>
+      </w:pPr>
+      <w:r>
+        <w:t xml:space="preserve">README.md — v0.12.2 entry added</w:t>
+      </w:r>
+    </w:p>
+    <w:p>
+      <w:pPr>
+        <w:pStyle w:val="ListBullet"/>
+      </w:pPr>
+      <w:r>
+        <w:t xml:space="preserve">docs/module_plan.md — Phase 2 + Phase 3 audit sections added</w:t>
+      </w:r>
+    </w:p>
+    <w:p>
+      <w:pPr>
+        <w:pStyle w:val="ListBullet"/>
+      </w:pPr>
+      <w:r>
+        <w:t xml:space="preserve">lib/database/database.dart — migration v8 guard changed from &lt; 8 to == 7</w:t>
+      </w:r>
+    </w:p>
+    <w:p>
+      <w:pPr>
+        <w:pStyle w:val="ListBullet"/>
+      </w:pPr>
+      <w:r>
+        <w:t xml:space="preserve">lib/features/customers/customers_provider.dart — bulk line item fetch in customerStatsProvider</w:t>
+      </w:r>
+    </w:p>
+    <w:p>
+      <w:pPr>
+        <w:pStyle w:val="ListBullet"/>
+      </w:pPr>
+      <w:r>
+        <w:t xml:space="preserve">lib/features/repair_orders/repair_orders_provider.dart — bulk line item fetch in invoiceTotalsProvider</w:t>
+      </w:r>
+    </w:p>
+    <w:p>
+      <w:pPr>
+        <w:pStyle w:val="ListBullet"/>
+      </w:pPr>
+      <w:r>
+        <w:t xml:space="preserve">lib/features/dashboard/dashboard_provider.dart — bulk line item fetch with getLineItemsForEstimates(); Map lookup replaces per-RO await</w:t>
+      </w:r>
+    </w:p>
+    <w:p>
+      <w:pPr>
+        <w:pStyle w:val="ListBullet"/>
+      </w:pPr>
+      <w:r>
+        <w:t xml:space="preserve">lib/features/invoices/invoice_detail_screen.dart — integer-cents subtotals; GP formula fixed to only deduct unitCost &gt; 0 items</w:t>
+      </w:r>
+    </w:p>
+    <w:p>
+      <w:pPr>
+        <w:pStyle w:val="ListBullet"/>
+      </w:pPr>
+      <w:r>
+        <w:t xml:space="preserve">lib/features/repair_orders/ro_detail_screen.dart — _advanceStatus takes BuildContext; unchecked-item dialog on close with Complete &amp; Close option; _toggleDone wrapped in db.transaction() with clamp removed; _completeAll wrapped in db.transaction() with clamp removed; integer-cents subtotals</w:t>
+      </w:r>
+    </w:p>
+    <w:p>
+      <w:pPr>
+        <w:pStyle w:val="ListBullet"/>
+      </w:pPr>
+      <w:r>
+        <w:t xml:space="preserve">pubspec.yaml — version bumped to 0.12.2+22</w:t>
+      </w:r>
+    </w:p>
+    <w:p>
+      <w:pPr>
+        <w:pStyle w:val="ListBullet"/>
+      </w:pPr>
+      <w:r>
+        <w:t xml:space="preserve">lib/features/data/data_service.dart — per-row DB writes wrapped in _db.transaction(); continue → return inside lambda</w:t>
+      </w:r>
+    </w:p>
+    <w:p>
+      <w:pPr>
+        <w:pStyle w:val="ListBullet"/>
+      </w:pPr>
+      <w:r>
+        <w:t xml:space="preserve">lib/features/vehicles/vin_service.dart — character set validation rejects I/O/Q before API call</w:t>
+      </w:r>
+    </w:p>
+    <w:p>
+      <w:pPr>
+        <w:pStyle w:val="ListBullet"/>
+      </w:pPr>
+      <w:r>
+        <w:t xml:space="preserve">lib/features/dashboard/dashboard_provider.dart — ARO uses countedROsForARO denominator</w:t>
+      </w:r>
+    </w:p>
+    <w:p>
+      <w:pPr>
+        <w:pStyle w:val="ListBullet"/>
+      </w:pPr>
+      <w:r>
+        <w:t xml:space="preserve">lib/features/dashboard/dashboard_screen.dart — "Revenue" → "Revenue (excl. tax)" labels</w:t>
+      </w:r>
+    </w:p>
+    <w:p>
+      <w:pPr>
+        <w:pStyle w:val="ListBullet"/>
+      </w:pPr>
+      <w:r>
+        <w:t xml:space="preserve">lib/features/service_templates/service_template_form_screen.dart — qtyController added to _LinkedPart typedef; qty field shown on each linked part row; qty saved/loaded from DB</w:t>
+      </w:r>
+    </w:p>
+    <w:p>
+      <w:pPr>
+        <w:pStyle w:val="ListBullet"/>
+      </w:pPr>
+      <w:r>
+        <w:t xml:space="preserve">lib/features/settings/settings_screen.dart — shopAddress/Phone/Email controllers; _showAddRuleDialog auto-fills From cost as read-only; markup display uses fromCents()</w:t>
+      </w:r>
+    </w:p>
+    <w:p>
+      <w:pPr>
+        <w:pStyle w:val="ListBullet"/>
+      </w:pPr>
+      <w:r>
+        <w:t xml:space="preserve">lib/features/estimates/line_item_form_screen.dart — _pickFromCatalog uses _applyMarkupTier+_recalcFromCostAndPercent; _computeSellPriceCents() helper; template parts use fresh sell price; negative price allowed; $999,999.99 cap</w:t>
+      </w:r>
+    </w:p>
+    <w:p>
+      <w:pPr>
+        <w:pStyle w:val="ListBullet"/>
+      </w:pPr>
+      <w:r>
+        <w:t xml:space="preserve">lib/features/estimates/estimate_detail_screen.dart — _convert() snapshots taxRateBps at RO creation</w:t>
+      </w:r>
+    </w:p>
+    <w:p>
+      <w:pPr>
+        <w:pStyle w:val="ListBullet"/>
+      </w:pPr>
+      <w:r>
+        <w:t xml:space="preserve">lib/features/invoices/invoice_service.dart — shopAddress/Phone/Email params throughout; PDF headers show contact; _deleteTempAfterDelay() helper cleans up temp files</w:t>
+      </w:r>
+    </w:p>
+    <w:p>
+      <w:pPr>
+        <w:pStyle w:val="ListBullet"/>
+      </w:pPr>
+      <w:r>
+        <w:t xml:space="preserve">lib/features/invoices/invoice_detail_screen.dart — tax rate prefers taxRateBps; showInvoiceActions passes shop contact</w:t>
+      </w:r>
+    </w:p>
+    <w:p>
+      <w:pPr>
+        <w:pStyle w:val="ListBullet"/>
+      </w:pPr>
+      <w:r>
+        <w:t xml:space="preserve">lib/features/repair_orders/repair_orders_provider.dart — invoiceTotalsProvider includes tax; prefers taxRateBps fallback</w:t>
+      </w:r>
+    </w:p>
+    <w:p>
+      <w:pPr>
+        <w:pStyle w:val="ListBullet"/>
+      </w:pPr>
+      <w:r>
+        <w:t xml:space="preserve">lib/features/repair_orders/ro_detail_screen.dart — _reopenRO() method; Reopen Repair Order action row in closed ACTIONS section; tax rate prefers taxRateBps; showInvoiceActions passes shop contact</w:t>
+      </w:r>
+    </w:p>
+    <w:p>
+      <w:pPr>
+        <w:pStyle w:val="ListBullet"/>
+      </w:pPr>
+      <w:r>
+        <w:t xml:space="preserve">lib/features/search/search_screen.dart — dart:async import; Timer? _debounce field; 200ms debounce in _onQueryChanged</w:t>
+      </w:r>
+    </w:p>
+    <w:p>
+      <w:pPr>
+        <w:pStyle w:val="ListBullet"/>
+      </w:pPr>
+      <w:r>
+        <w:t xml:space="preserve">lib/database/database.dart — schema v32 (shopAddress/Phone/Email on ShopSettings); schema v33 (taxRateBps on RepairOrders); schema v34 (7 FK indexes); deleteLineItem now nulls parentLaborId on child parts first</w:t>
+      </w:r>
+    </w:p>
+    <w:p>
+      <w:pPr>
+        <w:pStyle w:val="ListBullet"/>
+      </w:pPr>
+      <w:r>
+        <w:t xml:space="preserve">lib/main.dart — _appVersion constant; copyright 2026; context.push for ⌘N and ⌘F</w:t>
+      </w:r>
+    </w:p>
+    <w:p>
+      <w:r>
+        <w:rPr>
+          <w:b/>
+        </w:rPr>
+        <w:t xml:space="preserve">Files modified</w:t>
+      </w:r>
+    </w:p>
+    <w:p>
+      <w:r>
+        <w:t xml:space="preserve">Phase 3 remaining: #23 move dbProvider to lib/core, #24 store taxAmountCents on invoice, #25 GDPR export/erasure, #26 CSV export audit log, #32 shop_id for multi-shop, #33 route guards stub.</w:t>
+      </w:r>
+    </w:p>
+    <w:p>
+      <w:r>
+        <w:t xml:space="preserve">Next session</w:t>
+      </w:r>
+    </w:p>
+    <w:p>
+      <w:r>
+        <w:t xml:space="preserve"/>
+      </w:r>
+    </w:p>
+    <w:p>
+      <w:pPr>
+        <w:pStyle w:val="Heading2"/>
+      </w:pPr>
+      <w:r>
         <w:t xml:space="preserve">Session 20 — v0.12.1 Full Picture</w:t>
       </w:r>
     </w:p>

</xml_diff>

<commit_message>
v0.13.0 Sharp Eye — search on estimates & ROs, default markup button, visual fixes
- Search bar added to estimates list (filters by number, customer, vehicle)
- Search bar added to repair orders list (works alongside status filter pills)
- "Apply shop default markup" button on Add Part form — resets markup % to shop setting
- Parts sub-header now shows labor name instead of full description
- Overflow fix: parts sub-header Text wrapped in Expanded + ellipsis
- Service template save no longer gets stuck — try/catch + _saving reset on error

Co-Authored-By: Claude Sonnet 4.6 <noreply@anthropic.com>
</commit_message>
<xml_diff>
--- a/docs/AutoShopPro_Build_Log.docx
+++ b/docs/AutoShopPro_Build_Log.docx
@@ -1722,6 +1722,244 @@
         <w:pStyle w:val="Heading2"/>
       </w:pPr>
       <w:r>
+        <w:t xml:space="preserve">Session 22 — v0.13.0 Sharp Eye</w:t>
+      </w:r>
+    </w:p>
+    <w:p>
+      <w:r>
+        <w:t xml:space="preserve">Date: April 4, 2026</w:t>
+      </w:r>
+    </w:p>
+    <w:p>
+      <w:r>
+        <w:t xml:space="preserve">Version: v0.13.0 Sharp Eye</w:t>
+      </w:r>
+    </w:p>
+    <w:p>
+      <w:r>
+        <w:t xml:space="preserve">Session: 22</w:t>
+      </w:r>
+    </w:p>
+    <w:p>
+      <w:pPr>
+        <w:pStyle w:val="ListBullet"/>
+      </w:pPr>
+      <w:r>
+        <w:t xml:space="preserve">Default markup button on Add Part form — "Apply shop default markup" row (counterclockwise arrow icon) added between Markup fields and Unit List; reads defaultPartsMarkup from ShopSettings and recalculates sell price via existing _recalcFromCostAndPercent()</w:t>
+      </w:r>
+    </w:p>
+    <w:p>
+      <w:pPr>
+        <w:pStyle w:val="ListBullet"/>
+      </w:pPr>
+      <w:r>
+        <w:t xml:space="preserve">Search on repair orders list — CupertinoSearchTextField added above filter pills; status filter and search apply simultaneously; empty states updated to reflect search vs filter context</w:t>
+      </w:r>
+    </w:p>
+    <w:p>
+      <w:pPr>
+        <w:pStyle w:val="ListBullet"/>
+      </w:pPr>
+      <w:r>
+        <w:t xml:space="preserve">Search on estimates list — CupertinoSearchTextField added below nav bar; filters by estimate number (EST-XXXX), customer name, and vehicle (year/make/model); EstimateListScreen converted to ConsumerStatefulWidget</w:t>
+      </w:r>
+    </w:p>
+    <w:p>
+      <w:r>
+        <w:rPr>
+          <w:b/>
+        </w:rPr>
+        <w:t xml:space="preserve">What was built</w:t>
+      </w:r>
+    </w:p>
+    <w:p>
+      <w:pPr>
+        <w:pStyle w:val="ListBullet"/>
+      </w:pPr>
+      <w:r>
+        <w:t xml:space="preserve">Service template save got stuck — _save() had no try/catch; any DB error left _saving=true with spinner showing forever; wrapped DB writes in try/catch and reset _saving=false on error; switched Navigator.pop to context.pop() for go_router correctness</w:t>
+      </w:r>
+    </w:p>
+    <w:p>
+      <w:pPr>
+        <w:pStyle w:val="ListBullet"/>
+      </w:pPr>
+      <w:r>
+        <w:t xml:space="preserve">Parts sub-header overflowed (overflowed by ~109 pixels) — Text widget in Row had no width constraint; wrapped in Expanded with overflow: TextOverflow.ellipsis</w:t>
+      </w:r>
+    </w:p>
+    <w:p>
+      <w:pPr>
+        <w:pStyle w:val="ListBullet"/>
+      </w:pPr>
+      <w:r>
+        <w:t xml:space="preserve">Parts sub-header showed labor description instead of labor name — _LineItemSection used labor.description for group label; changed to labor.laborName ?? labor.description so "Brake job - Rear" shows instead of the full description sentence</w:t>
+      </w:r>
+    </w:p>
+    <w:p>
+      <w:r>
+        <w:rPr>
+          <w:b/>
+        </w:rPr>
+        <w:t xml:space="preserve">Bugs fixed</w:t>
+      </w:r>
+    </w:p>
+    <w:p>
+      <w:pPr>
+        <w:pStyle w:val="ListBullet"/>
+      </w:pPr>
+      <w:r>
+        <w:t xml:space="preserve">CLAUDE.md — version bumped to v0.13.0 Sharp Eye; estimates and ROs listed as searchable; parts display updated</w:t>
+      </w:r>
+    </w:p>
+    <w:p>
+      <w:pPr>
+        <w:pStyle w:val="ListBullet"/>
+      </w:pPr>
+      <w:r>
+        <w:t xml:space="preserve">README.md — v0.13.0 entry added at top of Project Status</w:t>
+      </w:r>
+    </w:p>
+    <w:p>
+      <w:pPr>
+        <w:pStyle w:val="ListBullet"/>
+      </w:pPr>
+      <w:r>
+        <w:t xml:space="preserve">docs/module_plan.md — v0.13.0 Sharp Eye section added</w:t>
+      </w:r>
+    </w:p>
+    <w:p>
+      <w:pPr>
+        <w:pStyle w:val="ListBullet"/>
+      </w:pPr>
+      <w:r>
+        <w:t xml:space="preserve">lib/features/dashboard/dashboard_provider.dart — ARO uses countedROsForARO denominator</w:t>
+      </w:r>
+    </w:p>
+    <w:p>
+      <w:pPr>
+        <w:pStyle w:val="ListBullet"/>
+      </w:pPr>
+      <w:r>
+        <w:t xml:space="preserve">lib/features/dashboard/dashboard_screen.dart — "Revenue" → "Revenue (excl. tax)" labels</w:t>
+      </w:r>
+    </w:p>
+    <w:p>
+      <w:pPr>
+        <w:pStyle w:val="ListBullet"/>
+      </w:pPr>
+      <w:r>
+        <w:t xml:space="preserve">lib/features/service_templates/service_template_form_screen.dart — qtyController added to _LinkedPart typedef; qty field shown on each linked part row; qty saved/loaded from DB</w:t>
+      </w:r>
+    </w:p>
+    <w:p>
+      <w:pPr>
+        <w:pStyle w:val="ListBullet"/>
+      </w:pPr>
+      <w:r>
+        <w:t xml:space="preserve">lib/features/settings/settings_screen.dart — shopAddress/Phone/Email controllers; _showAddRuleDialog auto-fills From cost as read-only; markup display uses fromCents()</w:t>
+      </w:r>
+    </w:p>
+    <w:p>
+      <w:pPr>
+        <w:pStyle w:val="ListBullet"/>
+      </w:pPr>
+      <w:r>
+        <w:t xml:space="preserve">lib/features/estimates/line_item_form_screen.dart — _pickFromCatalog uses _applyMarkupTier+_recalcFromCostAndPercent; _computeSellPriceCents() helper; template parts use fresh sell price; negative price allowed; $999,999.99 cap</w:t>
+      </w:r>
+    </w:p>
+    <w:p>
+      <w:pPr>
+        <w:pStyle w:val="ListBullet"/>
+      </w:pPr>
+      <w:r>
+        <w:t xml:space="preserve">lib/features/estimates/estimate_detail_screen.dart — _convert() snapshots taxRateBps at RO creation</w:t>
+      </w:r>
+    </w:p>
+    <w:p>
+      <w:pPr>
+        <w:pStyle w:val="ListBullet"/>
+      </w:pPr>
+      <w:r>
+        <w:t xml:space="preserve">lib/features/invoices/invoice_service.dart — shopAddress/Phone/Email params throughout; PDF headers show contact; _deleteTempAfterDelay() helper cleans up temp files</w:t>
+      </w:r>
+    </w:p>
+    <w:p>
+      <w:pPr>
+        <w:pStyle w:val="ListBullet"/>
+      </w:pPr>
+      <w:r>
+        <w:t xml:space="preserve">lib/features/invoices/invoice_detail_screen.dart — tax rate prefers taxRateBps; showInvoiceActions passes shop contact</w:t>
+      </w:r>
+    </w:p>
+    <w:p>
+      <w:pPr>
+        <w:pStyle w:val="ListBullet"/>
+      </w:pPr>
+      <w:r>
+        <w:t xml:space="preserve">lib/features/service_templates/service_template_form_screen.dart — _save() wrapped in try/catch; _saving reset to false on error; error dialog shown; Navigator.pop replaced with context.pop()</w:t>
+      </w:r>
+    </w:p>
+    <w:p>
+      <w:pPr>
+        <w:pStyle w:val="ListBullet"/>
+      </w:pPr>
+      <w:r>
+        <w:t xml:space="preserve">lib/features/estimates/estimate_detail_screen.dart — _LineItemSection group label changed from labor.description to labor.laborName ?? labor.description; sub-header Text wrapped in Expanded with ellipsis overflow</w:t>
+      </w:r>
+    </w:p>
+    <w:p>
+      <w:pPr>
+        <w:pStyle w:val="ListBullet"/>
+      </w:pPr>
+      <w:r>
+        <w:t xml:space="preserve">lib/features/estimates/line_item_form_screen.dart — added _applyDefaultMarkup() async method; added "Apply shop default markup" GestureDetector row between _MarkupRow and Unit List field</w:t>
+      </w:r>
+    </w:p>
+    <w:p>
+      <w:pPr>
+        <w:pStyle w:val="ListBullet"/>
+      </w:pPr>
+      <w:r>
+        <w:t xml:space="preserve">lib/features/repair_orders/ro_list_screen.dart — added _search state; CupertinoSearchTextField above filter pills; combined status+search filtering; empty state text accounts for active search</w:t>
+      </w:r>
+    </w:p>
+    <w:p>
+      <w:pPr>
+        <w:pStyle w:val="ListBullet"/>
+      </w:pPr>
+      <w:r>
+        <w:t xml:space="preserve">lib/features/estimates/estimate_list_screen.dart — converted ConsumerWidget to ConsumerStatefulWidget; added _search state; added CupertinoSearchTextField; filter logic by number/customer/vehicle; empty state handles both no-data and no-results cases</w:t>
+      </w:r>
+    </w:p>
+    <w:p>
+      <w:r>
+        <w:rPr>
+          <w:b/>
+        </w:rPr>
+        <w:t xml:space="preserve">Files modified</w:t>
+      </w:r>
+    </w:p>
+    <w:p>
+      <w:r>
+        <w:t xml:space="preserve">Continue polish: payment flows, more dashboard KPIs, or Phase 3 remaining items (#23 dbProvider to core, #24 taxAmountCents on invoice, #25 GDPR export).</w:t>
+      </w:r>
+    </w:p>
+    <w:p>
+      <w:r>
+        <w:t xml:space="preserve">Next session</w:t>
+      </w:r>
+    </w:p>
+    <w:p>
+      <w:r>
+        <w:t xml:space="preserve"/>
+      </w:r>
+    </w:p>
+    <w:p>
+      <w:pPr>
+        <w:pStyle w:val="Heading2"/>
+      </w:pPr>
+      <w:r>
         <w:t xml:space="preserve">Session 21 — v0.12.2 Full Picture</w:t>
       </w:r>
     </w:p>

</xml_diff>